<commit_message>
Scope & Methodology done
</commit_message>
<xml_diff>
--- a/CA 1 – Capstone Project Proposal.docx
+++ b/CA 1 – Capstone Project Proposal.docx
@@ -2027,8 +2027,6 @@
             <w:fldChar w:fldCharType="end"/>
           </w:r>
         </w:p>
-        <w:bookmarkStart w:id="0" w:name="_GoBack" w:displacedByCustomXml="next"/>
-        <w:bookmarkEnd w:id="0" w:displacedByCustomXml="next"/>
       </w:sdtContent>
     </w:sdt>
     <w:p/>
@@ -2047,27 +2045,27 @@
         <w:pStyle w:val="Heading1"/>
         <w:spacing w:after="0"/>
       </w:pPr>
-      <w:bookmarkStart w:id="1" w:name="_Toc241588297"/>
+      <w:bookmarkStart w:id="0" w:name="_Toc241588297"/>
       <w:r>
         <w:lastRenderedPageBreak/>
         <w:t>1. Project Title</w:t>
       </w:r>
+      <w:bookmarkEnd w:id="0"/>
+    </w:p>
+    <w:p>
+      <w:r>
+        <w:t>To be defined.</w:t>
+      </w:r>
+    </w:p>
+    <w:p>
+      <w:pPr>
+        <w:pStyle w:val="Heading1"/>
+      </w:pPr>
+      <w:bookmarkStart w:id="1" w:name="_Toc241588298"/>
+      <w:r>
+        <w:t>2. Introduction</w:t>
+      </w:r>
       <w:bookmarkEnd w:id="1"/>
-    </w:p>
-    <w:p>
-      <w:r>
-        <w:t>To be defined.</w:t>
-      </w:r>
-    </w:p>
-    <w:p>
-      <w:pPr>
-        <w:pStyle w:val="Heading1"/>
-      </w:pPr>
-      <w:bookmarkStart w:id="2" w:name="_Toc241588298"/>
-      <w:r>
-        <w:t>2. Introduction</w:t>
-      </w:r>
-      <w:bookmarkEnd w:id="2"/>
     </w:p>
     <w:p>
       <w:pPr>
@@ -2819,12 +2817,12 @@
       <w:pPr>
         <w:pStyle w:val="Heading1"/>
       </w:pPr>
-      <w:bookmarkStart w:id="3" w:name="_Toc241588299"/>
+      <w:bookmarkStart w:id="2" w:name="_Toc241588299"/>
       <w:r>
         <w:lastRenderedPageBreak/>
         <w:t>3. Problem Definition</w:t>
       </w:r>
-      <w:bookmarkEnd w:id="3"/>
+      <w:bookmarkEnd w:id="2"/>
     </w:p>
     <w:p>
       <w:pPr>
@@ -2955,11 +2953,11 @@
       <w:pPr>
         <w:pStyle w:val="Heading1"/>
       </w:pPr>
-      <w:bookmarkStart w:id="4" w:name="_Toc241588300"/>
+      <w:bookmarkStart w:id="3" w:name="_Toc241588300"/>
       <w:r>
         <w:t>4. Aim and Objectives</w:t>
       </w:r>
-      <w:bookmarkEnd w:id="4"/>
+      <w:bookmarkEnd w:id="3"/>
     </w:p>
     <w:p>
       <w:pPr>
@@ -2977,6 +2975,7 @@
     </w:p>
     <w:p>
       <w:pPr>
+        <w:ind w:firstLine="720"/>
         <w:rPr>
           <w:lang w:eastAsia="en-GB"/>
         </w:rPr>
@@ -3011,6 +3010,7 @@
     </w:p>
     <w:p>
       <w:pPr>
+        <w:ind w:firstLine="720"/>
         <w:rPr>
           <w:lang w:eastAsia="en-GB"/>
         </w:rPr>
@@ -3024,6 +3024,7 @@
     </w:p>
     <w:p>
       <w:pPr>
+        <w:ind w:firstLine="720"/>
         <w:rPr>
           <w:lang w:eastAsia="en-GB"/>
         </w:rPr>
@@ -3037,6 +3038,7 @@
     </w:p>
     <w:p>
       <w:pPr>
+        <w:ind w:firstLine="720"/>
         <w:rPr>
           <w:lang w:eastAsia="en-GB"/>
         </w:rPr>
@@ -3050,6 +3052,7 @@
     </w:p>
     <w:p>
       <w:pPr>
+        <w:ind w:firstLine="720"/>
         <w:rPr>
           <w:lang w:eastAsia="en-GB"/>
         </w:rPr>
@@ -3066,108 +3069,267 @@
       <w:pPr>
         <w:pStyle w:val="Heading1"/>
       </w:pPr>
-      <w:bookmarkStart w:id="5" w:name="_Toc241588301"/>
+      <w:bookmarkStart w:id="4" w:name="_Toc241588301"/>
       <w:r>
         <w:t>5. Scope</w:t>
       </w:r>
+      <w:bookmarkEnd w:id="4"/>
+    </w:p>
+    <w:p>
+      <w:pPr>
+        <w:ind w:firstLine="720"/>
+        <w:rPr>
+          <w:lang w:eastAsia="en-GB"/>
+        </w:rPr>
+      </w:pPr>
+      <w:bookmarkStart w:id="5" w:name="_Toc241588302"/>
+      <w:r>
+        <w:rPr>
+          <w:lang w:eastAsia="en-GB"/>
+        </w:rPr>
+        <w:t>The project will analyse the public procurement dataset published by the Office of Government Procurement, using tender publication records with a known number of bids received. It will include data preparation and exploratory data analysis, and the development and comparison of machine learning classification models to predict the likely level of competition. The models will be evaluated and the usefulness of the predictions for supplier tender screening will be discussed.</w:t>
+      </w:r>
+    </w:p>
+    <w:p>
+      <w:pPr>
+        <w:ind w:firstLine="720"/>
+        <w:rPr>
+          <w:b/>
+          <w:lang w:eastAsia="en-GB"/>
+        </w:rPr>
+      </w:pPr>
+      <w:r>
+        <w:rPr>
+          <w:lang w:eastAsia="en-GB"/>
+        </w:rPr>
+        <w:t>The project will not develop a fully operational commercial application, predict whether a supplier will win a tender, or measure the actual impact of the predictions on suppliers’ bidding decisions or success rates.</w:t>
+      </w:r>
+    </w:p>
+    <w:p>
+      <w:pPr>
+        <w:pStyle w:val="Heading1"/>
+      </w:pPr>
+      <w:r>
+        <w:t>6. Methodology</w:t>
+      </w:r>
       <w:bookmarkEnd w:id="5"/>
     </w:p>
     <w:p>
       <w:pPr>
-        <w:rPr>
-          <w:color w:val="FF0000"/>
-          <w:lang w:eastAsia="en-GB"/>
-        </w:rPr>
-      </w:pPr>
-      <w:r>
-        <w:rPr>
-          <w:color w:val="FF0000"/>
-          <w:lang w:eastAsia="en-GB"/>
-        </w:rPr>
-        <w:t xml:space="preserve">Clearly define what will be </w:t>
-      </w:r>
-      <w:r>
-        <w:rPr>
-          <w:b/>
-          <w:bCs/>
-          <w:color w:val="FF0000"/>
-          <w:lang w:eastAsia="en-GB"/>
-        </w:rPr>
-        <w:t>included and excluded</w:t>
-      </w:r>
-      <w:r>
-        <w:rPr>
-          <w:color w:val="FF0000"/>
-          <w:lang w:eastAsia="en-GB"/>
-        </w:rPr>
-        <w:t xml:space="preserve"> from the project. The proposed work should have sufficient scope for investigation and development across two semesters.</w:t>
-      </w:r>
+        <w:pStyle w:val="Heading2"/>
+      </w:pPr>
+      <w:bookmarkStart w:id="6" w:name="_Toc241588303"/>
+      <w:r>
+        <w:t>6.1 Data Collection and Preparation</w:t>
+      </w:r>
+    </w:p>
+    <w:p>
+      <w:pPr>
+        <w:ind w:firstLine="720"/>
+      </w:pPr>
+      <w:r>
+        <w:t>The project will use historical Irish public procurement data published by the Office of Government Procurement</w:t>
+      </w:r>
+      <w:r>
+        <w:t xml:space="preserve">. </w:t>
+      </w:r>
+      <w:r>
+        <w:t>Python</w:t>
+      </w:r>
+      <w:r>
+        <w:t xml:space="preserve"> and</w:t>
+      </w:r>
+      <w:r>
+        <w:t xml:space="preserve"> the Pandas library</w:t>
+      </w:r>
+      <w:r>
+        <w:t xml:space="preserve"> </w:t>
+      </w:r>
+      <w:r>
+        <w:t xml:space="preserve">will be used to load, clean and prepare the dataset, including handling missing values and outliers, checking for inconsistencies, and selecting appropriate </w:t>
+      </w:r>
+      <w:r>
+        <w:t>features</w:t>
+      </w:r>
+      <w:r>
+        <w:t>. Exploratory data analysis will be conducted using descriptive statistics and visualisations created with Pandas, Matplotlib and Seaborn to understand the distribution of bid counts</w:t>
+      </w:r>
+      <w:r>
+        <w:t xml:space="preserve"> and </w:t>
+      </w:r>
+      <w:r>
+        <w:t>the characteristics of the tenders</w:t>
+      </w:r>
+      <w:r>
+        <w:t xml:space="preserve">. </w:t>
+      </w:r>
+      <w:r>
+        <w:t>The target variable will be defined by categorising the number of bids received into two classes representing low and high competition</w:t>
+      </w:r>
+      <w:r>
+        <w:t xml:space="preserve">. </w:t>
+      </w:r>
+      <w:r>
+        <w:t>The distribution of these classes will be examined to assess whether class imbalance is present.</w:t>
+      </w:r>
+    </w:p>
+    <w:p/>
+    <w:p>
+      <w:pPr>
+        <w:pStyle w:val="Heading2"/>
+      </w:pPr>
+      <w:r>
+        <w:t>6.2 Predictive Modelling</w:t>
+      </w:r>
+    </w:p>
+    <w:p>
+      <w:pPr>
+        <w:ind w:firstLine="720"/>
+      </w:pPr>
+      <w:r>
+        <w:t>Python will be used to develop two classification models</w:t>
+      </w:r>
+      <w:r>
+        <w:t>. The proposed algorithms are</w:t>
+      </w:r>
+      <w:r>
+        <w:t xml:space="preserve"> Logistic Regression</w:t>
+      </w:r>
+      <w:r>
+        <w:t xml:space="preserve"> </w:t>
+      </w:r>
+      <w:r>
+        <w:t>and Decision Tree. These models were selected to compare different approaches to predicting whether a tender is likely to attract low or high competition</w:t>
+      </w:r>
+      <w:r>
+        <w:t xml:space="preserve">. </w:t>
+      </w:r>
+      <w:r>
+        <w:t xml:space="preserve">Another classification model such as </w:t>
+      </w:r>
+      <w:r>
+        <w:t>Random</w:t>
+      </w:r>
+      <w:r>
+        <w:t xml:space="preserve"> Forest may also be included if time allows to compare its results with the other models</w:t>
+      </w:r>
+      <w:r>
+        <w:t>. The dataset will be divided into training and testing sets</w:t>
+      </w:r>
+      <w:r>
+        <w:t xml:space="preserve"> </w:t>
+      </w:r>
+      <w:r>
+        <w:t>models</w:t>
+      </w:r>
+      <w:r>
+        <w:t xml:space="preserve"> so that they</w:t>
+      </w:r>
+      <w:r>
+        <w:t xml:space="preserve"> can be trained and then tested on data they have not seen before</w:t>
+      </w:r>
+      <w:r>
+        <w:t xml:space="preserve">. </w:t>
+      </w:r>
+      <w:r>
+        <w:t>Cross-validation will be used to help assess model performance and compare the models.</w:t>
+      </w:r>
+    </w:p>
+    <w:p>
+      <w:pPr>
+        <w:ind w:firstLine="720"/>
+      </w:pPr>
+    </w:p>
+    <w:p>
+      <w:pPr>
+        <w:pStyle w:val="Heading2"/>
+      </w:pPr>
+      <w:r>
+        <w:t>6.3 Model Evaluation</w:t>
+      </w:r>
+    </w:p>
+    <w:p>
+      <w:pPr>
+        <w:ind w:firstLine="720"/>
+      </w:pPr>
+      <w:r>
+        <w:t xml:space="preserve">The </w:t>
+      </w:r>
+      <w:r>
+        <w:t>models will be</w:t>
+      </w:r>
+      <w:r>
+        <w:t xml:space="preserve"> compared using</w:t>
+      </w:r>
+      <w:r>
+        <w:t xml:space="preserve"> accuracy, precision, recall</w:t>
+      </w:r>
+      <w:r>
+        <w:t>,</w:t>
+      </w:r>
+      <w:r>
+        <w:t xml:space="preserve"> and F1-score</w:t>
+      </w:r>
+      <w:r>
+        <w:t xml:space="preserve"> to get a better understanding of their performance rather than relying on accuracy alone</w:t>
+      </w:r>
+      <w:r>
+        <w:t>.</w:t>
+      </w:r>
+      <w:r>
+        <w:t xml:space="preserve"> Confusion matrix will also be used to analyse the predictions made by each model. </w:t>
+      </w:r>
+      <w:r>
+        <w:t>The strengths and limitations of the models</w:t>
+      </w:r>
+      <w:r>
+        <w:t xml:space="preserve"> will be discussed</w:t>
+      </w:r>
+      <w:r>
+        <w:t xml:space="preserve"> along with their potential usefulness for supplier </w:t>
+      </w:r>
+      <w:r>
+        <w:lastRenderedPageBreak/>
+        <w:t xml:space="preserve">tender screening. </w:t>
+      </w:r>
+      <w:r>
+        <w:t>The evaluation will help determine which model performs better and whether its predictions could provide useful information to suppliers</w:t>
+      </w:r>
+      <w:r>
+        <w:t xml:space="preserve"> when deciding whether to pursue a new tender publication.</w:t>
+      </w:r>
+    </w:p>
+    <w:p>
+      <w:pPr>
+        <w:ind w:firstLine="720"/>
+      </w:pPr>
+    </w:p>
+    <w:p>
+      <w:pPr>
+        <w:pStyle w:val="Heading2"/>
+      </w:pPr>
+      <w:r>
+        <w:t>6.4 Architecture Diagram</w:t>
+      </w:r>
+    </w:p>
+    <w:p>
+      <w:pPr>
+        <w:ind w:firstLine="720"/>
+      </w:pPr>
     </w:p>
     <w:p>
       <w:pPr>
         <w:pStyle w:val="Heading1"/>
       </w:pPr>
-      <w:bookmarkStart w:id="6" w:name="_Toc241588302"/>
-      <w:r>
-        <w:t>6. Methodology</w:t>
+      <w:r>
+        <w:t>7. Data Sou</w:t>
+      </w:r>
+      <w:bookmarkStart w:id="7" w:name="_GoBack"/>
+      <w:bookmarkEnd w:id="7"/>
+      <w:r>
+        <w:t>rces</w:t>
       </w:r>
       <w:bookmarkEnd w:id="6"/>
-    </w:p>
-    <w:p>
-      <w:pPr>
-        <w:rPr>
-          <w:color w:val="FF0000"/>
-          <w:lang w:eastAsia="en-GB"/>
-        </w:rPr>
-      </w:pPr>
-      <w:r>
-        <w:rPr>
-          <w:color w:val="FF0000"/>
-          <w:lang w:eastAsia="en-GB"/>
-        </w:rPr>
-        <w:t>Describe how you plan to carry out the project. Explain the proposed data analytics methods, predictive modelling techniques, technologies and tools, and briefly justify your choices.</w:t>
-      </w:r>
-    </w:p>
-    <w:p>
-      <w:pPr>
-        <w:rPr>
-          <w:color w:val="FF0000"/>
-          <w:lang w:eastAsia="en-GB"/>
-        </w:rPr>
-      </w:pPr>
-      <w:r>
-        <w:rPr>
-          <w:color w:val="FF0000"/>
-          <w:lang w:eastAsia="en-GB"/>
-        </w:rPr>
-        <w:t xml:space="preserve">Include a </w:t>
-      </w:r>
-      <w:r>
-        <w:rPr>
-          <w:b/>
-          <w:bCs/>
-          <w:color w:val="FF0000"/>
-          <w:lang w:eastAsia="en-GB"/>
-        </w:rPr>
-        <w:t>high-level architectural diagram</w:t>
-      </w:r>
-      <w:r>
-        <w:rPr>
-          <w:color w:val="FF0000"/>
-          <w:lang w:eastAsia="en-GB"/>
-        </w:rPr>
-        <w:t xml:space="preserve"> showing the proposed workflow or system architecture and how the main components are connected. Briefly explain the main components and overall workflow.</w:t>
-      </w:r>
-    </w:p>
-    <w:p>
-      <w:pPr>
-        <w:pStyle w:val="Heading1"/>
-      </w:pPr>
-      <w:bookmarkStart w:id="7" w:name="_Toc241588303"/>
-      <w:r>
-        <w:t>7. Data Sources</w:t>
-      </w:r>
-      <w:bookmarkEnd w:id="7"/>
     </w:p>
     <w:p>
       <w:pPr>
@@ -4983,7 +5145,7 @@
     <w:link w:val="Heading1Char"/>
     <w:uiPriority w:val="9"/>
     <w:qFormat/>
-    <w:rsid w:val="00E60722"/>
+    <w:rsid w:val="0077546F"/>
     <w:pPr>
       <w:keepNext/>
       <w:keepLines/>
@@ -4992,8 +5154,9 @@
     </w:pPr>
     <w:rPr>
       <w:rFonts w:ascii="Calibri" w:hAnsi="Calibri"/>
+      <w:b/>
       <w:color w:val="3A3A3A" w:themeColor="background2" w:themeShade="40"/>
-      <w:sz w:val="40"/>
+      <w:sz w:val="28"/>
       <w:szCs w:val="40"/>
     </w:rPr>
   </w:style>
@@ -5005,17 +5168,18 @@
     <w:uiPriority w:val="9"/>
     <w:unhideWhenUsed/>
     <w:qFormat/>
-    <w:rsid w:val="00F24CFE"/>
+    <w:rsid w:val="00955ADC"/>
     <w:pPr>
       <w:keepNext/>
       <w:keepLines/>
-      <w:spacing w:before="160"/>
+      <w:spacing w:before="120"/>
       <w:outlineLvl w:val="1"/>
     </w:pPr>
     <w:rPr>
       <w:rFonts w:ascii="Calibri" w:hAnsi="Calibri"/>
+      <w:b/>
       <w:color w:val="3A3A3A" w:themeColor="background2" w:themeShade="40"/>
-      <w:sz w:val="28"/>
+      <w:sz w:val="24"/>
       <w:szCs w:val="32"/>
     </w:rPr>
   </w:style>
@@ -5223,13 +5387,14 @@
     <w:basedOn w:val="DefaultParagraphFont"/>
     <w:link w:val="Heading1"/>
     <w:uiPriority w:val="9"/>
-    <w:rsid w:val="00E61EDD"/>
+    <w:rsid w:val="0077546F"/>
     <w:rPr>
-      <w:rFonts w:ascii="Calibri" w:eastAsiaTheme="majorEastAsia" w:hAnsi="Calibri" w:cstheme="majorBidi"/>
+      <w:rFonts w:eastAsiaTheme="majorEastAsia" w:cstheme="majorBidi"/>
+      <w:b/>
       <w:color w:val="3A3A3A" w:themeColor="background2" w:themeShade="40"/>
       <w:spacing w:val="-10"/>
       <w:kern w:val="28"/>
-      <w:sz w:val="40"/>
+      <w:sz w:val="28"/>
       <w:szCs w:val="40"/>
     </w:rPr>
   </w:style>
@@ -5238,13 +5403,14 @@
     <w:basedOn w:val="DefaultParagraphFont"/>
     <w:link w:val="Heading2"/>
     <w:uiPriority w:val="9"/>
-    <w:rsid w:val="00F24CFE"/>
+    <w:rsid w:val="00955ADC"/>
     <w:rPr>
       <w:rFonts w:eastAsiaTheme="majorEastAsia" w:cstheme="majorBidi"/>
+      <w:b/>
       <w:color w:val="3A3A3A" w:themeColor="background2" w:themeShade="40"/>
       <w:spacing w:val="-10"/>
       <w:kern w:val="28"/>
-      <w:sz w:val="28"/>
+      <w:sz w:val="24"/>
       <w:szCs w:val="32"/>
     </w:rPr>
   </w:style>
@@ -6005,23 +6171,6 @@
 </file>
 
 <file path=customXml/item1.xml><?xml version="1.0" encoding="utf-8"?>
-<p:properties xmlns:p="http://schemas.microsoft.com/office/2006/metadata/properties" xmlns:xsi="http://www.w3.org/2001/XMLSchema-instance" xmlns:pc="http://schemas.microsoft.com/office/infopath/2007/PartnerControls">
-  <documentManagement>
-    <_activity xmlns="b16a9495-4dfd-42d3-807b-98cb11f03b43" xsi:nil="true"/>
-  </documentManagement>
-</p:properties>
-</file>
-
-<file path=customXml/item2.xml><?xml version="1.0" encoding="utf-8"?>
-<?mso-contentType ?>
-<FormTemplates xmlns="http://schemas.microsoft.com/sharepoint/v3/contenttype/forms">
-  <Display>DocumentLibraryForm</Display>
-  <Edit>DocumentLibraryForm</Edit>
-  <New>DocumentLibraryForm</New>
-</FormTemplates>
-</file>
-
-<file path=customXml/item3.xml><?xml version="1.0" encoding="utf-8"?>
 <ct:contentTypeSchema xmlns:ct="http://schemas.microsoft.com/office/2006/metadata/contentType" xmlns:ma="http://schemas.microsoft.com/office/2006/metadata/properties/metaAttributes" ct:_="" ma:_="" ma:contentTypeName="Document" ma:contentTypeID="0x01010091CA7052A48FB44E8BAE44044031FC77" ma:contentTypeVersion="5" ma:contentTypeDescription="Create a new document." ma:contentTypeScope="" ma:versionID="72110da391d7bf7bbbd9879cda66318c">
   <xsd:schema xmlns:xsd="http://www.w3.org/2001/XMLSchema" xmlns:xs="http://www.w3.org/2001/XMLSchema" xmlns:p="http://schemas.microsoft.com/office/2006/metadata/properties" xmlns:ns3="b16a9495-4dfd-42d3-807b-98cb11f03b43" targetNamespace="http://schemas.microsoft.com/office/2006/metadata/properties" ma:root="true" ma:fieldsID="65d4c4ab10123b5e2192ffab3149626d" ns3:_="">
     <xsd:import namespace="b16a9495-4dfd-42d3-807b-98cb11f03b43"/>
@@ -6171,6 +6320,23 @@
 </ct:contentTypeSchema>
 </file>
 
+<file path=customXml/item2.xml><?xml version="1.0" encoding="utf-8"?>
+<?mso-contentType ?>
+<FormTemplates xmlns="http://schemas.microsoft.com/sharepoint/v3/contenttype/forms">
+  <Display>DocumentLibraryForm</Display>
+  <Edit>DocumentLibraryForm</Edit>
+  <New>DocumentLibraryForm</New>
+</FormTemplates>
+</file>
+
+<file path=customXml/item3.xml><?xml version="1.0" encoding="utf-8"?>
+<p:properties xmlns:p="http://schemas.microsoft.com/office/2006/metadata/properties" xmlns:xsi="http://www.w3.org/2001/XMLSchema-instance" xmlns:pc="http://schemas.microsoft.com/office/infopath/2007/PartnerControls">
+  <documentManagement>
+    <_activity xmlns="b16a9495-4dfd-42d3-807b-98cb11f03b43" xsi:nil="true"/>
+  </documentManagement>
+</p:properties>
+</file>
+
 <file path=customXml/item4.xml><?xml version="1.0" encoding="utf-8"?>
 <go:gDocsCustomXmlDataStorage xmlns:go="http://customooxmlschemas.google.com/" xmlns:r="http://schemas.openxmlformats.org/officeDocument/2006/relationships" uri="GoogleDocsCustomDataVersion2">
   <go:docsCustomData xmlns:go="http://customooxmlschemas.google.com/" roundtripDataSignature="AMtx7miehlgh2pzFvkmpnhkVaeODs3Wnuw==">CgMxLjAyCGguZ2pkZ3hzMgloLjMwajB6bGwyCWguMWZvYjl0ZTIJaC4zem55c2g3MgloLjJldDkycDAyDmgua2ZranMzcndsMmMxOAByITF6bEVRVXYyWkdtTjZWemdfYk5uaGpmb0x1c2hhYUo3dw==</go:docsCustomData>
@@ -6182,24 +6348,6 @@
 </file>
 
 <file path=customXml/itemProps1.xml><?xml version="1.0" encoding="utf-8"?>
-<ds:datastoreItem xmlns:ds="http://schemas.openxmlformats.org/officeDocument/2006/customXml" ds:itemID="{D51EB97A-8C7A-4EE1-A3AD-E57FDBFA6BEE}">
-  <ds:schemaRefs>
-    <ds:schemaRef ds:uri="http://schemas.microsoft.com/office/2006/metadata/properties"/>
-    <ds:schemaRef ds:uri="http://schemas.microsoft.com/office/infopath/2007/PartnerControls"/>
-    <ds:schemaRef ds:uri="b16a9495-4dfd-42d3-807b-98cb11f03b43"/>
-  </ds:schemaRefs>
-</ds:datastoreItem>
-</file>
-
-<file path=customXml/itemProps2.xml><?xml version="1.0" encoding="utf-8"?>
-<ds:datastoreItem xmlns:ds="http://schemas.openxmlformats.org/officeDocument/2006/customXml" ds:itemID="{AD64260C-1345-4C21-A804-B9FBE7B91489}">
-  <ds:schemaRefs>
-    <ds:schemaRef ds:uri="http://schemas.microsoft.com/sharepoint/v3/contenttype/forms"/>
-  </ds:schemaRefs>
-</ds:datastoreItem>
-</file>
-
-<file path=customXml/itemProps3.xml><?xml version="1.0" encoding="utf-8"?>
 <ds:datastoreItem xmlns:ds="http://schemas.openxmlformats.org/officeDocument/2006/customXml" ds:itemID="{1CD39011-2B34-4226-8638-59B13D86301D}">
   <ds:schemaRefs>
     <ds:schemaRef ds:uri="http://schemas.microsoft.com/office/2006/metadata/contentType"/>
@@ -6217,6 +6365,24 @@
 </ds:datastoreItem>
 </file>
 
+<file path=customXml/itemProps2.xml><?xml version="1.0" encoding="utf-8"?>
+<ds:datastoreItem xmlns:ds="http://schemas.openxmlformats.org/officeDocument/2006/customXml" ds:itemID="{AD64260C-1345-4C21-A804-B9FBE7B91489}">
+  <ds:schemaRefs>
+    <ds:schemaRef ds:uri="http://schemas.microsoft.com/sharepoint/v3/contenttype/forms"/>
+  </ds:schemaRefs>
+</ds:datastoreItem>
+</file>
+
+<file path=customXml/itemProps3.xml><?xml version="1.0" encoding="utf-8"?>
+<ds:datastoreItem xmlns:ds="http://schemas.openxmlformats.org/officeDocument/2006/customXml" ds:itemID="{D51EB97A-8C7A-4EE1-A3AD-E57FDBFA6BEE}">
+  <ds:schemaRefs>
+    <ds:schemaRef ds:uri="http://schemas.microsoft.com/office/2006/metadata/properties"/>
+    <ds:schemaRef ds:uri="http://schemas.microsoft.com/office/infopath/2007/PartnerControls"/>
+    <ds:schemaRef ds:uri="b16a9495-4dfd-42d3-807b-98cb11f03b43"/>
+  </ds:schemaRefs>
+</ds:datastoreItem>
+</file>
+
 <file path=customXml/itemProps4.xml><?xml version="1.0" encoding="utf-8"?>
 <ds:datastoreItem xmlns:ds="http://schemas.openxmlformats.org/officeDocument/2006/customXml" ds:itemID="{11111111-1234-1234-1234-123412341234}">
   <ds:schemaRefs>
@@ -6227,7 +6393,7 @@
 </file>
 
 <file path=customXml/itemProps5.xml><?xml version="1.0" encoding="utf-8"?>
-<ds:datastoreItem xmlns:ds="http://schemas.openxmlformats.org/officeDocument/2006/customXml" ds:itemID="{CE22DC36-DF56-4F9B-83A1-BE36C09F5078}">
+<ds:datastoreItem xmlns:ds="http://schemas.openxmlformats.org/officeDocument/2006/customXml" ds:itemID="{FD098F56-5BE6-4AB8-A8E5-F91629659B68}">
   <ds:schemaRefs>
     <ds:schemaRef ds:uri="http://schemas.openxmlformats.org/officeDocument/2006/bibliography"/>
   </ds:schemaRefs>

</xml_diff>

<commit_message>
Architecture diagram added + Data Source
</commit_message>
<xml_diff>
--- a/CA 1 – Capstone Project Proposal.docx
+++ b/CA 1 – Capstone Project Proposal.docx
@@ -793,7 +793,16 @@
                 <w:sz w:val="32"/>
                 <w:szCs w:val="32"/>
               </w:rPr>
-              <w:t>19/04/2026</w:t>
+              <w:t>23/10</w:t>
+            </w:r>
+            <w:r>
+              <w:rPr>
+                <w:i/>
+                <w:color w:val="156082"/>
+                <w:sz w:val="32"/>
+                <w:szCs w:val="32"/>
+              </w:rPr>
+              <w:t>/2026</w:t>
             </w:r>
           </w:p>
           <w:p>
@@ -1174,6 +1183,8 @@
         <w:lastRenderedPageBreak/>
         <w:t>Contents</w:t>
       </w:r>
+      <w:bookmarkStart w:id="0" w:name="_GoBack"/>
+      <w:bookmarkEnd w:id="0"/>
     </w:p>
     <w:sdt>
       <w:sdtPr>
@@ -1194,6 +1205,7 @@
             <w:rPr>
               <w:rFonts w:asciiTheme="minorHAnsi" w:eastAsiaTheme="minorEastAsia" w:hAnsiTheme="minorHAnsi" w:cstheme="minorBidi"/>
               <w:noProof/>
+              <w:sz w:val="22"/>
             </w:rPr>
           </w:pPr>
           <w:r>
@@ -1205,7 +1217,7 @@
           <w:r>
             <w:fldChar w:fldCharType="separate"/>
           </w:r>
-          <w:hyperlink w:anchor="_Toc241588297" w:history="1">
+          <w:hyperlink w:anchor="_Toc243330375" w:history="1">
             <w:r>
               <w:rPr>
                 <w:rStyle w:val="Hyperlink"/>
@@ -1232,7 +1244,7 @@
                 <w:noProof/>
                 <w:webHidden/>
               </w:rPr>
-              <w:instrText xml:space="preserve"> PAGEREF _Toc241588297 \h </w:instrText>
+              <w:instrText xml:space="preserve"> PAGEREF _Toc243330375 \h </w:instrText>
             </w:r>
             <w:r>
               <w:rPr>
@@ -1272,9 +1284,10 @@
             <w:rPr>
               <w:rFonts w:asciiTheme="minorHAnsi" w:eastAsiaTheme="minorEastAsia" w:hAnsiTheme="minorHAnsi" w:cstheme="minorBidi"/>
               <w:noProof/>
+              <w:sz w:val="22"/>
             </w:rPr>
           </w:pPr>
-          <w:hyperlink w:anchor="_Toc241588298" w:history="1">
+          <w:hyperlink w:anchor="_Toc243330376" w:history="1">
             <w:r>
               <w:rPr>
                 <w:rStyle w:val="Hyperlink"/>
@@ -1301,7 +1314,7 @@
                 <w:noProof/>
                 <w:webHidden/>
               </w:rPr>
-              <w:instrText xml:space="preserve"> PAGEREF _Toc241588298 \h </w:instrText>
+              <w:instrText xml:space="preserve"> PAGEREF _Toc243330376 \h </w:instrText>
             </w:r>
             <w:r>
               <w:rPr>
@@ -1341,9 +1354,10 @@
             <w:rPr>
               <w:rFonts w:asciiTheme="minorHAnsi" w:eastAsiaTheme="minorEastAsia" w:hAnsiTheme="minorHAnsi" w:cstheme="minorBidi"/>
               <w:noProof/>
+              <w:sz w:val="22"/>
             </w:rPr>
           </w:pPr>
-          <w:hyperlink w:anchor="_Toc241588299" w:history="1">
+          <w:hyperlink w:anchor="_Toc243330377" w:history="1">
             <w:r>
               <w:rPr>
                 <w:rStyle w:val="Hyperlink"/>
@@ -1370,7 +1384,7 @@
                 <w:noProof/>
                 <w:webHidden/>
               </w:rPr>
-              <w:instrText xml:space="preserve"> PAGEREF _Toc241588299 \h </w:instrText>
+              <w:instrText xml:space="preserve"> PAGEREF _Toc243330377 \h </w:instrText>
             </w:r>
             <w:r>
               <w:rPr>
@@ -1410,9 +1424,10 @@
             <w:rPr>
               <w:rFonts w:asciiTheme="minorHAnsi" w:eastAsiaTheme="minorEastAsia" w:hAnsiTheme="minorHAnsi" w:cstheme="minorBidi"/>
               <w:noProof/>
+              <w:sz w:val="22"/>
             </w:rPr>
           </w:pPr>
-          <w:hyperlink w:anchor="_Toc241588300" w:history="1">
+          <w:hyperlink w:anchor="_Toc243330378" w:history="1">
             <w:r>
               <w:rPr>
                 <w:rStyle w:val="Hyperlink"/>
@@ -1439,7 +1454,149 @@
                 <w:noProof/>
                 <w:webHidden/>
               </w:rPr>
-              <w:instrText xml:space="preserve"> PAGEREF _Toc241588300 \h </w:instrText>
+              <w:instrText xml:space="preserve"> PAGEREF _Toc243330378 \h </w:instrText>
+            </w:r>
+            <w:r>
+              <w:rPr>
+                <w:noProof/>
+                <w:webHidden/>
+              </w:rPr>
+            </w:r>
+            <w:r>
+              <w:rPr>
+                <w:noProof/>
+                <w:webHidden/>
+              </w:rPr>
+              <w:fldChar w:fldCharType="separate"/>
+            </w:r>
+            <w:r>
+              <w:rPr>
+                <w:noProof/>
+                <w:webHidden/>
+              </w:rPr>
+              <w:t>2</w:t>
+            </w:r>
+            <w:r>
+              <w:rPr>
+                <w:noProof/>
+                <w:webHidden/>
+              </w:rPr>
+              <w:fldChar w:fldCharType="end"/>
+            </w:r>
+          </w:hyperlink>
+        </w:p>
+        <w:p>
+          <w:pPr>
+            <w:pStyle w:val="TOC2"/>
+            <w:tabs>
+              <w:tab w:val="right" w:leader="dot" w:pos="9016"/>
+            </w:tabs>
+            <w:rPr>
+              <w:rFonts w:asciiTheme="minorHAnsi" w:eastAsiaTheme="minorEastAsia" w:hAnsiTheme="minorHAnsi" w:cstheme="minorBidi"/>
+              <w:noProof/>
+              <w:sz w:val="22"/>
+            </w:rPr>
+          </w:pPr>
+          <w:hyperlink w:anchor="_Toc243330379" w:history="1">
+            <w:r>
+              <w:rPr>
+                <w:rStyle w:val="Hyperlink"/>
+                <w:noProof/>
+                <w:lang w:eastAsia="en-GB"/>
+              </w:rPr>
+              <w:t>4. 1 Aim</w:t>
+            </w:r>
+            <w:r>
+              <w:rPr>
+                <w:noProof/>
+                <w:webHidden/>
+              </w:rPr>
+              <w:tab/>
+            </w:r>
+            <w:r>
+              <w:rPr>
+                <w:noProof/>
+                <w:webHidden/>
+              </w:rPr>
+              <w:fldChar w:fldCharType="begin"/>
+            </w:r>
+            <w:r>
+              <w:rPr>
+                <w:noProof/>
+                <w:webHidden/>
+              </w:rPr>
+              <w:instrText xml:space="preserve"> PAGEREF _Toc243330379 \h </w:instrText>
+            </w:r>
+            <w:r>
+              <w:rPr>
+                <w:noProof/>
+                <w:webHidden/>
+              </w:rPr>
+            </w:r>
+            <w:r>
+              <w:rPr>
+                <w:noProof/>
+                <w:webHidden/>
+              </w:rPr>
+              <w:fldChar w:fldCharType="separate"/>
+            </w:r>
+            <w:r>
+              <w:rPr>
+                <w:noProof/>
+                <w:webHidden/>
+              </w:rPr>
+              <w:t>2</w:t>
+            </w:r>
+            <w:r>
+              <w:rPr>
+                <w:noProof/>
+                <w:webHidden/>
+              </w:rPr>
+              <w:fldChar w:fldCharType="end"/>
+            </w:r>
+          </w:hyperlink>
+        </w:p>
+        <w:p>
+          <w:pPr>
+            <w:pStyle w:val="TOC2"/>
+            <w:tabs>
+              <w:tab w:val="right" w:leader="dot" w:pos="9016"/>
+            </w:tabs>
+            <w:rPr>
+              <w:rFonts w:asciiTheme="minorHAnsi" w:eastAsiaTheme="minorEastAsia" w:hAnsiTheme="minorHAnsi" w:cstheme="minorBidi"/>
+              <w:noProof/>
+              <w:sz w:val="22"/>
+            </w:rPr>
+          </w:pPr>
+          <w:hyperlink w:anchor="_Toc243330380" w:history="1">
+            <w:r>
+              <w:rPr>
+                <w:rStyle w:val="Hyperlink"/>
+                <w:noProof/>
+                <w:lang w:eastAsia="en-GB"/>
+              </w:rPr>
+              <w:t>4.2 Objectives</w:t>
+            </w:r>
+            <w:r>
+              <w:rPr>
+                <w:noProof/>
+                <w:webHidden/>
+              </w:rPr>
+              <w:tab/>
+            </w:r>
+            <w:r>
+              <w:rPr>
+                <w:noProof/>
+                <w:webHidden/>
+              </w:rPr>
+              <w:fldChar w:fldCharType="begin"/>
+            </w:r>
+            <w:r>
+              <w:rPr>
+                <w:noProof/>
+                <w:webHidden/>
+              </w:rPr>
+              <w:instrText xml:space="preserve"> PAGEREF _Toc243330380 \h </w:instrText>
             </w:r>
             <w:r>
               <w:rPr>
@@ -1479,9 +1636,10 @@
             <w:rPr>
               <w:rFonts w:asciiTheme="minorHAnsi" w:eastAsiaTheme="minorEastAsia" w:hAnsiTheme="minorHAnsi" w:cstheme="minorBidi"/>
               <w:noProof/>
+              <w:sz w:val="22"/>
             </w:rPr>
           </w:pPr>
-          <w:hyperlink w:anchor="_Toc241588301" w:history="1">
+          <w:hyperlink w:anchor="_Toc243330381" w:history="1">
             <w:r>
               <w:rPr>
                 <w:rStyle w:val="Hyperlink"/>
@@ -1508,7 +1666,7 @@
                 <w:noProof/>
                 <w:webHidden/>
               </w:rPr>
-              <w:instrText xml:space="preserve"> PAGEREF _Toc241588301 \h </w:instrText>
+              <w:instrText xml:space="preserve"> PAGEREF _Toc243330381 \h </w:instrText>
             </w:r>
             <w:r>
               <w:rPr>
@@ -1548,9 +1706,10 @@
             <w:rPr>
               <w:rFonts w:asciiTheme="minorHAnsi" w:eastAsiaTheme="minorEastAsia" w:hAnsiTheme="minorHAnsi" w:cstheme="minorBidi"/>
               <w:noProof/>
+              <w:sz w:val="22"/>
             </w:rPr>
           </w:pPr>
-          <w:hyperlink w:anchor="_Toc241588302" w:history="1">
+          <w:hyperlink w:anchor="_Toc243330382" w:history="1">
             <w:r>
               <w:rPr>
                 <w:rStyle w:val="Hyperlink"/>
@@ -1577,7 +1736,7 @@
                 <w:noProof/>
                 <w:webHidden/>
               </w:rPr>
-              <w:instrText xml:space="preserve"> PAGEREF _Toc241588302 \h </w:instrText>
+              <w:instrText xml:space="preserve"> PAGEREF _Toc243330382 \h </w:instrText>
             </w:r>
             <w:r>
               <w:rPr>
@@ -1598,6 +1757,286 @@
                 <w:webHidden/>
               </w:rPr>
               <w:t>3</w:t>
+            </w:r>
+            <w:r>
+              <w:rPr>
+                <w:noProof/>
+                <w:webHidden/>
+              </w:rPr>
+              <w:fldChar w:fldCharType="end"/>
+            </w:r>
+          </w:hyperlink>
+        </w:p>
+        <w:p>
+          <w:pPr>
+            <w:pStyle w:val="TOC2"/>
+            <w:tabs>
+              <w:tab w:val="right" w:leader="dot" w:pos="9016"/>
+            </w:tabs>
+            <w:rPr>
+              <w:rFonts w:asciiTheme="minorHAnsi" w:eastAsiaTheme="minorEastAsia" w:hAnsiTheme="minorHAnsi" w:cstheme="minorBidi"/>
+              <w:noProof/>
+              <w:sz w:val="22"/>
+            </w:rPr>
+          </w:pPr>
+          <w:hyperlink w:anchor="_Toc243330383" w:history="1">
+            <w:r>
+              <w:rPr>
+                <w:rStyle w:val="Hyperlink"/>
+                <w:noProof/>
+              </w:rPr>
+              <w:t>6.1 Data Collection and Preparation</w:t>
+            </w:r>
+            <w:r>
+              <w:rPr>
+                <w:noProof/>
+                <w:webHidden/>
+              </w:rPr>
+              <w:tab/>
+            </w:r>
+            <w:r>
+              <w:rPr>
+                <w:noProof/>
+                <w:webHidden/>
+              </w:rPr>
+              <w:fldChar w:fldCharType="begin"/>
+            </w:r>
+            <w:r>
+              <w:rPr>
+                <w:noProof/>
+                <w:webHidden/>
+              </w:rPr>
+              <w:instrText xml:space="preserve"> PAGEREF _Toc243330383 \h </w:instrText>
+            </w:r>
+            <w:r>
+              <w:rPr>
+                <w:noProof/>
+                <w:webHidden/>
+              </w:rPr>
+            </w:r>
+            <w:r>
+              <w:rPr>
+                <w:noProof/>
+                <w:webHidden/>
+              </w:rPr>
+              <w:fldChar w:fldCharType="separate"/>
+            </w:r>
+            <w:r>
+              <w:rPr>
+                <w:noProof/>
+                <w:webHidden/>
+              </w:rPr>
+              <w:t>3</w:t>
+            </w:r>
+            <w:r>
+              <w:rPr>
+                <w:noProof/>
+                <w:webHidden/>
+              </w:rPr>
+              <w:fldChar w:fldCharType="end"/>
+            </w:r>
+          </w:hyperlink>
+        </w:p>
+        <w:p>
+          <w:pPr>
+            <w:pStyle w:val="TOC2"/>
+            <w:tabs>
+              <w:tab w:val="right" w:leader="dot" w:pos="9016"/>
+            </w:tabs>
+            <w:rPr>
+              <w:rFonts w:asciiTheme="minorHAnsi" w:eastAsiaTheme="minorEastAsia" w:hAnsiTheme="minorHAnsi" w:cstheme="minorBidi"/>
+              <w:noProof/>
+              <w:sz w:val="22"/>
+            </w:rPr>
+          </w:pPr>
+          <w:hyperlink w:anchor="_Toc243330384" w:history="1">
+            <w:r>
+              <w:rPr>
+                <w:rStyle w:val="Hyperlink"/>
+                <w:noProof/>
+              </w:rPr>
+              <w:t>6.2 Predictive Modelling</w:t>
+            </w:r>
+            <w:r>
+              <w:rPr>
+                <w:noProof/>
+                <w:webHidden/>
+              </w:rPr>
+              <w:tab/>
+            </w:r>
+            <w:r>
+              <w:rPr>
+                <w:noProof/>
+                <w:webHidden/>
+              </w:rPr>
+              <w:fldChar w:fldCharType="begin"/>
+            </w:r>
+            <w:r>
+              <w:rPr>
+                <w:noProof/>
+                <w:webHidden/>
+              </w:rPr>
+              <w:instrText xml:space="preserve"> PAGEREF _Toc243330384 \h </w:instrText>
+            </w:r>
+            <w:r>
+              <w:rPr>
+                <w:noProof/>
+                <w:webHidden/>
+              </w:rPr>
+            </w:r>
+            <w:r>
+              <w:rPr>
+                <w:noProof/>
+                <w:webHidden/>
+              </w:rPr>
+              <w:fldChar w:fldCharType="separate"/>
+            </w:r>
+            <w:r>
+              <w:rPr>
+                <w:noProof/>
+                <w:webHidden/>
+              </w:rPr>
+              <w:t>3</w:t>
+            </w:r>
+            <w:r>
+              <w:rPr>
+                <w:noProof/>
+                <w:webHidden/>
+              </w:rPr>
+              <w:fldChar w:fldCharType="end"/>
+            </w:r>
+          </w:hyperlink>
+        </w:p>
+        <w:p>
+          <w:pPr>
+            <w:pStyle w:val="TOC2"/>
+            <w:tabs>
+              <w:tab w:val="right" w:leader="dot" w:pos="9016"/>
+            </w:tabs>
+            <w:rPr>
+              <w:rFonts w:asciiTheme="minorHAnsi" w:eastAsiaTheme="minorEastAsia" w:hAnsiTheme="minorHAnsi" w:cstheme="minorBidi"/>
+              <w:noProof/>
+              <w:sz w:val="22"/>
+            </w:rPr>
+          </w:pPr>
+          <w:hyperlink w:anchor="_Toc243330385" w:history="1">
+            <w:r>
+              <w:rPr>
+                <w:rStyle w:val="Hyperlink"/>
+                <w:noProof/>
+              </w:rPr>
+              <w:t>6.3 Model Evaluation</w:t>
+            </w:r>
+            <w:r>
+              <w:rPr>
+                <w:noProof/>
+                <w:webHidden/>
+              </w:rPr>
+              <w:tab/>
+            </w:r>
+            <w:r>
+              <w:rPr>
+                <w:noProof/>
+                <w:webHidden/>
+              </w:rPr>
+              <w:fldChar w:fldCharType="begin"/>
+            </w:r>
+            <w:r>
+              <w:rPr>
+                <w:noProof/>
+                <w:webHidden/>
+              </w:rPr>
+              <w:instrText xml:space="preserve"> PAGEREF _Toc243330385 \h </w:instrText>
+            </w:r>
+            <w:r>
+              <w:rPr>
+                <w:noProof/>
+                <w:webHidden/>
+              </w:rPr>
+            </w:r>
+            <w:r>
+              <w:rPr>
+                <w:noProof/>
+                <w:webHidden/>
+              </w:rPr>
+              <w:fldChar w:fldCharType="separate"/>
+            </w:r>
+            <w:r>
+              <w:rPr>
+                <w:noProof/>
+                <w:webHidden/>
+              </w:rPr>
+              <w:t>3</w:t>
+            </w:r>
+            <w:r>
+              <w:rPr>
+                <w:noProof/>
+                <w:webHidden/>
+              </w:rPr>
+              <w:fldChar w:fldCharType="end"/>
+            </w:r>
+          </w:hyperlink>
+        </w:p>
+        <w:p>
+          <w:pPr>
+            <w:pStyle w:val="TOC2"/>
+            <w:tabs>
+              <w:tab w:val="right" w:leader="dot" w:pos="9016"/>
+            </w:tabs>
+            <w:rPr>
+              <w:rFonts w:asciiTheme="minorHAnsi" w:eastAsiaTheme="minorEastAsia" w:hAnsiTheme="minorHAnsi" w:cstheme="minorBidi"/>
+              <w:noProof/>
+              <w:sz w:val="22"/>
+            </w:rPr>
+          </w:pPr>
+          <w:hyperlink w:anchor="_Toc243330386" w:history="1">
+            <w:r>
+              <w:rPr>
+                <w:rStyle w:val="Hyperlink"/>
+                <w:noProof/>
+              </w:rPr>
+              <w:t>6.4 Architecture Diagram</w:t>
+            </w:r>
+            <w:r>
+              <w:rPr>
+                <w:noProof/>
+                <w:webHidden/>
+              </w:rPr>
+              <w:tab/>
+            </w:r>
+            <w:r>
+              <w:rPr>
+                <w:noProof/>
+                <w:webHidden/>
+              </w:rPr>
+              <w:fldChar w:fldCharType="begin"/>
+            </w:r>
+            <w:r>
+              <w:rPr>
+                <w:noProof/>
+                <w:webHidden/>
+              </w:rPr>
+              <w:instrText xml:space="preserve"> PAGEREF _Toc243330386 \h </w:instrText>
+            </w:r>
+            <w:r>
+              <w:rPr>
+                <w:noProof/>
+                <w:webHidden/>
+              </w:rPr>
+            </w:r>
+            <w:r>
+              <w:rPr>
+                <w:noProof/>
+                <w:webHidden/>
+              </w:rPr>
+              <w:fldChar w:fldCharType="separate"/>
+            </w:r>
+            <w:r>
+              <w:rPr>
+                <w:noProof/>
+                <w:webHidden/>
+              </w:rPr>
+              <w:t>4</w:t>
             </w:r>
             <w:r>
               <w:rPr>
@@ -1617,9 +2056,10 @@
             <w:rPr>
               <w:rFonts w:asciiTheme="minorHAnsi" w:eastAsiaTheme="minorEastAsia" w:hAnsiTheme="minorHAnsi" w:cstheme="minorBidi"/>
               <w:noProof/>
+              <w:sz w:val="22"/>
             </w:rPr>
           </w:pPr>
-          <w:hyperlink w:anchor="_Toc241588303" w:history="1">
+          <w:hyperlink w:anchor="_Toc243330387" w:history="1">
             <w:r>
               <w:rPr>
                 <w:rStyle w:val="Hyperlink"/>
@@ -1646,7 +2086,7 @@
                 <w:noProof/>
                 <w:webHidden/>
               </w:rPr>
-              <w:instrText xml:space="preserve"> PAGEREF _Toc241588303 \h </w:instrText>
+              <w:instrText xml:space="preserve"> PAGEREF _Toc243330387 \h </w:instrText>
             </w:r>
             <w:r>
               <w:rPr>
@@ -1666,7 +2106,7 @@
                 <w:noProof/>
                 <w:webHidden/>
               </w:rPr>
-              <w:t>3</w:t>
+              <w:t>4</w:t>
             </w:r>
             <w:r>
               <w:rPr>
@@ -1686,9 +2126,10 @@
             <w:rPr>
               <w:rFonts w:asciiTheme="minorHAnsi" w:eastAsiaTheme="minorEastAsia" w:hAnsiTheme="minorHAnsi" w:cstheme="minorBidi"/>
               <w:noProof/>
+              <w:sz w:val="22"/>
             </w:rPr>
           </w:pPr>
-          <w:hyperlink w:anchor="_Toc241588304" w:history="1">
+          <w:hyperlink w:anchor="_Toc243330388" w:history="1">
             <w:r>
               <w:rPr>
                 <w:rStyle w:val="Hyperlink"/>
@@ -1715,7 +2156,7 @@
                 <w:noProof/>
                 <w:webHidden/>
               </w:rPr>
-              <w:instrText xml:space="preserve"> PAGEREF _Toc241588304 \h </w:instrText>
+              <w:instrText xml:space="preserve"> PAGEREF _Toc243330388 \h </w:instrText>
             </w:r>
             <w:r>
               <w:rPr>
@@ -1735,7 +2176,7 @@
                 <w:noProof/>
                 <w:webHidden/>
               </w:rPr>
-              <w:t>3</w:t>
+              <w:t>4</w:t>
             </w:r>
             <w:r>
               <w:rPr>
@@ -1755,9 +2196,10 @@
             <w:rPr>
               <w:rFonts w:asciiTheme="minorHAnsi" w:eastAsiaTheme="minorEastAsia" w:hAnsiTheme="minorHAnsi" w:cstheme="minorBidi"/>
               <w:noProof/>
+              <w:sz w:val="22"/>
             </w:rPr>
           </w:pPr>
-          <w:hyperlink w:anchor="_Toc241588305" w:history="1">
+          <w:hyperlink w:anchor="_Toc243330389" w:history="1">
             <w:r>
               <w:rPr>
                 <w:rStyle w:val="Hyperlink"/>
@@ -1784,7 +2226,7 @@
                 <w:noProof/>
                 <w:webHidden/>
               </w:rPr>
-              <w:instrText xml:space="preserve"> PAGEREF _Toc241588305 \h </w:instrText>
+              <w:instrText xml:space="preserve"> PAGEREF _Toc243330389 \h </w:instrText>
             </w:r>
             <w:r>
               <w:rPr>
@@ -1804,7 +2246,7 @@
                 <w:noProof/>
                 <w:webHidden/>
               </w:rPr>
-              <w:t>3</w:t>
+              <w:t>4</w:t>
             </w:r>
             <w:r>
               <w:rPr>
@@ -1824,9 +2266,10 @@
             <w:rPr>
               <w:rFonts w:asciiTheme="minorHAnsi" w:eastAsiaTheme="minorEastAsia" w:hAnsiTheme="minorHAnsi" w:cstheme="minorBidi"/>
               <w:noProof/>
+              <w:sz w:val="22"/>
             </w:rPr>
           </w:pPr>
-          <w:hyperlink w:anchor="_Toc241588306" w:history="1">
+          <w:hyperlink w:anchor="_Toc243330390" w:history="1">
             <w:r>
               <w:rPr>
                 <w:rStyle w:val="Hyperlink"/>
@@ -1853,7 +2296,7 @@
                 <w:noProof/>
                 <w:webHidden/>
               </w:rPr>
-              <w:instrText xml:space="preserve"> PAGEREF _Toc241588306 \h </w:instrText>
+              <w:instrText xml:space="preserve"> PAGEREF _Toc243330390 \h </w:instrText>
             </w:r>
             <w:r>
               <w:rPr>
@@ -1873,7 +2316,7 @@
                 <w:noProof/>
                 <w:webHidden/>
               </w:rPr>
-              <w:t>3</w:t>
+              <w:t>4</w:t>
             </w:r>
             <w:r>
               <w:rPr>
@@ -1893,9 +2336,10 @@
             <w:rPr>
               <w:rFonts w:asciiTheme="minorHAnsi" w:eastAsiaTheme="minorEastAsia" w:hAnsiTheme="minorHAnsi" w:cstheme="minorBidi"/>
               <w:noProof/>
+              <w:sz w:val="22"/>
             </w:rPr>
           </w:pPr>
-          <w:hyperlink w:anchor="_Toc241588307" w:history="1">
+          <w:hyperlink w:anchor="_Toc243330391" w:history="1">
             <w:r>
               <w:rPr>
                 <w:rStyle w:val="Hyperlink"/>
@@ -1922,7 +2366,7 @@
                 <w:noProof/>
                 <w:webHidden/>
               </w:rPr>
-              <w:instrText xml:space="preserve"> PAGEREF _Toc241588307 \h </w:instrText>
+              <w:instrText xml:space="preserve"> PAGEREF _Toc243330391 \h </w:instrText>
             </w:r>
             <w:r>
               <w:rPr>
@@ -1942,7 +2386,7 @@
                 <w:noProof/>
                 <w:webHidden/>
               </w:rPr>
-              <w:t>4</w:t>
+              <w:t>5</w:t>
             </w:r>
             <w:r>
               <w:rPr>
@@ -1962,9 +2406,10 @@
             <w:rPr>
               <w:rFonts w:asciiTheme="minorHAnsi" w:eastAsiaTheme="minorEastAsia" w:hAnsiTheme="minorHAnsi" w:cstheme="minorBidi"/>
               <w:noProof/>
+              <w:sz w:val="22"/>
             </w:rPr>
           </w:pPr>
-          <w:hyperlink w:anchor="_Toc241588308" w:history="1">
+          <w:hyperlink w:anchor="_Toc243330392" w:history="1">
             <w:r>
               <w:rPr>
                 <w:rStyle w:val="Hyperlink"/>
@@ -1991,7 +2436,7 @@
                 <w:noProof/>
                 <w:webHidden/>
               </w:rPr>
-              <w:instrText xml:space="preserve"> PAGEREF _Toc241588308 \h </w:instrText>
+              <w:instrText xml:space="preserve"> PAGEREF _Toc243330392 \h </w:instrText>
             </w:r>
             <w:r>
               <w:rPr>
@@ -2011,7 +2456,7 @@
                 <w:noProof/>
                 <w:webHidden/>
               </w:rPr>
-              <w:t>5</w:t>
+              <w:t>6</w:t>
             </w:r>
             <w:r>
               <w:rPr>
@@ -2045,12 +2490,12 @@
         <w:pStyle w:val="Heading1"/>
         <w:spacing w:after="0"/>
       </w:pPr>
-      <w:bookmarkStart w:id="0" w:name="_Toc241588297"/>
+      <w:bookmarkStart w:id="1" w:name="_Toc243330375"/>
       <w:r>
         <w:lastRenderedPageBreak/>
         <w:t>1. Project Title</w:t>
       </w:r>
-      <w:bookmarkEnd w:id="0"/>
+      <w:bookmarkEnd w:id="1"/>
     </w:p>
     <w:p>
       <w:r>
@@ -2061,11 +2506,11 @@
       <w:pPr>
         <w:pStyle w:val="Heading1"/>
       </w:pPr>
-      <w:bookmarkStart w:id="1" w:name="_Toc241588298"/>
+      <w:bookmarkStart w:id="2" w:name="_Toc243330376"/>
       <w:r>
         <w:t>2. Introduction</w:t>
       </w:r>
-      <w:bookmarkEnd w:id="1"/>
+      <w:bookmarkEnd w:id="2"/>
     </w:p>
     <w:p>
       <w:pPr>
@@ -2817,12 +3262,12 @@
       <w:pPr>
         <w:pStyle w:val="Heading1"/>
       </w:pPr>
-      <w:bookmarkStart w:id="2" w:name="_Toc241588299"/>
+      <w:bookmarkStart w:id="3" w:name="_Toc243330377"/>
       <w:r>
         <w:lastRenderedPageBreak/>
         <w:t>3. Problem Definition</w:t>
       </w:r>
-      <w:bookmarkEnd w:id="2"/>
+      <w:bookmarkEnd w:id="3"/>
     </w:p>
     <w:p>
       <w:pPr>
@@ -2953,11 +3398,11 @@
       <w:pPr>
         <w:pStyle w:val="Heading1"/>
       </w:pPr>
-      <w:bookmarkStart w:id="3" w:name="_Toc241588300"/>
+      <w:bookmarkStart w:id="4" w:name="_Toc243330378"/>
       <w:r>
         <w:t>4. Aim and Objectives</w:t>
       </w:r>
-      <w:bookmarkEnd w:id="3"/>
+      <w:bookmarkEnd w:id="4"/>
     </w:p>
     <w:p>
       <w:pPr>
@@ -2966,12 +3411,14 @@
           <w:lang w:eastAsia="en-GB"/>
         </w:rPr>
       </w:pPr>
+      <w:bookmarkStart w:id="5" w:name="_Toc243330379"/>
       <w:r>
         <w:rPr>
           <w:lang w:eastAsia="en-GB"/>
         </w:rPr>
         <w:t>4. 1 Aim</w:t>
       </w:r>
+      <w:bookmarkEnd w:id="5"/>
     </w:p>
     <w:p>
       <w:pPr>
@@ -3001,12 +3448,14 @@
           <w:lang w:eastAsia="en-GB"/>
         </w:rPr>
       </w:pPr>
+      <w:bookmarkStart w:id="6" w:name="_Toc243330380"/>
       <w:r>
         <w:rPr>
           <w:lang w:eastAsia="en-GB"/>
         </w:rPr>
         <w:t>4.2 Objectives</w:t>
       </w:r>
+      <w:bookmarkEnd w:id="6"/>
     </w:p>
     <w:p>
       <w:pPr>
@@ -3069,11 +3518,11 @@
       <w:pPr>
         <w:pStyle w:val="Heading1"/>
       </w:pPr>
-      <w:bookmarkStart w:id="4" w:name="_Toc241588301"/>
+      <w:bookmarkStart w:id="7" w:name="_Toc243330381"/>
       <w:r>
         <w:t>5. Scope</w:t>
       </w:r>
-      <w:bookmarkEnd w:id="4"/>
+      <w:bookmarkEnd w:id="7"/>
     </w:p>
     <w:p>
       <w:pPr>
@@ -3082,7 +3531,6 @@
           <w:lang w:eastAsia="en-GB"/>
         </w:rPr>
       </w:pPr>
-      <w:bookmarkStart w:id="5" w:name="_Toc241588302"/>
       <w:r>
         <w:rPr>
           <w:lang w:eastAsia="en-GB"/>
@@ -3109,19 +3557,21 @@
       <w:pPr>
         <w:pStyle w:val="Heading1"/>
       </w:pPr>
+      <w:bookmarkStart w:id="8" w:name="_Toc243330382"/>
       <w:r>
         <w:t>6. Methodology</w:t>
       </w:r>
-      <w:bookmarkEnd w:id="5"/>
+      <w:bookmarkEnd w:id="8"/>
     </w:p>
     <w:p>
       <w:pPr>
         <w:pStyle w:val="Heading2"/>
       </w:pPr>
-      <w:bookmarkStart w:id="6" w:name="_Toc241588303"/>
+      <w:bookmarkStart w:id="9" w:name="_Toc243330383"/>
       <w:r>
         <w:t>6.1 Data Collection and Preparation</w:t>
       </w:r>
+      <w:bookmarkEnd w:id="9"/>
     </w:p>
     <w:p>
       <w:pPr>
@@ -3178,9 +3628,11 @@
       <w:pPr>
         <w:pStyle w:val="Heading2"/>
       </w:pPr>
+      <w:bookmarkStart w:id="10" w:name="_Toc243330384"/>
       <w:r>
         <w:t>6.2 Predictive Modelling</w:t>
       </w:r>
+      <w:bookmarkEnd w:id="10"/>
     </w:p>
     <w:p>
       <w:pPr>
@@ -3244,9 +3696,11 @@
       <w:pPr>
         <w:pStyle w:val="Heading2"/>
       </w:pPr>
+      <w:bookmarkStart w:id="11" w:name="_Toc243330385"/>
       <w:r>
         <w:t>6.3 Model Evaluation</w:t>
       </w:r>
+      <w:bookmarkEnd w:id="11"/>
     </w:p>
     <w:p>
       <w:pPr>
@@ -3308,28 +3762,134 @@
       <w:pPr>
         <w:pStyle w:val="Heading2"/>
       </w:pPr>
+      <w:bookmarkStart w:id="12" w:name="_Toc243330386"/>
       <w:r>
         <w:t>6.4 Architecture Diagram</w:t>
       </w:r>
+      <w:bookmarkEnd w:id="12"/>
+    </w:p>
+    <w:p>
+      <w:pPr>
+        <w:jc w:val="center"/>
+        <w:rPr>
+          <w:noProof/>
+        </w:rPr>
+      </w:pPr>
+    </w:p>
+    <w:p>
+      <w:pPr>
+        <w:jc w:val="center"/>
+      </w:pPr>
+      <w:r>
+        <w:rPr>
+          <w:noProof/>
+        </w:rPr>
+        <w:drawing>
+          <wp:inline distT="0" distB="0" distL="0" distR="0" wp14:anchorId="1C84670F" wp14:editId="4DDB89AF">
+            <wp:extent cx="5678170" cy="1269365"/>
+            <wp:effectExtent l="0" t="0" r="0" b="6985"/>
+            <wp:docPr id="2" name="Picture 2"/>
+            <wp:cNvGraphicFramePr>
+              <a:graphicFrameLocks xmlns:a="http://schemas.openxmlformats.org/drawingml/2006/main" noChangeAspect="1"/>
+            </wp:cNvGraphicFramePr>
+            <a:graphic xmlns:a="http://schemas.openxmlformats.org/drawingml/2006/main">
+              <a:graphicData uri="http://schemas.openxmlformats.org/drawingml/2006/picture">
+                <pic:pic xmlns:pic="http://schemas.openxmlformats.org/drawingml/2006/picture">
+                  <pic:nvPicPr>
+                    <pic:cNvPr id="2" name="Diagram.png"/>
+                    <pic:cNvPicPr/>
+                  </pic:nvPicPr>
+                  <pic:blipFill rotWithShape="1">
+                    <a:blip r:embed="rId14" cstate="print">
+                      <a:extLst>
+                        <a:ext uri="{28A0092B-C50C-407E-A947-70E740481C1C}">
+                          <a14:useLocalDpi xmlns:a14="http://schemas.microsoft.com/office/drawing/2010/main" val="0"/>
+                        </a:ext>
+                      </a:extLst>
+                    </a:blip>
+                    <a:srcRect l="931"/>
+                    <a:stretch/>
+                  </pic:blipFill>
+                  <pic:spPr bwMode="auto">
+                    <a:xfrm>
+                      <a:off x="0" y="0"/>
+                      <a:ext cx="5678170" cy="1269365"/>
+                    </a:xfrm>
+                    <a:prstGeom prst="rect">
+                      <a:avLst/>
+                    </a:prstGeom>
+                    <a:ln>
+                      <a:noFill/>
+                    </a:ln>
+                    <a:extLst>
+                      <a:ext uri="{53640926-AAD7-44D8-BBD7-CCE9431645EC}">
+                        <a14:shadowObscured xmlns:a14="http://schemas.microsoft.com/office/drawing/2010/main"/>
+                      </a:ext>
+                    </a:extLst>
+                  </pic:spPr>
+                </pic:pic>
+              </a:graphicData>
+            </a:graphic>
+          </wp:inline>
+        </w:drawing>
+      </w:r>
+    </w:p>
+    <w:p>
+      <w:pPr>
+        <w:jc w:val="center"/>
+      </w:pPr>
+      <w:r>
+        <w:t>Figure 1: Architecture diagram of the proposed project.</w:t>
+      </w:r>
+    </w:p>
+    <w:p>
+      <w:pPr>
+        <w:pStyle w:val="Heading1"/>
+      </w:pPr>
+      <w:bookmarkStart w:id="13" w:name="_Toc243330387"/>
+      <w:r>
+        <w:t>7. Data Sources</w:t>
+      </w:r>
+      <w:bookmarkEnd w:id="13"/>
     </w:p>
     <w:p>
       <w:pPr>
         <w:ind w:firstLine="720"/>
-      </w:pPr>
+        <w:rPr>
+          <w:lang w:eastAsia="en-GB"/>
+        </w:rPr>
+      </w:pPr>
+      <w:r>
+        <w:rPr>
+          <w:lang w:eastAsia="en-GB"/>
+        </w:rPr>
+        <w:t>The Public Procurement Open Data dataset published by Ireland's Office of Government Procurement will be used in this project. The dataset includes records of procurement notices, contract awards, procurement procedures and related information across public sector organisations (OGP, 2026). It covers published competitions from 1 January 2013 to 30 June 2026. The file used in this project contains approximately 87,400 records and 31 variables, providing a substantial source of historical data for analysis.</w:t>
+      </w:r>
+    </w:p>
+    <w:p>
+      <w:pPr>
+        <w:ind w:firstLine="720"/>
+        <w:rPr>
+          <w:b/>
+          <w:lang w:eastAsia="en-GB"/>
+        </w:rPr>
+      </w:pPr>
+      <w:r>
+        <w:rPr>
+          <w:lang w:eastAsia="en-GB"/>
+        </w:rPr>
+        <w:t>The dataset is relevant to the business problem because it contains the number of bids received together with characteristics such as CPV code, estimated contract value and contract type that are known when a tender is published and can therefore be used as predictors. The dataset is publicly available through data.gov.ie and is licensed under the Creative Commons Attribution 4.0.</w:t>
+      </w:r>
     </w:p>
     <w:p>
       <w:pPr>
         <w:pStyle w:val="Heading1"/>
       </w:pPr>
-      <w:r>
-        <w:t>7. Data Sou</w:t>
-      </w:r>
-      <w:bookmarkStart w:id="7" w:name="_GoBack"/>
-      <w:bookmarkEnd w:id="7"/>
-      <w:r>
-        <w:t>rces</w:t>
-      </w:r>
-      <w:bookmarkEnd w:id="6"/>
+      <w:bookmarkStart w:id="14" w:name="_Toc243330388"/>
+      <w:r>
+        <w:t>8. Expected Deliverables</w:t>
+      </w:r>
+      <w:bookmarkEnd w:id="14"/>
     </w:p>
     <w:p>
       <w:pPr>
@@ -3343,43 +3903,18 @@
           <w:color w:val="FF0000"/>
           <w:lang w:eastAsia="en-GB"/>
         </w:rPr>
-        <w:t>Identify the dataset(s) or data sources you intend to use. Describe the type and approximate amount of data required, its relevance to the business problem, and evidence of appropriate permission or rights to access and use the data.</w:t>
+        <w:t>Clearly state what you expect to produce by the end of Semester 2, including the expected analytical and predictive modelling outputs and any relevant dashboard, application, system or other project deliverables.</w:t>
       </w:r>
     </w:p>
     <w:p>
       <w:pPr>
         <w:pStyle w:val="Heading1"/>
       </w:pPr>
-      <w:bookmarkStart w:id="8" w:name="_Toc241588304"/>
-      <w:r>
-        <w:t>8. Expected Deliverables</w:t>
-      </w:r>
-      <w:bookmarkEnd w:id="8"/>
-    </w:p>
-    <w:p>
-      <w:pPr>
-        <w:rPr>
-          <w:color w:val="FF0000"/>
-          <w:lang w:eastAsia="en-GB"/>
-        </w:rPr>
-      </w:pPr>
-      <w:r>
-        <w:rPr>
-          <w:color w:val="FF0000"/>
-          <w:lang w:eastAsia="en-GB"/>
-        </w:rPr>
-        <w:t>Clearly state what you expect to produce by the end of Semester 2, including the expected analytical and predictive modelling outputs and any relevant dashboard, application, system or other project deliverables.</w:t>
-      </w:r>
-    </w:p>
-    <w:p>
-      <w:pPr>
-        <w:pStyle w:val="Heading1"/>
-      </w:pPr>
-      <w:bookmarkStart w:id="9" w:name="_Toc241588305"/>
+      <w:bookmarkStart w:id="15" w:name="_Toc243330389"/>
       <w:r>
         <w:t>9. Project Timeline</w:t>
       </w:r>
-      <w:bookmarkEnd w:id="9"/>
+      <w:bookmarkEnd w:id="15"/>
     </w:p>
     <w:p>
       <w:pPr>
@@ -3416,11 +3951,11 @@
       <w:pPr>
         <w:pStyle w:val="Heading1"/>
       </w:pPr>
-      <w:bookmarkStart w:id="10" w:name="_Toc241588306"/>
+      <w:bookmarkStart w:id="16" w:name="_Toc243330390"/>
       <w:r>
         <w:t>10. Ethical and Legal Considerations</w:t>
       </w:r>
-      <w:bookmarkEnd w:id="10"/>
+      <w:bookmarkEnd w:id="16"/>
     </w:p>
     <w:p>
       <w:r>
@@ -3437,12 +3972,12 @@
       <w:pPr>
         <w:pStyle w:val="Heading1"/>
       </w:pPr>
-      <w:bookmarkStart w:id="11" w:name="_Toc241588307"/>
+      <w:bookmarkStart w:id="17" w:name="_Toc243330391"/>
       <w:r>
         <w:lastRenderedPageBreak/>
         <w:t>References</w:t>
       </w:r>
-      <w:bookmarkEnd w:id="11"/>
+      <w:bookmarkEnd w:id="17"/>
     </w:p>
     <w:p>
       <w:pPr>
@@ -3631,38 +4166,23 @@
       <w:r>
         <w:fldChar w:fldCharType="end"/>
       </w:r>
-    </w:p>
-    <w:p>
-      <w:pPr>
+      <w:r>
         <w:rPr>
           <w:color w:val="FF0000"/>
         </w:rPr>
-      </w:pPr>
-      <w:r>
+        <w:t xml:space="preserve"> </w:t>
+      </w:r>
+    </w:p>
+    <w:p>
+      <w:pPr>
         <w:rPr>
           <w:color w:val="FF0000"/>
         </w:rPr>
-        <w:t xml:space="preserve">Please list all the references you have used in your assignment alphabetically and in the Harvard style. You can find information on how to correctly reference in Harvard at this link: </w:t>
-      </w:r>
-      <w:hyperlink r:id="rId14" w:history="1">
-        <w:r>
-          <w:rPr>
-            <w:rStyle w:val="Hyperlink"/>
-          </w:rPr>
-          <w:t>https://library.cct.ie/referencing/harvard</w:t>
-        </w:r>
-      </w:hyperlink>
-    </w:p>
-    <w:p>
-      <w:pPr>
+      </w:pPr>
+      <w:r>
         <w:rPr>
           <w:color w:val="FF0000"/>
         </w:rPr>
-      </w:pPr>
-      <w:r>
-        <w:rPr>
-          <w:color w:val="FF0000"/>
-        </w:rPr>
         <w:br w:type="page"/>
       </w:r>
     </w:p>
@@ -3670,14 +4190,14 @@
       <w:pPr>
         <w:pStyle w:val="Heading1"/>
       </w:pPr>
-      <w:bookmarkStart w:id="12" w:name="_heading=h.kfkjs3rwl2c1" w:colFirst="0" w:colLast="0"/>
-      <w:bookmarkStart w:id="13" w:name="_Toc241588308"/>
-      <w:bookmarkEnd w:id="12"/>
+      <w:bookmarkStart w:id="18" w:name="_heading=h.kfkjs3rwl2c1" w:colFirst="0" w:colLast="0"/>
+      <w:bookmarkStart w:id="19" w:name="_Toc243330392"/>
+      <w:bookmarkEnd w:id="18"/>
       <w:r>
         <w:lastRenderedPageBreak/>
         <w:t>Appendix</w:t>
       </w:r>
-      <w:bookmarkEnd w:id="13"/>
+      <w:bookmarkEnd w:id="19"/>
     </w:p>
     <w:p/>
     <w:p>
@@ -6171,6 +6691,23 @@
 </file>
 
 <file path=customXml/item1.xml><?xml version="1.0" encoding="utf-8"?>
+<p:properties xmlns:p="http://schemas.microsoft.com/office/2006/metadata/properties" xmlns:xsi="http://www.w3.org/2001/XMLSchema-instance" xmlns:pc="http://schemas.microsoft.com/office/infopath/2007/PartnerControls">
+  <documentManagement>
+    <_activity xmlns="b16a9495-4dfd-42d3-807b-98cb11f03b43" xsi:nil="true"/>
+  </documentManagement>
+</p:properties>
+</file>
+
+<file path=customXml/item2.xml><?xml version="1.0" encoding="utf-8"?>
+<?mso-contentType ?>
+<FormTemplates xmlns="http://schemas.microsoft.com/sharepoint/v3/contenttype/forms">
+  <Display>DocumentLibraryForm</Display>
+  <Edit>DocumentLibraryForm</Edit>
+  <New>DocumentLibraryForm</New>
+</FormTemplates>
+</file>
+
+<file path=customXml/item3.xml><?xml version="1.0" encoding="utf-8"?>
 <ct:contentTypeSchema xmlns:ct="http://schemas.microsoft.com/office/2006/metadata/contentType" xmlns:ma="http://schemas.microsoft.com/office/2006/metadata/properties/metaAttributes" ct:_="" ma:_="" ma:contentTypeName="Document" ma:contentTypeID="0x01010091CA7052A48FB44E8BAE44044031FC77" ma:contentTypeVersion="5" ma:contentTypeDescription="Create a new document." ma:contentTypeScope="" ma:versionID="72110da391d7bf7bbbd9879cda66318c">
   <xsd:schema xmlns:xsd="http://www.w3.org/2001/XMLSchema" xmlns:xs="http://www.w3.org/2001/XMLSchema" xmlns:p="http://schemas.microsoft.com/office/2006/metadata/properties" xmlns:ns3="b16a9495-4dfd-42d3-807b-98cb11f03b43" targetNamespace="http://schemas.microsoft.com/office/2006/metadata/properties" ma:root="true" ma:fieldsID="65d4c4ab10123b5e2192ffab3149626d" ns3:_="">
     <xsd:import namespace="b16a9495-4dfd-42d3-807b-98cb11f03b43"/>
@@ -6320,23 +6857,6 @@
 </ct:contentTypeSchema>
 </file>
 
-<file path=customXml/item2.xml><?xml version="1.0" encoding="utf-8"?>
-<?mso-contentType ?>
-<FormTemplates xmlns="http://schemas.microsoft.com/sharepoint/v3/contenttype/forms">
-  <Display>DocumentLibraryForm</Display>
-  <Edit>DocumentLibraryForm</Edit>
-  <New>DocumentLibraryForm</New>
-</FormTemplates>
-</file>
-
-<file path=customXml/item3.xml><?xml version="1.0" encoding="utf-8"?>
-<p:properties xmlns:p="http://schemas.microsoft.com/office/2006/metadata/properties" xmlns:xsi="http://www.w3.org/2001/XMLSchema-instance" xmlns:pc="http://schemas.microsoft.com/office/infopath/2007/PartnerControls">
-  <documentManagement>
-    <_activity xmlns="b16a9495-4dfd-42d3-807b-98cb11f03b43" xsi:nil="true"/>
-  </documentManagement>
-</p:properties>
-</file>
-
 <file path=customXml/item4.xml><?xml version="1.0" encoding="utf-8"?>
 <go:gDocsCustomXmlDataStorage xmlns:go="http://customooxmlschemas.google.com/" xmlns:r="http://schemas.openxmlformats.org/officeDocument/2006/relationships" uri="GoogleDocsCustomDataVersion2">
   <go:docsCustomData xmlns:go="http://customooxmlschemas.google.com/" roundtripDataSignature="AMtx7miehlgh2pzFvkmpnhkVaeODs3Wnuw==">CgMxLjAyCGguZ2pkZ3hzMgloLjMwajB6bGwyCWguMWZvYjl0ZTIJaC4zem55c2g3MgloLjJldDkycDAyDmgua2ZranMzcndsMmMxOAByITF6bEVRVXYyWkdtTjZWemdfYk5uaGpmb0x1c2hhYUo3dw==</go:docsCustomData>
@@ -6348,6 +6868,24 @@
 </file>
 
 <file path=customXml/itemProps1.xml><?xml version="1.0" encoding="utf-8"?>
+<ds:datastoreItem xmlns:ds="http://schemas.openxmlformats.org/officeDocument/2006/customXml" ds:itemID="{D51EB97A-8C7A-4EE1-A3AD-E57FDBFA6BEE}">
+  <ds:schemaRefs>
+    <ds:schemaRef ds:uri="http://schemas.microsoft.com/office/2006/metadata/properties"/>
+    <ds:schemaRef ds:uri="http://schemas.microsoft.com/office/infopath/2007/PartnerControls"/>
+    <ds:schemaRef ds:uri="b16a9495-4dfd-42d3-807b-98cb11f03b43"/>
+  </ds:schemaRefs>
+</ds:datastoreItem>
+</file>
+
+<file path=customXml/itemProps2.xml><?xml version="1.0" encoding="utf-8"?>
+<ds:datastoreItem xmlns:ds="http://schemas.openxmlformats.org/officeDocument/2006/customXml" ds:itemID="{AD64260C-1345-4C21-A804-B9FBE7B91489}">
+  <ds:schemaRefs>
+    <ds:schemaRef ds:uri="http://schemas.microsoft.com/sharepoint/v3/contenttype/forms"/>
+  </ds:schemaRefs>
+</ds:datastoreItem>
+</file>
+
+<file path=customXml/itemProps3.xml><?xml version="1.0" encoding="utf-8"?>
 <ds:datastoreItem xmlns:ds="http://schemas.openxmlformats.org/officeDocument/2006/customXml" ds:itemID="{1CD39011-2B34-4226-8638-59B13D86301D}">
   <ds:schemaRefs>
     <ds:schemaRef ds:uri="http://schemas.microsoft.com/office/2006/metadata/contentType"/>
@@ -6365,24 +6903,6 @@
 </ds:datastoreItem>
 </file>
 
-<file path=customXml/itemProps2.xml><?xml version="1.0" encoding="utf-8"?>
-<ds:datastoreItem xmlns:ds="http://schemas.openxmlformats.org/officeDocument/2006/customXml" ds:itemID="{AD64260C-1345-4C21-A804-B9FBE7B91489}">
-  <ds:schemaRefs>
-    <ds:schemaRef ds:uri="http://schemas.microsoft.com/sharepoint/v3/contenttype/forms"/>
-  </ds:schemaRefs>
-</ds:datastoreItem>
-</file>
-
-<file path=customXml/itemProps3.xml><?xml version="1.0" encoding="utf-8"?>
-<ds:datastoreItem xmlns:ds="http://schemas.openxmlformats.org/officeDocument/2006/customXml" ds:itemID="{D51EB97A-8C7A-4EE1-A3AD-E57FDBFA6BEE}">
-  <ds:schemaRefs>
-    <ds:schemaRef ds:uri="http://schemas.microsoft.com/office/2006/metadata/properties"/>
-    <ds:schemaRef ds:uri="http://schemas.microsoft.com/office/infopath/2007/PartnerControls"/>
-    <ds:schemaRef ds:uri="b16a9495-4dfd-42d3-807b-98cb11f03b43"/>
-  </ds:schemaRefs>
-</ds:datastoreItem>
-</file>
-
 <file path=customXml/itemProps4.xml><?xml version="1.0" encoding="utf-8"?>
 <ds:datastoreItem xmlns:ds="http://schemas.openxmlformats.org/officeDocument/2006/customXml" ds:itemID="{11111111-1234-1234-1234-123412341234}">
   <ds:schemaRefs>
@@ -6393,7 +6913,7 @@
 </file>
 
 <file path=customXml/itemProps5.xml><?xml version="1.0" encoding="utf-8"?>
-<ds:datastoreItem xmlns:ds="http://schemas.openxmlformats.org/officeDocument/2006/customXml" ds:itemID="{FD098F56-5BE6-4AB8-A8E5-F91629659B68}">
+<ds:datastoreItem xmlns:ds="http://schemas.openxmlformats.org/officeDocument/2006/customXml" ds:itemID="{E86E47D7-63E5-435F-8C63-D56329295075}">
   <ds:schemaRefs>
     <ds:schemaRef ds:uri="http://schemas.openxmlformats.org/officeDocument/2006/bibliography"/>
   </ds:schemaRefs>

</xml_diff>

<commit_message>
Deliverables + Timeline done
</commit_message>
<xml_diff>
--- a/CA 1 – Capstone Project Proposal.docx
+++ b/CA 1 – Capstone Project Proposal.docx
@@ -1183,8 +1183,6 @@
         <w:lastRenderedPageBreak/>
         <w:t>Contents</w:t>
       </w:r>
-      <w:bookmarkStart w:id="0" w:name="_GoBack"/>
-      <w:bookmarkEnd w:id="0"/>
     </w:p>
     <w:sdt>
       <w:sdtPr>
@@ -1217,7 +1215,7 @@
           <w:r>
             <w:fldChar w:fldCharType="separate"/>
           </w:r>
-          <w:hyperlink w:anchor="_Toc243330375" w:history="1">
+          <w:hyperlink w:anchor="_Toc243421292" w:history="1">
             <w:r>
               <w:rPr>
                 <w:rStyle w:val="Hyperlink"/>
@@ -1244,7 +1242,7 @@
                 <w:noProof/>
                 <w:webHidden/>
               </w:rPr>
-              <w:instrText xml:space="preserve"> PAGEREF _Toc243330375 \h </w:instrText>
+              <w:instrText xml:space="preserve"> PAGEREF _Toc243421292 \h </w:instrText>
             </w:r>
             <w:r>
               <w:rPr>
@@ -1287,7 +1285,7 @@
               <w:sz w:val="22"/>
             </w:rPr>
           </w:pPr>
-          <w:hyperlink w:anchor="_Toc243330376" w:history="1">
+          <w:hyperlink w:anchor="_Toc243421293" w:history="1">
             <w:r>
               <w:rPr>
                 <w:rStyle w:val="Hyperlink"/>
@@ -1314,7 +1312,7 @@
                 <w:noProof/>
                 <w:webHidden/>
               </w:rPr>
-              <w:instrText xml:space="preserve"> PAGEREF _Toc243330376 \h </w:instrText>
+              <w:instrText xml:space="preserve"> PAGEREF _Toc243421293 \h </w:instrText>
             </w:r>
             <w:r>
               <w:rPr>
@@ -1357,7 +1355,7 @@
               <w:sz w:val="22"/>
             </w:rPr>
           </w:pPr>
-          <w:hyperlink w:anchor="_Toc243330377" w:history="1">
+          <w:hyperlink w:anchor="_Toc243421294" w:history="1">
             <w:r>
               <w:rPr>
                 <w:rStyle w:val="Hyperlink"/>
@@ -1384,7 +1382,7 @@
                 <w:noProof/>
                 <w:webHidden/>
               </w:rPr>
-              <w:instrText xml:space="preserve"> PAGEREF _Toc243330377 \h </w:instrText>
+              <w:instrText xml:space="preserve"> PAGEREF _Toc243421294 \h </w:instrText>
             </w:r>
             <w:r>
               <w:rPr>
@@ -1427,7 +1425,7 @@
               <w:sz w:val="22"/>
             </w:rPr>
           </w:pPr>
-          <w:hyperlink w:anchor="_Toc243330378" w:history="1">
+          <w:hyperlink w:anchor="_Toc243421295" w:history="1">
             <w:r>
               <w:rPr>
                 <w:rStyle w:val="Hyperlink"/>
@@ -1454,7 +1452,7 @@
                 <w:noProof/>
                 <w:webHidden/>
               </w:rPr>
-              <w:instrText xml:space="preserve"> PAGEREF _Toc243330378 \h </w:instrText>
+              <w:instrText xml:space="preserve"> PAGEREF _Toc243421295 \h </w:instrText>
             </w:r>
             <w:r>
               <w:rPr>
@@ -1497,7 +1495,7 @@
               <w:sz w:val="22"/>
             </w:rPr>
           </w:pPr>
-          <w:hyperlink w:anchor="_Toc243330379" w:history="1">
+          <w:hyperlink w:anchor="_Toc243421296" w:history="1">
             <w:r>
               <w:rPr>
                 <w:rStyle w:val="Hyperlink"/>
@@ -1525,7 +1523,7 @@
                 <w:noProof/>
                 <w:webHidden/>
               </w:rPr>
-              <w:instrText xml:space="preserve"> PAGEREF _Toc243330379 \h </w:instrText>
+              <w:instrText xml:space="preserve"> PAGEREF _Toc243421296 \h </w:instrText>
             </w:r>
             <w:r>
               <w:rPr>
@@ -1568,7 +1566,7 @@
               <w:sz w:val="22"/>
             </w:rPr>
           </w:pPr>
-          <w:hyperlink w:anchor="_Toc243330380" w:history="1">
+          <w:hyperlink w:anchor="_Toc243421297" w:history="1">
             <w:r>
               <w:rPr>
                 <w:rStyle w:val="Hyperlink"/>
@@ -1596,7 +1594,7 @@
                 <w:noProof/>
                 <w:webHidden/>
               </w:rPr>
-              <w:instrText xml:space="preserve"> PAGEREF _Toc243330380 \h </w:instrText>
+              <w:instrText xml:space="preserve"> PAGEREF _Toc243421297 \h </w:instrText>
             </w:r>
             <w:r>
               <w:rPr>
@@ -1639,7 +1637,7 @@
               <w:sz w:val="22"/>
             </w:rPr>
           </w:pPr>
-          <w:hyperlink w:anchor="_Toc243330381" w:history="1">
+          <w:hyperlink w:anchor="_Toc243421298" w:history="1">
             <w:r>
               <w:rPr>
                 <w:rStyle w:val="Hyperlink"/>
@@ -1666,7 +1664,7 @@
                 <w:noProof/>
                 <w:webHidden/>
               </w:rPr>
-              <w:instrText xml:space="preserve"> PAGEREF _Toc243330381 \h </w:instrText>
+              <w:instrText xml:space="preserve"> PAGEREF _Toc243421298 \h </w:instrText>
             </w:r>
             <w:r>
               <w:rPr>
@@ -1709,7 +1707,7 @@
               <w:sz w:val="22"/>
             </w:rPr>
           </w:pPr>
-          <w:hyperlink w:anchor="_Toc243330382" w:history="1">
+          <w:hyperlink w:anchor="_Toc243421299" w:history="1">
             <w:r>
               <w:rPr>
                 <w:rStyle w:val="Hyperlink"/>
@@ -1736,7 +1734,7 @@
                 <w:noProof/>
                 <w:webHidden/>
               </w:rPr>
-              <w:instrText xml:space="preserve"> PAGEREF _Toc243330382 \h </w:instrText>
+              <w:instrText xml:space="preserve"> PAGEREF _Toc243421299 \h </w:instrText>
             </w:r>
             <w:r>
               <w:rPr>
@@ -1779,7 +1777,7 @@
               <w:sz w:val="22"/>
             </w:rPr>
           </w:pPr>
-          <w:hyperlink w:anchor="_Toc243330383" w:history="1">
+          <w:hyperlink w:anchor="_Toc243421300" w:history="1">
             <w:r>
               <w:rPr>
                 <w:rStyle w:val="Hyperlink"/>
@@ -1806,7 +1804,7 @@
                 <w:noProof/>
                 <w:webHidden/>
               </w:rPr>
-              <w:instrText xml:space="preserve"> PAGEREF _Toc243330383 \h </w:instrText>
+              <w:instrText xml:space="preserve"> PAGEREF _Toc243421300 \h </w:instrText>
             </w:r>
             <w:r>
               <w:rPr>
@@ -1849,7 +1847,7 @@
               <w:sz w:val="22"/>
             </w:rPr>
           </w:pPr>
-          <w:hyperlink w:anchor="_Toc243330384" w:history="1">
+          <w:hyperlink w:anchor="_Toc243421301" w:history="1">
             <w:r>
               <w:rPr>
                 <w:rStyle w:val="Hyperlink"/>
@@ -1876,7 +1874,7 @@
                 <w:noProof/>
                 <w:webHidden/>
               </w:rPr>
-              <w:instrText xml:space="preserve"> PAGEREF _Toc243330384 \h </w:instrText>
+              <w:instrText xml:space="preserve"> PAGEREF _Toc243421301 \h </w:instrText>
             </w:r>
             <w:r>
               <w:rPr>
@@ -1919,7 +1917,7 @@
               <w:sz w:val="22"/>
             </w:rPr>
           </w:pPr>
-          <w:hyperlink w:anchor="_Toc243330385" w:history="1">
+          <w:hyperlink w:anchor="_Toc243421302" w:history="1">
             <w:r>
               <w:rPr>
                 <w:rStyle w:val="Hyperlink"/>
@@ -1946,7 +1944,7 @@
                 <w:noProof/>
                 <w:webHidden/>
               </w:rPr>
-              <w:instrText xml:space="preserve"> PAGEREF _Toc243330385 \h </w:instrText>
+              <w:instrText xml:space="preserve"> PAGEREF _Toc243421302 \h </w:instrText>
             </w:r>
             <w:r>
               <w:rPr>
@@ -1989,7 +1987,7 @@
               <w:sz w:val="22"/>
             </w:rPr>
           </w:pPr>
-          <w:hyperlink w:anchor="_Toc243330386" w:history="1">
+          <w:hyperlink w:anchor="_Toc243421303" w:history="1">
             <w:r>
               <w:rPr>
                 <w:rStyle w:val="Hyperlink"/>
@@ -2016,7 +2014,7 @@
                 <w:noProof/>
                 <w:webHidden/>
               </w:rPr>
-              <w:instrText xml:space="preserve"> PAGEREF _Toc243330386 \h </w:instrText>
+              <w:instrText xml:space="preserve"> PAGEREF _Toc243421303 \h </w:instrText>
             </w:r>
             <w:r>
               <w:rPr>
@@ -2059,7 +2057,7 @@
               <w:sz w:val="22"/>
             </w:rPr>
           </w:pPr>
-          <w:hyperlink w:anchor="_Toc243330387" w:history="1">
+          <w:hyperlink w:anchor="_Toc243421304" w:history="1">
             <w:r>
               <w:rPr>
                 <w:rStyle w:val="Hyperlink"/>
@@ -2086,7 +2084,7 @@
                 <w:noProof/>
                 <w:webHidden/>
               </w:rPr>
-              <w:instrText xml:space="preserve"> PAGEREF _Toc243330387 \h </w:instrText>
+              <w:instrText xml:space="preserve"> PAGEREF _Toc243421304 \h </w:instrText>
             </w:r>
             <w:r>
               <w:rPr>
@@ -2129,7 +2127,7 @@
               <w:sz w:val="22"/>
             </w:rPr>
           </w:pPr>
-          <w:hyperlink w:anchor="_Toc243330388" w:history="1">
+          <w:hyperlink w:anchor="_Toc243421305" w:history="1">
             <w:r>
               <w:rPr>
                 <w:rStyle w:val="Hyperlink"/>
@@ -2156,7 +2154,7 @@
                 <w:noProof/>
                 <w:webHidden/>
               </w:rPr>
-              <w:instrText xml:space="preserve"> PAGEREF _Toc243330388 \h </w:instrText>
+              <w:instrText xml:space="preserve"> PAGEREF _Toc243421305 \h </w:instrText>
             </w:r>
             <w:r>
               <w:rPr>
@@ -2199,7 +2197,7 @@
               <w:sz w:val="22"/>
             </w:rPr>
           </w:pPr>
-          <w:hyperlink w:anchor="_Toc243330389" w:history="1">
+          <w:hyperlink w:anchor="_Toc243421306" w:history="1">
             <w:r>
               <w:rPr>
                 <w:rStyle w:val="Hyperlink"/>
@@ -2226,7 +2224,7 @@
                 <w:noProof/>
                 <w:webHidden/>
               </w:rPr>
-              <w:instrText xml:space="preserve"> PAGEREF _Toc243330389 \h </w:instrText>
+              <w:instrText xml:space="preserve"> PAGEREF _Toc243421306 \h </w:instrText>
             </w:r>
             <w:r>
               <w:rPr>
@@ -2246,7 +2244,7 @@
                 <w:noProof/>
                 <w:webHidden/>
               </w:rPr>
-              <w:t>4</w:t>
+              <w:t>5</w:t>
             </w:r>
             <w:r>
               <w:rPr>
@@ -2269,7 +2267,7 @@
               <w:sz w:val="22"/>
             </w:rPr>
           </w:pPr>
-          <w:hyperlink w:anchor="_Toc243330390" w:history="1">
+          <w:hyperlink w:anchor="_Toc243421307" w:history="1">
             <w:r>
               <w:rPr>
                 <w:rStyle w:val="Hyperlink"/>
@@ -2296,7 +2294,7 @@
                 <w:noProof/>
                 <w:webHidden/>
               </w:rPr>
-              <w:instrText xml:space="preserve"> PAGEREF _Toc243330390 \h </w:instrText>
+              <w:instrText xml:space="preserve"> PAGEREF _Toc243421307 \h </w:instrText>
             </w:r>
             <w:r>
               <w:rPr>
@@ -2316,7 +2314,7 @@
                 <w:noProof/>
                 <w:webHidden/>
               </w:rPr>
-              <w:t>4</w:t>
+              <w:t>5</w:t>
             </w:r>
             <w:r>
               <w:rPr>
@@ -2339,7 +2337,7 @@
               <w:sz w:val="22"/>
             </w:rPr>
           </w:pPr>
-          <w:hyperlink w:anchor="_Toc243330391" w:history="1">
+          <w:hyperlink w:anchor="_Toc243421308" w:history="1">
             <w:r>
               <w:rPr>
                 <w:rStyle w:val="Hyperlink"/>
@@ -2366,7 +2364,7 @@
                 <w:noProof/>
                 <w:webHidden/>
               </w:rPr>
-              <w:instrText xml:space="preserve"> PAGEREF _Toc243330391 \h </w:instrText>
+              <w:instrText xml:space="preserve"> PAGEREF _Toc243421308 \h </w:instrText>
             </w:r>
             <w:r>
               <w:rPr>
@@ -2386,7 +2384,7 @@
                 <w:noProof/>
                 <w:webHidden/>
               </w:rPr>
-              <w:t>5</w:t>
+              <w:t>6</w:t>
             </w:r>
             <w:r>
               <w:rPr>
@@ -2409,7 +2407,7 @@
               <w:sz w:val="22"/>
             </w:rPr>
           </w:pPr>
-          <w:hyperlink w:anchor="_Toc243330392" w:history="1">
+          <w:hyperlink w:anchor="_Toc243421309" w:history="1">
             <w:r>
               <w:rPr>
                 <w:rStyle w:val="Hyperlink"/>
@@ -2436,7 +2434,7 @@
                 <w:noProof/>
                 <w:webHidden/>
               </w:rPr>
-              <w:instrText xml:space="preserve"> PAGEREF _Toc243330392 \h </w:instrText>
+              <w:instrText xml:space="preserve"> PAGEREF _Toc243421309 \h </w:instrText>
             </w:r>
             <w:r>
               <w:rPr>
@@ -2456,7 +2454,7 @@
                 <w:noProof/>
                 <w:webHidden/>
               </w:rPr>
-              <w:t>6</w:t>
+              <w:t>7</w:t>
             </w:r>
             <w:r>
               <w:rPr>
@@ -2490,29 +2488,29 @@
         <w:pStyle w:val="Heading1"/>
         <w:spacing w:after="0"/>
       </w:pPr>
-      <w:bookmarkStart w:id="1" w:name="_Toc243330375"/>
+      <w:bookmarkStart w:id="0" w:name="_Toc243421292"/>
       <w:r>
         <w:lastRenderedPageBreak/>
         <w:t>1. Project Title</w:t>
       </w:r>
+      <w:bookmarkEnd w:id="0"/>
+    </w:p>
+    <w:p>
+      <w:r>
+        <w:t>To be defined.</w:t>
+      </w:r>
+    </w:p>
+    <w:p>
+      <w:pPr>
+        <w:pStyle w:val="Heading1"/>
+      </w:pPr>
+      <w:bookmarkStart w:id="1" w:name="_Toc243421293"/>
+      <w:r>
+        <w:t>2. Introduction</w:t>
+      </w:r>
       <w:bookmarkEnd w:id="1"/>
     </w:p>
     <w:p>
-      <w:r>
-        <w:t>To be defined.</w:t>
-      </w:r>
-    </w:p>
-    <w:p>
-      <w:pPr>
-        <w:pStyle w:val="Heading1"/>
-      </w:pPr>
-      <w:bookmarkStart w:id="2" w:name="_Toc243330376"/>
-      <w:r>
-        <w:t>2. Introduction</w:t>
-      </w:r>
-      <w:bookmarkEnd w:id="2"/>
-    </w:p>
-    <w:p>
       <w:pPr>
         <w:ind w:firstLine="720"/>
         <w:rPr>
@@ -2636,7 +2634,19 @@
         <w:rPr>
           <w:lang w:eastAsia="en-GB"/>
         </w:rPr>
-        <w:t>With this volume of notices, monitoring and assessing opportunities is a demanding task, particularly for smaller suppliers with limited staff and time.</w:t>
+        <w:t xml:space="preserve">With this volume of notices, monitoring and assessing opportunities is a demanding task, </w:t>
+      </w:r>
+      <w:r>
+        <w:rPr>
+          <w:lang w:eastAsia="en-GB"/>
+        </w:rPr>
+        <w:t xml:space="preserve">especially </w:t>
+      </w:r>
+      <w:r>
+        <w:rPr>
+          <w:lang w:eastAsia="en-GB"/>
+        </w:rPr>
+        <w:t>for smaller suppliers with limited staff and time.</w:t>
       </w:r>
     </w:p>
     <w:p>
@@ -2876,7 +2886,19 @@
         <w:rPr>
           <w:lang w:eastAsia="en-GB"/>
         </w:rPr>
-        <w:t xml:space="preserve">Competition is another important aspect of public procurement. The number of bids received is commonly used as a measure of competition in a tender </w:t>
+        <w:t xml:space="preserve">Competition is </w:t>
+      </w:r>
+      <w:r>
+        <w:rPr>
+          <w:lang w:eastAsia="en-GB"/>
+        </w:rPr>
+        <w:t>also an</w:t>
+      </w:r>
+      <w:r>
+        <w:rPr>
+          <w:lang w:eastAsia="en-GB"/>
+        </w:rPr>
+        <w:t xml:space="preserve"> important aspect of public procurement. The number of bids received is commonly used as a measure of competition in a tender </w:t>
       </w:r>
       <w:r>
         <w:rPr>
@@ -3262,12 +3284,12 @@
       <w:pPr>
         <w:pStyle w:val="Heading1"/>
       </w:pPr>
-      <w:bookmarkStart w:id="3" w:name="_Toc243330377"/>
+      <w:bookmarkStart w:id="2" w:name="_Toc243421294"/>
       <w:r>
         <w:lastRenderedPageBreak/>
         <w:t>3. Problem Definition</w:t>
       </w:r>
-      <w:bookmarkEnd w:id="3"/>
+      <w:bookmarkEnd w:id="2"/>
     </w:p>
     <w:p>
       <w:pPr>
@@ -3398,64 +3420,64 @@
       <w:pPr>
         <w:pStyle w:val="Heading1"/>
       </w:pPr>
-      <w:bookmarkStart w:id="4" w:name="_Toc243330378"/>
+      <w:bookmarkStart w:id="3" w:name="_Toc243421295"/>
       <w:r>
         <w:t>4. Aim and Objectives</w:t>
       </w:r>
+      <w:bookmarkEnd w:id="3"/>
+    </w:p>
+    <w:p>
+      <w:pPr>
+        <w:pStyle w:val="Heading2"/>
+        <w:rPr>
+          <w:lang w:eastAsia="en-GB"/>
+        </w:rPr>
+      </w:pPr>
+      <w:bookmarkStart w:id="4" w:name="_Toc243421296"/>
+      <w:r>
+        <w:rPr>
+          <w:lang w:eastAsia="en-GB"/>
+        </w:rPr>
+        <w:t>4. 1 Aim</w:t>
+      </w:r>
       <w:bookmarkEnd w:id="4"/>
     </w:p>
     <w:p>
       <w:pPr>
+        <w:ind w:firstLine="720"/>
+        <w:rPr>
+          <w:lang w:eastAsia="en-GB"/>
+        </w:rPr>
+      </w:pPr>
+      <w:r>
+        <w:rPr>
+          <w:lang w:eastAsia="en-GB"/>
+        </w:rPr>
+        <w:t>The overall aim of this project is to investigate whether historical public procurement data can be used to predict the likely level of competition for a newly published public tender and how these predictions could support suppliers when screening opportunities.</w:t>
+      </w:r>
+    </w:p>
+    <w:p>
+      <w:pPr>
+        <w:rPr>
+          <w:lang w:eastAsia="en-GB"/>
+        </w:rPr>
+      </w:pPr>
+    </w:p>
+    <w:p>
+      <w:pPr>
         <w:pStyle w:val="Heading2"/>
         <w:rPr>
           <w:lang w:eastAsia="en-GB"/>
         </w:rPr>
       </w:pPr>
-      <w:bookmarkStart w:id="5" w:name="_Toc243330379"/>
-      <w:r>
-        <w:rPr>
-          <w:lang w:eastAsia="en-GB"/>
-        </w:rPr>
-        <w:t>4. 1 Aim</w:t>
+      <w:bookmarkStart w:id="5" w:name="_Toc243421297"/>
+      <w:r>
+        <w:rPr>
+          <w:lang w:eastAsia="en-GB"/>
+        </w:rPr>
+        <w:t>4.2 Objectives</w:t>
       </w:r>
       <w:bookmarkEnd w:id="5"/>
-    </w:p>
-    <w:p>
-      <w:pPr>
-        <w:ind w:firstLine="720"/>
-        <w:rPr>
-          <w:lang w:eastAsia="en-GB"/>
-        </w:rPr>
-      </w:pPr>
-      <w:r>
-        <w:rPr>
-          <w:lang w:eastAsia="en-GB"/>
-        </w:rPr>
-        <w:t>The overall aim of this project is to investigate whether historical public procurement data can be used to predict the likely level of competition for a newly published public tender and how these predictions could support suppliers when screening opportunities.</w:t>
-      </w:r>
-    </w:p>
-    <w:p>
-      <w:pPr>
-        <w:rPr>
-          <w:lang w:eastAsia="en-GB"/>
-        </w:rPr>
-      </w:pPr>
-    </w:p>
-    <w:p>
-      <w:pPr>
-        <w:pStyle w:val="Heading2"/>
-        <w:rPr>
-          <w:lang w:eastAsia="en-GB"/>
-        </w:rPr>
-      </w:pPr>
-      <w:bookmarkStart w:id="6" w:name="_Toc243330380"/>
-      <w:r>
-        <w:rPr>
-          <w:lang w:eastAsia="en-GB"/>
-        </w:rPr>
-        <w:t>4.2 Objectives</w:t>
-      </w:r>
-      <w:bookmarkEnd w:id="6"/>
     </w:p>
     <w:p>
       <w:pPr>
@@ -3518,189 +3540,189 @@
       <w:pPr>
         <w:pStyle w:val="Heading1"/>
       </w:pPr>
-      <w:bookmarkStart w:id="7" w:name="_Toc243330381"/>
+      <w:bookmarkStart w:id="6" w:name="_Toc243421298"/>
       <w:r>
         <w:t>5. Scope</w:t>
       </w:r>
+      <w:bookmarkEnd w:id="6"/>
+    </w:p>
+    <w:p>
+      <w:pPr>
+        <w:ind w:firstLine="720"/>
+        <w:rPr>
+          <w:lang w:eastAsia="en-GB"/>
+        </w:rPr>
+      </w:pPr>
+      <w:r>
+        <w:rPr>
+          <w:lang w:eastAsia="en-GB"/>
+        </w:rPr>
+        <w:t>The project will analyse the public procurement dataset published by the Office of Government Procurement, using tender publication records with a known number of bids received. It will include data preparation and exploratory data analysis, and the development and comparison of machine learning classification models to predict the likely level of competition. The models will be evaluated and the usefulness of the predictions for supplier tender screening will be discussed.</w:t>
+      </w:r>
+    </w:p>
+    <w:p>
+      <w:pPr>
+        <w:ind w:firstLine="720"/>
+        <w:rPr>
+          <w:b/>
+          <w:lang w:eastAsia="en-GB"/>
+        </w:rPr>
+      </w:pPr>
+      <w:r>
+        <w:rPr>
+          <w:lang w:eastAsia="en-GB"/>
+        </w:rPr>
+        <w:t>The project will not develop a fully operational commercial application, predict whether a supplier will win a tender, or measure the actual impact of the predictions on suppliers’ bidding decisions or success rates.</w:t>
+      </w:r>
+    </w:p>
+    <w:p>
+      <w:pPr>
+        <w:pStyle w:val="Heading1"/>
+      </w:pPr>
+      <w:bookmarkStart w:id="7" w:name="_Toc243421299"/>
+      <w:r>
+        <w:t>6. Methodology</w:t>
+      </w:r>
       <w:bookmarkEnd w:id="7"/>
     </w:p>
     <w:p>
       <w:pPr>
+        <w:pStyle w:val="Heading2"/>
+      </w:pPr>
+      <w:bookmarkStart w:id="8" w:name="_Toc243421300"/>
+      <w:r>
+        <w:t>6.1 Data Collection and Preparation</w:t>
+      </w:r>
+      <w:bookmarkEnd w:id="8"/>
+    </w:p>
+    <w:p>
+      <w:pPr>
         <w:ind w:firstLine="720"/>
-        <w:rPr>
-          <w:lang w:eastAsia="en-GB"/>
-        </w:rPr>
-      </w:pPr>
-      <w:r>
-        <w:rPr>
-          <w:lang w:eastAsia="en-GB"/>
-        </w:rPr>
-        <w:t>The project will analyse the public procurement dataset published by the Office of Government Procurement, using tender publication records with a known number of bids received. It will include data preparation and exploratory data analysis, and the development and comparison of machine learning classification models to predict the likely level of competition. The models will be evaluated and the usefulness of the predictions for supplier tender screening will be discussed.</w:t>
-      </w:r>
+      </w:pPr>
+      <w:r>
+        <w:t>The project will use historical Irish public procurement data published by the Office of Government Procurement</w:t>
+      </w:r>
+      <w:r>
+        <w:t xml:space="preserve">. </w:t>
+      </w:r>
+      <w:r>
+        <w:t>Python</w:t>
+      </w:r>
+      <w:r>
+        <w:t xml:space="preserve"> and</w:t>
+      </w:r>
+      <w:r>
+        <w:t xml:space="preserve"> the Pandas library</w:t>
+      </w:r>
+      <w:r>
+        <w:t xml:space="preserve"> </w:t>
+      </w:r>
+      <w:r>
+        <w:t xml:space="preserve">will be used to load, clean and prepare the dataset, including handling missing values and outliers, checking for inconsistencies, and selecting appropriate </w:t>
+      </w:r>
+      <w:r>
+        <w:t>features</w:t>
+      </w:r>
+      <w:r>
+        <w:t>. Exploratory data analysis will be conducted using descriptive statistics and visualisations created with Pandas, Matplotlib and Seaborn to understand the distribution of bid counts</w:t>
+      </w:r>
+      <w:r>
+        <w:t xml:space="preserve"> and </w:t>
+      </w:r>
+      <w:r>
+        <w:t>the characteristics of the tenders</w:t>
+      </w:r>
+      <w:r>
+        <w:t xml:space="preserve">. </w:t>
+      </w:r>
+      <w:r>
+        <w:t>The target variable will be defined by categorising the number of bids received into two classes representing low and high competition</w:t>
+      </w:r>
+      <w:r>
+        <w:t xml:space="preserve">. </w:t>
+      </w:r>
+      <w:r>
+        <w:t>The distribution of these classes will be examined to assess whether class imbalance is present.</w:t>
+      </w:r>
+    </w:p>
+    <w:p/>
+    <w:p>
+      <w:pPr>
+        <w:pStyle w:val="Heading2"/>
+      </w:pPr>
+      <w:bookmarkStart w:id="9" w:name="_Toc243421301"/>
+      <w:r>
+        <w:t>6.2 Predictive Modelling</w:t>
+      </w:r>
+      <w:bookmarkEnd w:id="9"/>
     </w:p>
     <w:p>
       <w:pPr>
         <w:ind w:firstLine="720"/>
-        <w:rPr>
-          <w:b/>
-          <w:lang w:eastAsia="en-GB"/>
-        </w:rPr>
-      </w:pPr>
-      <w:r>
-        <w:rPr>
-          <w:lang w:eastAsia="en-GB"/>
-        </w:rPr>
-        <w:t>The project will not develop a fully operational commercial application, predict whether a supplier will win a tender, or measure the actual impact of the predictions on suppliers’ bidding decisions or success rates.</w:t>
-      </w:r>
-    </w:p>
-    <w:p>
-      <w:pPr>
-        <w:pStyle w:val="Heading1"/>
-      </w:pPr>
-      <w:bookmarkStart w:id="8" w:name="_Toc243330382"/>
-      <w:r>
-        <w:t>6. Methodology</w:t>
-      </w:r>
-      <w:bookmarkEnd w:id="8"/>
+      </w:pPr>
+      <w:r>
+        <w:t>Python will be used to develop two classification models</w:t>
+      </w:r>
+      <w:r>
+        <w:t>. The proposed algorithms are</w:t>
+      </w:r>
+      <w:r>
+        <w:t xml:space="preserve"> Logistic Regression</w:t>
+      </w:r>
+      <w:r>
+        <w:t xml:space="preserve"> </w:t>
+      </w:r>
+      <w:r>
+        <w:t>and Decision Tree. These models were selected to compare different approaches to predicting whether a tender is likely to attract low or high competition</w:t>
+      </w:r>
+      <w:r>
+        <w:t xml:space="preserve">. </w:t>
+      </w:r>
+      <w:r>
+        <w:t xml:space="preserve">Another classification model such as </w:t>
+      </w:r>
+      <w:r>
+        <w:t>Random</w:t>
+      </w:r>
+      <w:r>
+        <w:t xml:space="preserve"> Forest may also be included if time allows to compare its results with the other models</w:t>
+      </w:r>
+      <w:r>
+        <w:t>. The dataset will be divided into training and testing sets</w:t>
+      </w:r>
+      <w:r>
+        <w:t xml:space="preserve"> </w:t>
+      </w:r>
+      <w:r>
+        <w:t>models</w:t>
+      </w:r>
+      <w:r>
+        <w:t xml:space="preserve"> so that they</w:t>
+      </w:r>
+      <w:r>
+        <w:t xml:space="preserve"> can be trained and then tested on data they have not seen before</w:t>
+      </w:r>
+      <w:r>
+        <w:t xml:space="preserve">. </w:t>
+      </w:r>
+      <w:r>
+        <w:t>Cross-validation will be used to help assess model performance and compare the models.</w:t>
+      </w:r>
+    </w:p>
+    <w:p>
+      <w:pPr>
+        <w:ind w:firstLine="720"/>
+      </w:pPr>
     </w:p>
     <w:p>
       <w:pPr>
         <w:pStyle w:val="Heading2"/>
       </w:pPr>
-      <w:bookmarkStart w:id="9" w:name="_Toc243330383"/>
-      <w:r>
-        <w:t>6.1 Data Collection and Preparation</w:t>
-      </w:r>
-      <w:bookmarkEnd w:id="9"/>
-    </w:p>
-    <w:p>
-      <w:pPr>
-        <w:ind w:firstLine="720"/>
-      </w:pPr>
-      <w:r>
-        <w:t>The project will use historical Irish public procurement data published by the Office of Government Procurement</w:t>
-      </w:r>
-      <w:r>
-        <w:t xml:space="preserve">. </w:t>
-      </w:r>
-      <w:r>
-        <w:t>Python</w:t>
-      </w:r>
-      <w:r>
-        <w:t xml:space="preserve"> and</w:t>
-      </w:r>
-      <w:r>
-        <w:t xml:space="preserve"> the Pandas library</w:t>
-      </w:r>
-      <w:r>
-        <w:t xml:space="preserve"> </w:t>
-      </w:r>
-      <w:r>
-        <w:t xml:space="preserve">will be used to load, clean and prepare the dataset, including handling missing values and outliers, checking for inconsistencies, and selecting appropriate </w:t>
-      </w:r>
-      <w:r>
-        <w:t>features</w:t>
-      </w:r>
-      <w:r>
-        <w:t>. Exploratory data analysis will be conducted using descriptive statistics and visualisations created with Pandas, Matplotlib and Seaborn to understand the distribution of bid counts</w:t>
-      </w:r>
-      <w:r>
-        <w:t xml:space="preserve"> and </w:t>
-      </w:r>
-      <w:r>
-        <w:t>the characteristics of the tenders</w:t>
-      </w:r>
-      <w:r>
-        <w:t xml:space="preserve">. </w:t>
-      </w:r>
-      <w:r>
-        <w:t>The target variable will be defined by categorising the number of bids received into two classes representing low and high competition</w:t>
-      </w:r>
-      <w:r>
-        <w:t xml:space="preserve">. </w:t>
-      </w:r>
-      <w:r>
-        <w:t>The distribution of these classes will be examined to assess whether class imbalance is present.</w:t>
-      </w:r>
-    </w:p>
-    <w:p/>
-    <w:p>
-      <w:pPr>
-        <w:pStyle w:val="Heading2"/>
-      </w:pPr>
-      <w:bookmarkStart w:id="10" w:name="_Toc243330384"/>
-      <w:r>
-        <w:t>6.2 Predictive Modelling</w:t>
+      <w:bookmarkStart w:id="10" w:name="_Toc243421302"/>
+      <w:r>
+        <w:t>6.3 Model Evaluation</w:t>
       </w:r>
       <w:bookmarkEnd w:id="10"/>
-    </w:p>
-    <w:p>
-      <w:pPr>
-        <w:ind w:firstLine="720"/>
-      </w:pPr>
-      <w:r>
-        <w:t>Python will be used to develop two classification models</w:t>
-      </w:r>
-      <w:r>
-        <w:t>. The proposed algorithms are</w:t>
-      </w:r>
-      <w:r>
-        <w:t xml:space="preserve"> Logistic Regression</w:t>
-      </w:r>
-      <w:r>
-        <w:t xml:space="preserve"> </w:t>
-      </w:r>
-      <w:r>
-        <w:t>and Decision Tree. These models were selected to compare different approaches to predicting whether a tender is likely to attract low or high competition</w:t>
-      </w:r>
-      <w:r>
-        <w:t xml:space="preserve">. </w:t>
-      </w:r>
-      <w:r>
-        <w:t xml:space="preserve">Another classification model such as </w:t>
-      </w:r>
-      <w:r>
-        <w:t>Random</w:t>
-      </w:r>
-      <w:r>
-        <w:t xml:space="preserve"> Forest may also be included if time allows to compare its results with the other models</w:t>
-      </w:r>
-      <w:r>
-        <w:t>. The dataset will be divided into training and testing sets</w:t>
-      </w:r>
-      <w:r>
-        <w:t xml:space="preserve"> </w:t>
-      </w:r>
-      <w:r>
-        <w:t>models</w:t>
-      </w:r>
-      <w:r>
-        <w:t xml:space="preserve"> so that they</w:t>
-      </w:r>
-      <w:r>
-        <w:t xml:space="preserve"> can be trained and then tested on data they have not seen before</w:t>
-      </w:r>
-      <w:r>
-        <w:t xml:space="preserve">. </w:t>
-      </w:r>
-      <w:r>
-        <w:t>Cross-validation will be used to help assess model performance and compare the models.</w:t>
-      </w:r>
-    </w:p>
-    <w:p>
-      <w:pPr>
-        <w:ind w:firstLine="720"/>
-      </w:pPr>
-    </w:p>
-    <w:p>
-      <w:pPr>
-        <w:pStyle w:val="Heading2"/>
-      </w:pPr>
-      <w:bookmarkStart w:id="11" w:name="_Toc243330385"/>
-      <w:r>
-        <w:t>6.3 Model Evaluation</w:t>
-      </w:r>
-      <w:bookmarkEnd w:id="11"/>
     </w:p>
     <w:p>
       <w:pPr>
@@ -3762,11 +3784,11 @@
       <w:pPr>
         <w:pStyle w:val="Heading2"/>
       </w:pPr>
-      <w:bookmarkStart w:id="12" w:name="_Toc243330386"/>
+      <w:bookmarkStart w:id="11" w:name="_Toc243421303"/>
       <w:r>
         <w:t>6.4 Architecture Diagram</w:t>
       </w:r>
-      <w:bookmarkEnd w:id="12"/>
+      <w:bookmarkEnd w:id="11"/>
     </w:p>
     <w:p>
       <w:pPr>
@@ -3846,53 +3868,89 @@
       <w:pPr>
         <w:pStyle w:val="Heading1"/>
       </w:pPr>
-      <w:bookmarkStart w:id="13" w:name="_Toc243330387"/>
+      <w:bookmarkStart w:id="12" w:name="_Toc243421304"/>
       <w:r>
         <w:t>7. Data Sources</w:t>
       </w:r>
+      <w:bookmarkEnd w:id="12"/>
+    </w:p>
+    <w:p>
+      <w:pPr>
+        <w:ind w:firstLine="720"/>
+        <w:rPr>
+          <w:lang w:eastAsia="en-GB"/>
+        </w:rPr>
+      </w:pPr>
+      <w:r>
+        <w:rPr>
+          <w:lang w:eastAsia="en-GB"/>
+        </w:rPr>
+        <w:t>The Public Procurement Open Data dataset published by Ireland's Office of Government Procurement will be used in this project. The dataset includes records of procurement notices, contract awards, procurement procedures and related information across public sector organisations (OGP, 2026). It covers published competitions from 1 January 2013 to 30 June 2026. The file used in this project contains approximately 87,400 records and 31 variables, providing a substantial source of historical data for analysis.</w:t>
+      </w:r>
+    </w:p>
+    <w:p>
+      <w:pPr>
+        <w:ind w:firstLine="720"/>
+        <w:rPr>
+          <w:b/>
+          <w:lang w:eastAsia="en-GB"/>
+        </w:rPr>
+      </w:pPr>
+      <w:r>
+        <w:rPr>
+          <w:lang w:eastAsia="en-GB"/>
+        </w:rPr>
+        <w:t>The dataset is relevant to the business problem because it contains the number of bids received together with characteristics such as CPV code, estimated contract value and contract type that are known when a tender is published and can therefore be used as predictors. The dataset is publicly available through data.gov.ie and is licensed under the Creative Commons Attribution 4.0.</w:t>
+      </w:r>
+    </w:p>
+    <w:p>
+      <w:pPr>
+        <w:pStyle w:val="Heading1"/>
+      </w:pPr>
+      <w:bookmarkStart w:id="13" w:name="_Toc243421305"/>
+      <w:r>
+        <w:t>8. Expected Deliverables</w:t>
+      </w:r>
       <w:bookmarkEnd w:id="13"/>
     </w:p>
     <w:p>
       <w:pPr>
         <w:ind w:firstLine="720"/>
-        <w:rPr>
-          <w:lang w:eastAsia="en-GB"/>
-        </w:rPr>
-      </w:pPr>
-      <w:r>
-        <w:rPr>
-          <w:lang w:eastAsia="en-GB"/>
-        </w:rPr>
-        <w:t>The Public Procurement Open Data dataset published by Ireland's Office of Government Procurement will be used in this project. The dataset includes records of procurement notices, contract awards, procurement procedures and related information across public sector organisations (OGP, 2026). It covers published competitions from 1 January 2013 to 30 June 2026. The file used in this project contains approximately 87,400 records and 31 variables, providing a substantial source of historical data for analysis.</w:t>
+      </w:pPr>
+      <w:r>
+        <w:t>By the end of Semester 2, data preparation and exploration are expected to produce a cleaned version of the dataset, while descriptive statistics and visualisations will be used to identify patterns in tender characteristics and the distribution of bid counts. These findings will help determine the threshold used to classify tenders into low or high competition categories.</w:t>
       </w:r>
     </w:p>
     <w:p>
       <w:pPr>
         <w:ind w:firstLine="720"/>
-        <w:rPr>
-          <w:b/>
-          <w:lang w:eastAsia="en-GB"/>
-        </w:rPr>
-      </w:pPr>
-      <w:r>
-        <w:rPr>
-          <w:lang w:eastAsia="en-GB"/>
-        </w:rPr>
-        <w:t>The dataset is relevant to the business problem because it contains the number of bids received together with characteristics such as CPV code, estimated contract value and contract type that are known when a tender is published and can therefore be used as predictors. The dataset is publicly available through data.gov.ie and is licensed under the Creative Commons Attribution 4.0.</w:t>
+      </w:pPr>
+      <w:r>
+        <w:t xml:space="preserve">The two proposed classification models (Logistic Regression and Decision Tree) will be developed and evaluated using accuracy, precision, recall, F1-score and confusion matrices. Models evaluation results will be delivered as part of the project. The findings will be presented in a final project report addressing the proposed business problem. A </w:t>
+      </w:r>
+      <w:proofErr w:type="spellStart"/>
+      <w:r>
+        <w:t>Jupyter</w:t>
+      </w:r>
+      <w:proofErr w:type="spellEnd"/>
+      <w:r>
+        <w:t xml:space="preserve"> Notebook containing the Python code and the steps taken throughout data preparation, analysis and modelling will also be delivered.</w:t>
       </w:r>
     </w:p>
     <w:p>
       <w:pPr>
         <w:pStyle w:val="Heading1"/>
       </w:pPr>
-      <w:bookmarkStart w:id="14" w:name="_Toc243330388"/>
-      <w:r>
-        <w:t>8. Expected Deliverables</w:t>
+      <w:bookmarkStart w:id="14" w:name="_Toc243421306"/>
+      <w:r>
+        <w:lastRenderedPageBreak/>
+        <w:t>9. Project Timeline</w:t>
       </w:r>
       <w:bookmarkEnd w:id="14"/>
     </w:p>
     <w:p>
       <w:pPr>
+        <w:jc w:val="center"/>
         <w:rPr>
           <w:color w:val="FF0000"/>
           <w:lang w:eastAsia="en-GB"/>
@@ -3900,84 +3958,88 @@
       </w:pPr>
       <w:r>
         <w:rPr>
+          <w:noProof/>
           <w:color w:val="FF0000"/>
           <w:lang w:eastAsia="en-GB"/>
         </w:rPr>
-        <w:t>Clearly state what you expect to produce by the end of Semester 2, including the expected analytical and predictive modelling outputs and any relevant dashboard, application, system or other project deliverables.</w:t>
+        <w:drawing>
+          <wp:inline distT="0" distB="0" distL="0" distR="0" wp14:anchorId="2D514780" wp14:editId="172E29CC">
+            <wp:extent cx="5730875" cy="2451100"/>
+            <wp:effectExtent l="0" t="0" r="3175" b="6350"/>
+            <wp:docPr id="3" name="Picture 3"/>
+            <wp:cNvGraphicFramePr>
+              <a:graphicFrameLocks xmlns:a="http://schemas.openxmlformats.org/drawingml/2006/main" noChangeAspect="1"/>
+            </wp:cNvGraphicFramePr>
+            <a:graphic xmlns:a="http://schemas.openxmlformats.org/drawingml/2006/main">
+              <a:graphicData uri="http://schemas.openxmlformats.org/drawingml/2006/picture">
+                <pic:pic xmlns:pic="http://schemas.openxmlformats.org/drawingml/2006/picture">
+                  <pic:nvPicPr>
+                    <pic:cNvPr id="0" name="Picture 2"/>
+                    <pic:cNvPicPr>
+                      <a:picLocks noChangeAspect="1" noChangeArrowheads="1"/>
+                    </pic:cNvPicPr>
+                  </pic:nvPicPr>
+                  <pic:blipFill>
+                    <a:blip r:embed="rId15">
+                      <a:extLst>
+                        <a:ext uri="{28A0092B-C50C-407E-A947-70E740481C1C}">
+                          <a14:useLocalDpi xmlns:a14="http://schemas.microsoft.com/office/drawing/2010/main" val="0"/>
+                        </a:ext>
+                      </a:extLst>
+                    </a:blip>
+                    <a:srcRect/>
+                    <a:stretch>
+                      <a:fillRect/>
+                    </a:stretch>
+                  </pic:blipFill>
+                  <pic:spPr bwMode="auto">
+                    <a:xfrm>
+                      <a:off x="0" y="0"/>
+                      <a:ext cx="5730875" cy="2451100"/>
+                    </a:xfrm>
+                    <a:prstGeom prst="rect">
+                      <a:avLst/>
+                    </a:prstGeom>
+                    <a:noFill/>
+                  </pic:spPr>
+                </pic:pic>
+              </a:graphicData>
+            </a:graphic>
+          </wp:inline>
+        </w:drawing>
       </w:r>
     </w:p>
     <w:p>
       <w:pPr>
         <w:pStyle w:val="Heading1"/>
       </w:pPr>
-      <w:bookmarkStart w:id="15" w:name="_Toc243330389"/>
-      <w:r>
-        <w:t>9. Project Timeline</w:t>
+      <w:bookmarkStart w:id="15" w:name="_Toc243421307"/>
+      <w:r>
+        <w:t>10. Ethical and Legal Considerations</w:t>
       </w:r>
       <w:bookmarkEnd w:id="15"/>
     </w:p>
     <w:p>
-      <w:pPr>
+      <w:r>
         <w:rPr>
           <w:color w:val="FF0000"/>
-          <w:lang w:eastAsia="en-GB"/>
-        </w:rPr>
-      </w:pPr>
-      <w:r>
-        <w:rPr>
-          <w:color w:val="FF0000"/>
-          <w:lang w:eastAsia="en-GB"/>
-        </w:rPr>
-        <w:t xml:space="preserve">Provide a </w:t>
-      </w:r>
-      <w:r>
-        <w:rPr>
-          <w:b/>
-          <w:bCs/>
-          <w:color w:val="FF0000"/>
-          <w:lang w:eastAsia="en-GB"/>
-        </w:rPr>
-        <w:t>high-level project timeline diagram (e.g., a Gantt chart)</w:t>
-      </w:r>
-      <w:r>
-        <w:rPr>
-          <w:color w:val="FF0000"/>
-          <w:lang w:eastAsia="en-GB"/>
-        </w:rPr>
-        <w:t xml:space="preserve"> covering both semesters. Clearly show the main project phases, key activities, milestones and expected completion periods.</w:t>
+        </w:rPr>
+        <w:t>Identify relevant ethical, privacy, data protection, security and data-use considerations associated with the project. Explain how these will be appropriately addressed, including permissions for accessing and using the selected data.</w:t>
+      </w:r>
+      <w:r>
+        <w:br w:type="page"/>
       </w:r>
     </w:p>
     <w:p>
       <w:pPr>
         <w:pStyle w:val="Heading1"/>
       </w:pPr>
-      <w:bookmarkStart w:id="16" w:name="_Toc243330390"/>
-      <w:r>
-        <w:t>10. Ethical and Legal Considerations</w:t>
-      </w:r>
-      <w:bookmarkEnd w:id="16"/>
-    </w:p>
-    <w:p>
-      <w:r>
-        <w:rPr>
-          <w:color w:val="FF0000"/>
-        </w:rPr>
-        <w:t>Identify relevant ethical, privacy, data protection, security and data-use considerations associated with the project. Explain how these will be appropriately addressed, including permissions for accessing and using the selected data.</w:t>
-      </w:r>
-      <w:r>
-        <w:br w:type="page"/>
-      </w:r>
-    </w:p>
-    <w:p>
-      <w:pPr>
-        <w:pStyle w:val="Heading1"/>
-      </w:pPr>
-      <w:bookmarkStart w:id="17" w:name="_Toc243330391"/>
+      <w:bookmarkStart w:id="16" w:name="_Toc243421308"/>
       <w:r>
         <w:lastRenderedPageBreak/>
         <w:t>References</w:t>
       </w:r>
-      <w:bookmarkEnd w:id="17"/>
+      <w:bookmarkEnd w:id="16"/>
     </w:p>
     <w:p>
       <w:pPr>
@@ -4190,72 +4252,74 @@
       <w:pPr>
         <w:pStyle w:val="Heading1"/>
       </w:pPr>
-      <w:bookmarkStart w:id="18" w:name="_heading=h.kfkjs3rwl2c1" w:colFirst="0" w:colLast="0"/>
-      <w:bookmarkStart w:id="19" w:name="_Toc243330392"/>
-      <w:bookmarkEnd w:id="18"/>
+      <w:bookmarkStart w:id="17" w:name="_heading=h.kfkjs3rwl2c1" w:colFirst="0" w:colLast="0"/>
+      <w:bookmarkStart w:id="18" w:name="_Toc243421309"/>
+      <w:bookmarkEnd w:id="17"/>
       <w:r>
         <w:lastRenderedPageBreak/>
         <w:t>Appendix</w:t>
       </w:r>
+      <w:bookmarkEnd w:id="18"/>
+    </w:p>
+    <w:p/>
+    <w:p>
+      <w:pPr>
+        <w:rPr>
+          <w:color w:val="FF0000"/>
+        </w:rPr>
+      </w:pPr>
+    </w:p>
+    <w:p>
+      <w:pPr>
+        <w:rPr>
+          <w:color w:val="FF0000"/>
+        </w:rPr>
+      </w:pPr>
+      <w:r>
+        <w:rPr>
+          <w:color w:val="FF0000"/>
+        </w:rPr>
+        <w:t xml:space="preserve">If you have used AI tools in your work, you must include screenshots of your requests in the appendix. </w:t>
+      </w:r>
+    </w:p>
+    <w:p>
+      <w:pPr>
+        <w:rPr>
+          <w:color w:val="FF0000"/>
+        </w:rPr>
+      </w:pPr>
+      <w:r>
+        <w:rPr>
+          <w:color w:val="FF0000"/>
+        </w:rPr>
+        <w:t>The appendix serves as a repository for additional or supplementary information that is deemed too extensive or detailed for integration into the main body of the text. This supplementary content can encompass data tables, charts, graphs, questionnaires, or any other supporting materials that contribute to a comprehensive understanding of the research.</w:t>
+      </w:r>
+    </w:p>
+    <w:p>
+      <w:pPr>
+        <w:rPr>
+          <w:color w:val="FF0000"/>
+        </w:rPr>
+      </w:pPr>
+      <w:r>
+        <w:rPr>
+          <w:color w:val="FF0000"/>
+        </w:rPr>
+        <w:t>If you haven't used AI tools and there's no need for supplementary data, you can remove the appendix section entirely.</w:t>
+      </w:r>
+    </w:p>
+    <w:p>
+      <w:pPr>
+        <w:rPr>
+          <w:color w:val="FF0000"/>
+        </w:rPr>
+      </w:pPr>
+      <w:bookmarkStart w:id="19" w:name="_GoBack"/>
       <w:bookmarkEnd w:id="19"/>
-    </w:p>
-    <w:p/>
-    <w:p>
-      <w:pPr>
-        <w:rPr>
-          <w:color w:val="FF0000"/>
-        </w:rPr>
-      </w:pPr>
-    </w:p>
-    <w:p>
-      <w:pPr>
-        <w:rPr>
-          <w:color w:val="FF0000"/>
-        </w:rPr>
-      </w:pPr>
-      <w:r>
-        <w:rPr>
-          <w:color w:val="FF0000"/>
-        </w:rPr>
-        <w:t xml:space="preserve">If you have used AI tools in your work, you must include screenshots of your requests in the appendix. </w:t>
-      </w:r>
-    </w:p>
-    <w:p>
-      <w:pPr>
-        <w:rPr>
-          <w:color w:val="FF0000"/>
-        </w:rPr>
-      </w:pPr>
-      <w:r>
-        <w:rPr>
-          <w:color w:val="FF0000"/>
-        </w:rPr>
-        <w:t>The appendix serves as a repository for additional or supplementary information that is deemed too extensive or detailed for integration into the main body of the text. This supplementary content can encompass data tables, charts, graphs, questionnaires, or any other supporting materials that contribute to a comprehensive understanding of the research.</w:t>
-      </w:r>
-    </w:p>
-    <w:p>
-      <w:pPr>
-        <w:rPr>
-          <w:color w:val="FF0000"/>
-        </w:rPr>
-      </w:pPr>
-      <w:r>
-        <w:rPr>
-          <w:color w:val="FF0000"/>
-        </w:rPr>
-        <w:t>If you haven't used AI tools and there's no need for supplementary data, you can remove the appendix section entirely.</w:t>
-      </w:r>
-    </w:p>
-    <w:p>
-      <w:pPr>
-        <w:rPr>
-          <w:color w:val="FF0000"/>
-        </w:rPr>
-      </w:pPr>
     </w:p>
     <w:p/>
     <w:sectPr>
-      <w:footerReference w:type="default" r:id="rId15"/>
+      <w:footerReference w:type="default" r:id="rId16"/>
       <w:pgSz w:w="11906" w:h="16838"/>
       <w:pgMar w:top="1440" w:right="1440" w:bottom="1440" w:left="1440" w:header="708" w:footer="708" w:gutter="0"/>
       <w:pgNumType w:start="1"/>
@@ -6913,7 +6977,7 @@
 </file>
 
 <file path=customXml/itemProps5.xml><?xml version="1.0" encoding="utf-8"?>
-<ds:datastoreItem xmlns:ds="http://schemas.openxmlformats.org/officeDocument/2006/customXml" ds:itemID="{E86E47D7-63E5-435F-8C63-D56329295075}">
+<ds:datastoreItem xmlns:ds="http://schemas.openxmlformats.org/officeDocument/2006/customXml" ds:itemID="{1941F259-67F1-4701-B9A1-0FD9F1912EDE}">
   <ds:schemaRefs>
     <ds:schemaRef ds:uri="http://schemas.openxmlformats.org/officeDocument/2006/bibliography"/>
   </ds:schemaRefs>

</xml_diff>

<commit_message>
Ethical and Legal Considerations done
</commit_message>
<xml_diff>
--- a/CA 1 – Capstone Project Proposal.docx
+++ b/CA 1 – Capstone Project Proposal.docx
@@ -262,28 +262,17 @@
     </w:p>
     <w:tbl>
       <w:tblPr>
-        <w:tblW w:w="9015" w:type="dxa"/>
-        <w:tblBorders>
-          <w:insideH w:val="nil"/>
-          <w:insideV w:val="nil"/>
-        </w:tblBorders>
+        <w:tblW w:w="9493" w:type="dxa"/>
         <w:tblLayout w:type="fixed"/>
         <w:tblLook w:val="0400" w:firstRow="0" w:lastRow="0" w:firstColumn="0" w:lastColumn="0" w:noHBand="0" w:noVBand="1"/>
       </w:tblPr>
       <w:tblGrid>
-        <w:gridCol w:w="4820"/>
-        <w:gridCol w:w="4195"/>
+        <w:gridCol w:w="9493"/>
       </w:tblGrid>
       <w:tr>
         <w:tc>
           <w:tcPr>
-            <w:tcW w:w="4820" w:type="dxa"/>
-            <w:tcBorders>
-              <w:top w:val="nil"/>
-              <w:left w:val="nil"/>
-              <w:bottom w:val="nil"/>
-              <w:right w:val="nil"/>
-            </w:tcBorders>
+            <w:tcW w:w="9493" w:type="dxa"/>
             <w:hideMark/>
           </w:tcPr>
           <w:p>
@@ -325,40 +314,13 @@
               </w:rPr>
               <w:t>Bruno Stefani Esposto</w:t>
             </w:r>
-          </w:p>
-        </w:tc>
-        <w:tc>
-          <w:tcPr>
-            <w:tcW w:w="4195" w:type="dxa"/>
-            <w:tcBorders>
-              <w:top w:val="nil"/>
-              <w:left w:val="nil"/>
-              <w:bottom w:val="nil"/>
-              <w:right w:val="nil"/>
-            </w:tcBorders>
-          </w:tcPr>
-          <w:p>
-            <w:pPr>
-              <w:spacing w:line="480" w:lineRule="auto"/>
-              <w:rPr>
-                <w:color w:val="000000"/>
-                <w:sz w:val="32"/>
-                <w:szCs w:val="32"/>
-              </w:rPr>
-            </w:pPr>
           </w:p>
         </w:tc>
       </w:tr>
       <w:tr>
         <w:tc>
           <w:tcPr>
-            <w:tcW w:w="4820" w:type="dxa"/>
-            <w:tcBorders>
-              <w:top w:val="nil"/>
-              <w:left w:val="nil"/>
-              <w:bottom w:val="nil"/>
-              <w:right w:val="nil"/>
-            </w:tcBorders>
+            <w:tcW w:w="9493" w:type="dxa"/>
             <w:hideMark/>
           </w:tcPr>
           <w:p>
@@ -400,40 +362,13 @@
               </w:rPr>
               <w:t>sba26087</w:t>
             </w:r>
-          </w:p>
-        </w:tc>
-        <w:tc>
-          <w:tcPr>
-            <w:tcW w:w="4195" w:type="dxa"/>
-            <w:tcBorders>
-              <w:top w:val="nil"/>
-              <w:left w:val="nil"/>
-              <w:bottom w:val="nil"/>
-              <w:right w:val="nil"/>
-            </w:tcBorders>
-          </w:tcPr>
-          <w:p>
-            <w:pPr>
-              <w:spacing w:line="480" w:lineRule="auto"/>
-              <w:rPr>
-                <w:color w:val="000000"/>
-                <w:sz w:val="32"/>
-                <w:szCs w:val="32"/>
-              </w:rPr>
-            </w:pPr>
           </w:p>
         </w:tc>
       </w:tr>
       <w:tr>
         <w:tc>
           <w:tcPr>
-            <w:tcW w:w="4820" w:type="dxa"/>
-            <w:tcBorders>
-              <w:top w:val="nil"/>
-              <w:left w:val="nil"/>
-              <w:bottom w:val="nil"/>
-              <w:right w:val="nil"/>
-            </w:tcBorders>
+            <w:tcW w:w="9493" w:type="dxa"/>
             <w:hideMark/>
           </w:tcPr>
           <w:p>
@@ -475,40 +410,13 @@
               </w:rPr>
               <w:t>Strategic Thinking</w:t>
             </w:r>
-          </w:p>
-        </w:tc>
-        <w:tc>
-          <w:tcPr>
-            <w:tcW w:w="4195" w:type="dxa"/>
-            <w:tcBorders>
-              <w:top w:val="nil"/>
-              <w:left w:val="nil"/>
-              <w:bottom w:val="nil"/>
-              <w:right w:val="nil"/>
-            </w:tcBorders>
-          </w:tcPr>
-          <w:p>
-            <w:pPr>
-              <w:spacing w:line="480" w:lineRule="auto"/>
-              <w:rPr>
-                <w:color w:val="000000"/>
-                <w:sz w:val="32"/>
-                <w:szCs w:val="32"/>
-              </w:rPr>
-            </w:pPr>
           </w:p>
         </w:tc>
       </w:tr>
       <w:tr>
         <w:tc>
           <w:tcPr>
-            <w:tcW w:w="4820" w:type="dxa"/>
-            <w:tcBorders>
-              <w:top w:val="nil"/>
-              <w:left w:val="nil"/>
-              <w:bottom w:val="nil"/>
-              <w:right w:val="nil"/>
-            </w:tcBorders>
+            <w:tcW w:w="9493" w:type="dxa"/>
             <w:hideMark/>
           </w:tcPr>
           <w:p>
@@ -550,40 +458,13 @@
               </w:rPr>
               <w:t>CA 1 – Capstone Project Proposal</w:t>
             </w:r>
-          </w:p>
-        </w:tc>
-        <w:tc>
-          <w:tcPr>
-            <w:tcW w:w="4195" w:type="dxa"/>
-            <w:tcBorders>
-              <w:top w:val="nil"/>
-              <w:left w:val="nil"/>
-              <w:bottom w:val="nil"/>
-              <w:right w:val="nil"/>
-            </w:tcBorders>
-          </w:tcPr>
-          <w:p>
-            <w:pPr>
-              <w:spacing w:line="480" w:lineRule="auto"/>
-              <w:rPr>
-                <w:color w:val="000000"/>
-                <w:sz w:val="32"/>
-                <w:szCs w:val="32"/>
-              </w:rPr>
-            </w:pPr>
           </w:p>
         </w:tc>
       </w:tr>
       <w:tr>
         <w:tc>
           <w:tcPr>
-            <w:tcW w:w="4820" w:type="dxa"/>
-            <w:tcBorders>
-              <w:top w:val="nil"/>
-              <w:left w:val="nil"/>
-              <w:bottom w:val="nil"/>
-              <w:right w:val="nil"/>
-            </w:tcBorders>
+            <w:tcW w:w="9493" w:type="dxa"/>
             <w:hideMark/>
           </w:tcPr>
           <w:p>
@@ -636,40 +517,13 @@
               </w:rPr>
               <w:t xml:space="preserve"> Ahmed</w:t>
             </w:r>
-          </w:p>
-        </w:tc>
-        <w:tc>
-          <w:tcPr>
-            <w:tcW w:w="4195" w:type="dxa"/>
-            <w:tcBorders>
-              <w:top w:val="nil"/>
-              <w:left w:val="nil"/>
-              <w:bottom w:val="nil"/>
-              <w:right w:val="nil"/>
-            </w:tcBorders>
-          </w:tcPr>
-          <w:p>
-            <w:pPr>
-              <w:spacing w:line="480" w:lineRule="auto"/>
-              <w:rPr>
-                <w:color w:val="000000"/>
-                <w:sz w:val="32"/>
-                <w:szCs w:val="32"/>
-              </w:rPr>
-            </w:pPr>
           </w:p>
         </w:tc>
       </w:tr>
       <w:tr>
         <w:tc>
           <w:tcPr>
-            <w:tcW w:w="4820" w:type="dxa"/>
-            <w:tcBorders>
-              <w:top w:val="nil"/>
-              <w:left w:val="nil"/>
-              <w:bottom w:val="nil"/>
-              <w:right w:val="nil"/>
-            </w:tcBorders>
+            <w:tcW w:w="9493" w:type="dxa"/>
             <w:hideMark/>
           </w:tcPr>
           <w:p>
@@ -709,51 +563,15 @@
                 <w:sz w:val="32"/>
                 <w:szCs w:val="32"/>
               </w:rPr>
-              <w:t>25/10</w:t>
-            </w:r>
-            <w:r>
-              <w:rPr>
-                <w:i/>
-                <w:color w:val="156082"/>
-                <w:sz w:val="32"/>
-                <w:szCs w:val="32"/>
-              </w:rPr>
-              <w:t>/2026</w:t>
-            </w:r>
-          </w:p>
-        </w:tc>
-        <w:tc>
-          <w:tcPr>
-            <w:tcW w:w="4195" w:type="dxa"/>
-            <w:tcBorders>
-              <w:top w:val="nil"/>
-              <w:left w:val="nil"/>
-              <w:bottom w:val="nil"/>
-              <w:right w:val="nil"/>
-            </w:tcBorders>
-          </w:tcPr>
-          <w:p>
-            <w:pPr>
-              <w:spacing w:line="480" w:lineRule="auto"/>
-              <w:rPr>
-                <w:color w:val="000000"/>
-                <w:sz w:val="32"/>
-                <w:szCs w:val="32"/>
-              </w:rPr>
-            </w:pPr>
+              <w:t>25/10/2026</w:t>
+            </w:r>
           </w:p>
         </w:tc>
       </w:tr>
       <w:tr>
         <w:tc>
           <w:tcPr>
-            <w:tcW w:w="4820" w:type="dxa"/>
-            <w:tcBorders>
-              <w:top w:val="nil"/>
-              <w:left w:val="nil"/>
-              <w:bottom w:val="nil"/>
-              <w:right w:val="nil"/>
-            </w:tcBorders>
+            <w:tcW w:w="9493" w:type="dxa"/>
             <w:hideMark/>
           </w:tcPr>
           <w:p>
@@ -793,16 +611,76 @@
                 <w:sz w:val="32"/>
                 <w:szCs w:val="32"/>
               </w:rPr>
-              <w:t>23/10</w:t>
-            </w:r>
-            <w:r>
+              <w:t>23/10/2026</w:t>
+            </w:r>
+          </w:p>
+          <w:p>
+            <w:pPr>
+              <w:spacing w:line="480" w:lineRule="auto"/>
               <w:rPr>
                 <w:i/>
                 <w:color w:val="156082"/>
                 <w:sz w:val="32"/>
                 <w:szCs w:val="32"/>
               </w:rPr>
-              <w:t>/2026</w:t>
+            </w:pPr>
+            <w:r>
+              <w:rPr>
+                <w:i/>
+                <w:color w:val="156082"/>
+                <w:sz w:val="32"/>
+                <w:szCs w:val="32"/>
+              </w:rPr>
+              <w:t xml:space="preserve">GitHub link: </w:t>
+            </w:r>
+            <w:hyperlink r:id="rId13" w:history="1">
+              <w:r>
+                <w:rPr>
+                  <w:rStyle w:val="Hyperlink"/>
+                  <w:i/>
+                  <w:sz w:val="28"/>
+                  <w:szCs w:val="32"/>
+                </w:rPr>
+                <w:t>https://github.com/brunoesp</w:t>
+              </w:r>
+              <w:r>
+                <w:rPr>
+                  <w:rStyle w:val="Hyperlink"/>
+                  <w:i/>
+                  <w:sz w:val="28"/>
+                  <w:szCs w:val="32"/>
+                </w:rPr>
+                <w:t>o</w:t>
+              </w:r>
+              <w:r>
+                <w:rPr>
+                  <w:rStyle w:val="Hyperlink"/>
+                  <w:i/>
+                  <w:sz w:val="28"/>
+                  <w:szCs w:val="32"/>
+                </w:rPr>
+                <w:t>stocct/Capstone-Project-2026</w:t>
+              </w:r>
+            </w:hyperlink>
+          </w:p>
+          <w:p>
+            <w:pPr>
+              <w:spacing w:line="480" w:lineRule="auto"/>
+              <w:rPr>
+                <w:i/>
+                <w:color w:val="156082"/>
+                <w:sz w:val="32"/>
+                <w:szCs w:val="32"/>
+              </w:rPr>
+            </w:pPr>
+            <w:r>
+              <w:rPr>
+                <w:i/>
+                <w:color w:val="156082"/>
+                <w:sz w:val="32"/>
+                <w:szCs w:val="32"/>
+              </w:rPr>
+              <w:t xml:space="preserve"> </w:t>
             </w:r>
           </w:p>
           <w:p>
@@ -839,27 +717,6 @@
             </w:pPr>
           </w:p>
         </w:tc>
-        <w:tc>
-          <w:tcPr>
-            <w:tcW w:w="4195" w:type="dxa"/>
-            <w:tcBorders>
-              <w:top w:val="nil"/>
-              <w:left w:val="nil"/>
-              <w:bottom w:val="nil"/>
-              <w:right w:val="nil"/>
-            </w:tcBorders>
-          </w:tcPr>
-          <w:p>
-            <w:pPr>
-              <w:spacing w:line="480" w:lineRule="auto"/>
-              <w:rPr>
-                <w:color w:val="000000"/>
-                <w:sz w:val="32"/>
-                <w:szCs w:val="32"/>
-              </w:rPr>
-            </w:pPr>
-          </w:p>
-        </w:tc>
       </w:tr>
     </w:tbl>
     <w:p>
@@ -878,54 +735,68 @@
           <w:sz w:val="32"/>
           <w:szCs w:val="32"/>
         </w:rPr>
+        <w:lastRenderedPageBreak/>
         <w:t>Use of AI Tools</w:t>
       </w:r>
     </w:p>
     <w:p>
       <w:pPr>
+        <w:rPr>
+          <w:sz w:val="28"/>
+          <w:szCs w:val="28"/>
+        </w:rPr>
+      </w:pPr>
+      <w:r>
+        <w:rPr>
+          <w:sz w:val="28"/>
+          <w:szCs w:val="28"/>
+        </w:rPr>
+        <w:t>I acknowledge the use of</w:t>
+      </w:r>
+      <w:r>
+        <w:rPr>
+          <w:sz w:val="28"/>
+          <w:szCs w:val="28"/>
+        </w:rPr>
+        <w:t xml:space="preserve"> </w:t>
+      </w:r>
+      <w:proofErr w:type="spellStart"/>
+      <w:r>
         <w:rPr>
           <w:b/>
           <w:sz w:val="28"/>
           <w:szCs w:val="28"/>
         </w:rPr>
-      </w:pPr>
+        <w:t>ChatGPT</w:t>
+      </w:r>
+      <w:proofErr w:type="spellEnd"/>
       <w:r>
         <w:rPr>
           <w:sz w:val="28"/>
           <w:szCs w:val="28"/>
         </w:rPr>
-        <w:lastRenderedPageBreak/>
-        <w:t>I acknowledge the use of</w:t>
+        <w:t xml:space="preserve"> for the purpose of </w:t>
       </w:r>
       <w:r>
         <w:rPr>
           <w:sz w:val="28"/>
           <w:szCs w:val="28"/>
         </w:rPr>
-        <w:t xml:space="preserve"> </w:t>
-      </w:r>
-      <w:r>
-        <w:rPr>
-          <w:b/>
+        <w:t>brainstorming</w:t>
+      </w:r>
+      <w:r>
+        <w:rPr>
           <w:sz w:val="28"/>
           <w:szCs w:val="28"/>
         </w:rPr>
-        <w:t>[enter name of the AI tool you used]</w:t>
+        <w:t xml:space="preserve"> ideas</w:t>
       </w:r>
       <w:r>
         <w:rPr>
           <w:sz w:val="28"/>
           <w:szCs w:val="28"/>
         </w:rPr>
-        <w:t xml:space="preserve"> for the purpose of </w:t>
-      </w:r>
-      <w:r>
-        <w:rPr>
-          <w:b/>
-          <w:sz w:val="28"/>
-          <w:szCs w:val="28"/>
-        </w:rPr>
-        <w:t xml:space="preserve">[provide a brief explanation of how you used the tool]. </w:t>
+        <w:t>, grammar checking, final text review, and reference searching.</w:t>
       </w:r>
     </w:p>
     <w:p>
@@ -1215,7 +1086,7 @@
           <w:r>
             <w:fldChar w:fldCharType="separate"/>
           </w:r>
-          <w:hyperlink w:anchor="_Toc243421292" w:history="1">
+          <w:hyperlink w:anchor="_Toc243484717" w:history="1">
             <w:r>
               <w:rPr>
                 <w:rStyle w:val="Hyperlink"/>
@@ -1242,7 +1113,7 @@
                 <w:noProof/>
                 <w:webHidden/>
               </w:rPr>
-              <w:instrText xml:space="preserve"> PAGEREF _Toc243421292 \h </w:instrText>
+              <w:instrText xml:space="preserve"> PAGEREF _Toc243484717 \h </w:instrText>
             </w:r>
             <w:r>
               <w:rPr>
@@ -1285,7 +1156,7 @@
               <w:sz w:val="22"/>
             </w:rPr>
           </w:pPr>
-          <w:hyperlink w:anchor="_Toc243421293" w:history="1">
+          <w:hyperlink w:anchor="_Toc243484718" w:history="1">
             <w:r>
               <w:rPr>
                 <w:rStyle w:val="Hyperlink"/>
@@ -1312,7 +1183,7 @@
                 <w:noProof/>
                 <w:webHidden/>
               </w:rPr>
-              <w:instrText xml:space="preserve"> PAGEREF _Toc243421293 \h </w:instrText>
+              <w:instrText xml:space="preserve"> PAGEREF _Toc243484718 \h </w:instrText>
             </w:r>
             <w:r>
               <w:rPr>
@@ -1355,7 +1226,7 @@
               <w:sz w:val="22"/>
             </w:rPr>
           </w:pPr>
-          <w:hyperlink w:anchor="_Toc243421294" w:history="1">
+          <w:hyperlink w:anchor="_Toc243484719" w:history="1">
             <w:r>
               <w:rPr>
                 <w:rStyle w:val="Hyperlink"/>
@@ -1382,7 +1253,7 @@
                 <w:noProof/>
                 <w:webHidden/>
               </w:rPr>
-              <w:instrText xml:space="preserve"> PAGEREF _Toc243421294 \h </w:instrText>
+              <w:instrText xml:space="preserve"> PAGEREF _Toc243484719 \h </w:instrText>
             </w:r>
             <w:r>
               <w:rPr>
@@ -1425,7 +1296,7 @@
               <w:sz w:val="22"/>
             </w:rPr>
           </w:pPr>
-          <w:hyperlink w:anchor="_Toc243421295" w:history="1">
+          <w:hyperlink w:anchor="_Toc243484720" w:history="1">
             <w:r>
               <w:rPr>
                 <w:rStyle w:val="Hyperlink"/>
@@ -1452,7 +1323,7 @@
                 <w:noProof/>
                 <w:webHidden/>
               </w:rPr>
-              <w:instrText xml:space="preserve"> PAGEREF _Toc243421295 \h </w:instrText>
+              <w:instrText xml:space="preserve"> PAGEREF _Toc243484720 \h </w:instrText>
             </w:r>
             <w:r>
               <w:rPr>
@@ -1495,7 +1366,7 @@
               <w:sz w:val="22"/>
             </w:rPr>
           </w:pPr>
-          <w:hyperlink w:anchor="_Toc243421296" w:history="1">
+          <w:hyperlink w:anchor="_Toc243484721" w:history="1">
             <w:r>
               <w:rPr>
                 <w:rStyle w:val="Hyperlink"/>
@@ -1523,7 +1394,7 @@
                 <w:noProof/>
                 <w:webHidden/>
               </w:rPr>
-              <w:instrText xml:space="preserve"> PAGEREF _Toc243421296 \h </w:instrText>
+              <w:instrText xml:space="preserve"> PAGEREF _Toc243484721 \h </w:instrText>
             </w:r>
             <w:r>
               <w:rPr>
@@ -1566,7 +1437,7 @@
               <w:sz w:val="22"/>
             </w:rPr>
           </w:pPr>
-          <w:hyperlink w:anchor="_Toc243421297" w:history="1">
+          <w:hyperlink w:anchor="_Toc243484722" w:history="1">
             <w:r>
               <w:rPr>
                 <w:rStyle w:val="Hyperlink"/>
@@ -1594,7 +1465,7 @@
                 <w:noProof/>
                 <w:webHidden/>
               </w:rPr>
-              <w:instrText xml:space="preserve"> PAGEREF _Toc243421297 \h </w:instrText>
+              <w:instrText xml:space="preserve"> PAGEREF _Toc243484722 \h </w:instrText>
             </w:r>
             <w:r>
               <w:rPr>
@@ -1637,7 +1508,7 @@
               <w:sz w:val="22"/>
             </w:rPr>
           </w:pPr>
-          <w:hyperlink w:anchor="_Toc243421298" w:history="1">
+          <w:hyperlink w:anchor="_Toc243484723" w:history="1">
             <w:r>
               <w:rPr>
                 <w:rStyle w:val="Hyperlink"/>
@@ -1664,7 +1535,7 @@
                 <w:noProof/>
                 <w:webHidden/>
               </w:rPr>
-              <w:instrText xml:space="preserve"> PAGEREF _Toc243421298 \h </w:instrText>
+              <w:instrText xml:space="preserve"> PAGEREF _Toc243484723 \h </w:instrText>
             </w:r>
             <w:r>
               <w:rPr>
@@ -1707,7 +1578,7 @@
               <w:sz w:val="22"/>
             </w:rPr>
           </w:pPr>
-          <w:hyperlink w:anchor="_Toc243421299" w:history="1">
+          <w:hyperlink w:anchor="_Toc243484724" w:history="1">
             <w:r>
               <w:rPr>
                 <w:rStyle w:val="Hyperlink"/>
@@ -1734,7 +1605,7 @@
                 <w:noProof/>
                 <w:webHidden/>
               </w:rPr>
-              <w:instrText xml:space="preserve"> PAGEREF _Toc243421299 \h </w:instrText>
+              <w:instrText xml:space="preserve"> PAGEREF _Toc243484724 \h </w:instrText>
             </w:r>
             <w:r>
               <w:rPr>
@@ -1777,7 +1648,7 @@
               <w:sz w:val="22"/>
             </w:rPr>
           </w:pPr>
-          <w:hyperlink w:anchor="_Toc243421300" w:history="1">
+          <w:hyperlink w:anchor="_Toc243484725" w:history="1">
             <w:r>
               <w:rPr>
                 <w:rStyle w:val="Hyperlink"/>
@@ -1804,7 +1675,7 @@
                 <w:noProof/>
                 <w:webHidden/>
               </w:rPr>
-              <w:instrText xml:space="preserve"> PAGEREF _Toc243421300 \h </w:instrText>
+              <w:instrText xml:space="preserve"> PAGEREF _Toc243484725 \h </w:instrText>
             </w:r>
             <w:r>
               <w:rPr>
@@ -1847,7 +1718,7 @@
               <w:sz w:val="22"/>
             </w:rPr>
           </w:pPr>
-          <w:hyperlink w:anchor="_Toc243421301" w:history="1">
+          <w:hyperlink w:anchor="_Toc243484726" w:history="1">
             <w:r>
               <w:rPr>
                 <w:rStyle w:val="Hyperlink"/>
@@ -1874,7 +1745,7 @@
                 <w:noProof/>
                 <w:webHidden/>
               </w:rPr>
-              <w:instrText xml:space="preserve"> PAGEREF _Toc243421301 \h </w:instrText>
+              <w:instrText xml:space="preserve"> PAGEREF _Toc243484726 \h </w:instrText>
             </w:r>
             <w:r>
               <w:rPr>
@@ -1917,7 +1788,7 @@
               <w:sz w:val="22"/>
             </w:rPr>
           </w:pPr>
-          <w:hyperlink w:anchor="_Toc243421302" w:history="1">
+          <w:hyperlink w:anchor="_Toc243484727" w:history="1">
             <w:r>
               <w:rPr>
                 <w:rStyle w:val="Hyperlink"/>
@@ -1944,7 +1815,7 @@
                 <w:noProof/>
                 <w:webHidden/>
               </w:rPr>
-              <w:instrText xml:space="preserve"> PAGEREF _Toc243421302 \h </w:instrText>
+              <w:instrText xml:space="preserve"> PAGEREF _Toc243484727 \h </w:instrText>
             </w:r>
             <w:r>
               <w:rPr>
@@ -1987,7 +1858,7 @@
               <w:sz w:val="22"/>
             </w:rPr>
           </w:pPr>
-          <w:hyperlink w:anchor="_Toc243421303" w:history="1">
+          <w:hyperlink w:anchor="_Toc243484728" w:history="1">
             <w:r>
               <w:rPr>
                 <w:rStyle w:val="Hyperlink"/>
@@ -2014,7 +1885,7 @@
                 <w:noProof/>
                 <w:webHidden/>
               </w:rPr>
-              <w:instrText xml:space="preserve"> PAGEREF _Toc243421303 \h </w:instrText>
+              <w:instrText xml:space="preserve"> PAGEREF _Toc243484728 \h </w:instrText>
             </w:r>
             <w:r>
               <w:rPr>
@@ -2057,7 +1928,7 @@
               <w:sz w:val="22"/>
             </w:rPr>
           </w:pPr>
-          <w:hyperlink w:anchor="_Toc243421304" w:history="1">
+          <w:hyperlink w:anchor="_Toc243484729" w:history="1">
             <w:r>
               <w:rPr>
                 <w:rStyle w:val="Hyperlink"/>
@@ -2084,7 +1955,7 @@
                 <w:noProof/>
                 <w:webHidden/>
               </w:rPr>
-              <w:instrText xml:space="preserve"> PAGEREF _Toc243421304 \h </w:instrText>
+              <w:instrText xml:space="preserve"> PAGEREF _Toc243484729 \h </w:instrText>
             </w:r>
             <w:r>
               <w:rPr>
@@ -2127,7 +1998,7 @@
               <w:sz w:val="22"/>
             </w:rPr>
           </w:pPr>
-          <w:hyperlink w:anchor="_Toc243421305" w:history="1">
+          <w:hyperlink w:anchor="_Toc243484730" w:history="1">
             <w:r>
               <w:rPr>
                 <w:rStyle w:val="Hyperlink"/>
@@ -2154,7 +2025,7 @@
                 <w:noProof/>
                 <w:webHidden/>
               </w:rPr>
-              <w:instrText xml:space="preserve"> PAGEREF _Toc243421305 \h </w:instrText>
+              <w:instrText xml:space="preserve"> PAGEREF _Toc243484730 \h </w:instrText>
             </w:r>
             <w:r>
               <w:rPr>
@@ -2197,7 +2068,7 @@
               <w:sz w:val="22"/>
             </w:rPr>
           </w:pPr>
-          <w:hyperlink w:anchor="_Toc243421306" w:history="1">
+          <w:hyperlink w:anchor="_Toc243484731" w:history="1">
             <w:r>
               <w:rPr>
                 <w:rStyle w:val="Hyperlink"/>
@@ -2224,7 +2095,7 @@
                 <w:noProof/>
                 <w:webHidden/>
               </w:rPr>
-              <w:instrText xml:space="preserve"> PAGEREF _Toc243421306 \h </w:instrText>
+              <w:instrText xml:space="preserve"> PAGEREF _Toc243484731 \h </w:instrText>
             </w:r>
             <w:r>
               <w:rPr>
@@ -2267,7 +2138,7 @@
               <w:sz w:val="22"/>
             </w:rPr>
           </w:pPr>
-          <w:hyperlink w:anchor="_Toc243421307" w:history="1">
+          <w:hyperlink w:anchor="_Toc243484732" w:history="1">
             <w:r>
               <w:rPr>
                 <w:rStyle w:val="Hyperlink"/>
@@ -2294,7 +2165,7 @@
                 <w:noProof/>
                 <w:webHidden/>
               </w:rPr>
-              <w:instrText xml:space="preserve"> PAGEREF _Toc243421307 \h </w:instrText>
+              <w:instrText xml:space="preserve"> PAGEREF _Toc243484732 \h </w:instrText>
             </w:r>
             <w:r>
               <w:rPr>
@@ -2337,7 +2208,7 @@
               <w:sz w:val="22"/>
             </w:rPr>
           </w:pPr>
-          <w:hyperlink w:anchor="_Toc243421308" w:history="1">
+          <w:hyperlink w:anchor="_Toc243484733" w:history="1">
             <w:r>
               <w:rPr>
                 <w:rStyle w:val="Hyperlink"/>
@@ -2364,7 +2235,7 @@
                 <w:noProof/>
                 <w:webHidden/>
               </w:rPr>
-              <w:instrText xml:space="preserve"> PAGEREF _Toc243421308 \h </w:instrText>
+              <w:instrText xml:space="preserve"> PAGEREF _Toc243484733 \h </w:instrText>
             </w:r>
             <w:r>
               <w:rPr>
@@ -2407,7 +2278,7 @@
               <w:sz w:val="22"/>
             </w:rPr>
           </w:pPr>
-          <w:hyperlink w:anchor="_Toc243421309" w:history="1">
+          <w:hyperlink w:anchor="_Toc243484734" w:history="1">
             <w:r>
               <w:rPr>
                 <w:rStyle w:val="Hyperlink"/>
@@ -2434,7 +2305,7 @@
                 <w:noProof/>
                 <w:webHidden/>
               </w:rPr>
-              <w:instrText xml:space="preserve"> PAGEREF _Toc243421309 \h </w:instrText>
+              <w:instrText xml:space="preserve"> PAGEREF _Toc243484734 \h </w:instrText>
             </w:r>
             <w:r>
               <w:rPr>
@@ -2476,24 +2347,26 @@
     <w:p>
       <w:pPr>
         <w:sectPr>
-          <w:footerReference w:type="default" r:id="rId13"/>
+          <w:footerReference w:type="default" r:id="rId14"/>
           <w:pgSz w:w="11906" w:h="16838"/>
           <w:pgMar w:top="1440" w:right="1440" w:bottom="1440" w:left="1440" w:header="708" w:footer="708" w:gutter="0"/>
           <w:cols w:space="720"/>
         </w:sectPr>
       </w:pPr>
+      <w:bookmarkStart w:id="0" w:name="_GoBack"/>
+      <w:bookmarkEnd w:id="0"/>
     </w:p>
     <w:p>
       <w:pPr>
         <w:pStyle w:val="Heading1"/>
         <w:spacing w:after="0"/>
       </w:pPr>
-      <w:bookmarkStart w:id="0" w:name="_Toc243421292"/>
+      <w:bookmarkStart w:id="1" w:name="_Toc243484717"/>
       <w:r>
         <w:lastRenderedPageBreak/>
         <w:t>1. Project Title</w:t>
       </w:r>
-      <w:bookmarkEnd w:id="0"/>
+      <w:bookmarkEnd w:id="1"/>
     </w:p>
     <w:p>
       <w:r>
@@ -2504,11 +2377,11 @@
       <w:pPr>
         <w:pStyle w:val="Heading1"/>
       </w:pPr>
-      <w:bookmarkStart w:id="1" w:name="_Toc243421293"/>
+      <w:bookmarkStart w:id="2" w:name="_Toc243484718"/>
       <w:r>
         <w:t>2. Introduction</w:t>
       </w:r>
-      <w:bookmarkEnd w:id="1"/>
+      <w:bookmarkEnd w:id="2"/>
     </w:p>
     <w:p>
       <w:pPr>
@@ -3284,12 +3157,12 @@
       <w:pPr>
         <w:pStyle w:val="Heading1"/>
       </w:pPr>
-      <w:bookmarkStart w:id="2" w:name="_Toc243421294"/>
+      <w:bookmarkStart w:id="3" w:name="_Toc243484719"/>
       <w:r>
         <w:lastRenderedPageBreak/>
         <w:t>3. Problem Definition</w:t>
       </w:r>
-      <w:bookmarkEnd w:id="2"/>
+      <w:bookmarkEnd w:id="3"/>
     </w:p>
     <w:p>
       <w:pPr>
@@ -3420,11 +3293,11 @@
       <w:pPr>
         <w:pStyle w:val="Heading1"/>
       </w:pPr>
-      <w:bookmarkStart w:id="3" w:name="_Toc243421295"/>
+      <w:bookmarkStart w:id="4" w:name="_Toc243484720"/>
       <w:r>
         <w:t>4. Aim and Objectives</w:t>
       </w:r>
-      <w:bookmarkEnd w:id="3"/>
+      <w:bookmarkEnd w:id="4"/>
     </w:p>
     <w:p>
       <w:pPr>
@@ -3433,14 +3306,14 @@
           <w:lang w:eastAsia="en-GB"/>
         </w:rPr>
       </w:pPr>
-      <w:bookmarkStart w:id="4" w:name="_Toc243421296"/>
+      <w:bookmarkStart w:id="5" w:name="_Toc243484721"/>
       <w:r>
         <w:rPr>
           <w:lang w:eastAsia="en-GB"/>
         </w:rPr>
         <w:t>4. 1 Aim</w:t>
       </w:r>
-      <w:bookmarkEnd w:id="4"/>
+      <w:bookmarkEnd w:id="5"/>
     </w:p>
     <w:p>
       <w:pPr>
@@ -3470,14 +3343,14 @@
           <w:lang w:eastAsia="en-GB"/>
         </w:rPr>
       </w:pPr>
-      <w:bookmarkStart w:id="5" w:name="_Toc243421297"/>
+      <w:bookmarkStart w:id="6" w:name="_Toc243484722"/>
       <w:r>
         <w:rPr>
           <w:lang w:eastAsia="en-GB"/>
         </w:rPr>
         <w:t>4.2 Objectives</w:t>
       </w:r>
-      <w:bookmarkEnd w:id="5"/>
+      <w:bookmarkEnd w:id="6"/>
     </w:p>
     <w:p>
       <w:pPr>
@@ -3540,11 +3413,11 @@
       <w:pPr>
         <w:pStyle w:val="Heading1"/>
       </w:pPr>
-      <w:bookmarkStart w:id="6" w:name="_Toc243421298"/>
+      <w:bookmarkStart w:id="7" w:name="_Toc243484723"/>
       <w:r>
         <w:t>5. Scope</w:t>
       </w:r>
-      <w:bookmarkEnd w:id="6"/>
+      <w:bookmarkEnd w:id="7"/>
     </w:p>
     <w:p>
       <w:pPr>
@@ -3579,21 +3452,21 @@
       <w:pPr>
         <w:pStyle w:val="Heading1"/>
       </w:pPr>
-      <w:bookmarkStart w:id="7" w:name="_Toc243421299"/>
+      <w:bookmarkStart w:id="8" w:name="_Toc243484724"/>
       <w:r>
         <w:t>6. Methodology</w:t>
       </w:r>
-      <w:bookmarkEnd w:id="7"/>
+      <w:bookmarkEnd w:id="8"/>
     </w:p>
     <w:p>
       <w:pPr>
         <w:pStyle w:val="Heading2"/>
       </w:pPr>
-      <w:bookmarkStart w:id="8" w:name="_Toc243421300"/>
+      <w:bookmarkStart w:id="9" w:name="_Toc243484725"/>
       <w:r>
         <w:t>6.1 Data Collection and Preparation</w:t>
       </w:r>
-      <w:bookmarkEnd w:id="8"/>
+      <w:bookmarkEnd w:id="9"/>
     </w:p>
     <w:p>
       <w:pPr>
@@ -3650,11 +3523,11 @@
       <w:pPr>
         <w:pStyle w:val="Heading2"/>
       </w:pPr>
-      <w:bookmarkStart w:id="9" w:name="_Toc243421301"/>
+      <w:bookmarkStart w:id="10" w:name="_Toc243484726"/>
       <w:r>
         <w:t>6.2 Predictive Modelling</w:t>
       </w:r>
-      <w:bookmarkEnd w:id="9"/>
+      <w:bookmarkEnd w:id="10"/>
     </w:p>
     <w:p>
       <w:pPr>
@@ -3718,11 +3591,11 @@
       <w:pPr>
         <w:pStyle w:val="Heading2"/>
       </w:pPr>
-      <w:bookmarkStart w:id="10" w:name="_Toc243421302"/>
+      <w:bookmarkStart w:id="11" w:name="_Toc243484727"/>
       <w:r>
         <w:t>6.3 Model Evaluation</w:t>
       </w:r>
-      <w:bookmarkEnd w:id="10"/>
+      <w:bookmarkEnd w:id="11"/>
     </w:p>
     <w:p>
       <w:pPr>
@@ -3784,11 +3657,11 @@
       <w:pPr>
         <w:pStyle w:val="Heading2"/>
       </w:pPr>
-      <w:bookmarkStart w:id="11" w:name="_Toc243421303"/>
+      <w:bookmarkStart w:id="12" w:name="_Toc243484728"/>
       <w:r>
         <w:t>6.4 Architecture Diagram</w:t>
       </w:r>
-      <w:bookmarkEnd w:id="11"/>
+      <w:bookmarkEnd w:id="12"/>
     </w:p>
     <w:p>
       <w:pPr>
@@ -3822,7 +3695,7 @@
                     <pic:cNvPicPr/>
                   </pic:nvPicPr>
                   <pic:blipFill rotWithShape="1">
-                    <a:blip r:embed="rId14" cstate="print">
+                    <a:blip r:embed="rId15" cstate="print">
                       <a:extLst>
                         <a:ext uri="{28A0092B-C50C-407E-A947-70E740481C1C}">
                           <a14:useLocalDpi xmlns:a14="http://schemas.microsoft.com/office/drawing/2010/main" val="0"/>
@@ -3868,11 +3741,11 @@
       <w:pPr>
         <w:pStyle w:val="Heading1"/>
       </w:pPr>
-      <w:bookmarkStart w:id="12" w:name="_Toc243421304"/>
+      <w:bookmarkStart w:id="13" w:name="_Toc243484729"/>
       <w:r>
         <w:t>7. Data Sources</w:t>
       </w:r>
-      <w:bookmarkEnd w:id="12"/>
+      <w:bookmarkEnd w:id="13"/>
     </w:p>
     <w:p>
       <w:pPr>
@@ -3907,11 +3780,11 @@
       <w:pPr>
         <w:pStyle w:val="Heading1"/>
       </w:pPr>
-      <w:bookmarkStart w:id="13" w:name="_Toc243421305"/>
+      <w:bookmarkStart w:id="14" w:name="_Toc243484730"/>
       <w:r>
         <w:t>8. Expected Deliverables</w:t>
       </w:r>
-      <w:bookmarkEnd w:id="13"/>
+      <w:bookmarkEnd w:id="14"/>
     </w:p>
     <w:p>
       <w:pPr>
@@ -3941,12 +3814,12 @@
       <w:pPr>
         <w:pStyle w:val="Heading1"/>
       </w:pPr>
-      <w:bookmarkStart w:id="14" w:name="_Toc243421306"/>
+      <w:bookmarkStart w:id="15" w:name="_Toc243484731"/>
       <w:r>
         <w:lastRenderedPageBreak/>
         <w:t>9. Project Timeline</w:t>
       </w:r>
-      <w:bookmarkEnd w:id="14"/>
+      <w:bookmarkEnd w:id="15"/>
     </w:p>
     <w:p>
       <w:pPr>
@@ -3980,7 +3853,7 @@
                     </pic:cNvPicPr>
                   </pic:nvPicPr>
                   <pic:blipFill>
-                    <a:blip r:embed="rId15">
+                    <a:blip r:embed="rId16">
                       <a:extLst>
                         <a:ext uri="{28A0092B-C50C-407E-A947-70E740481C1C}">
                           <a14:useLocalDpi xmlns:a14="http://schemas.microsoft.com/office/drawing/2010/main" val="0"/>
@@ -4013,18 +3886,54 @@
       <w:pPr>
         <w:pStyle w:val="Heading1"/>
       </w:pPr>
-      <w:bookmarkStart w:id="15" w:name="_Toc243421307"/>
+      <w:bookmarkStart w:id="16" w:name="_Toc243484732"/>
       <w:r>
         <w:t>10. Ethical and Legal Considerations</w:t>
       </w:r>
-      <w:bookmarkEnd w:id="15"/>
-    </w:p>
-    <w:p>
-      <w:r>
-        <w:rPr>
-          <w:color w:val="FF0000"/>
-        </w:rPr>
-        <w:t>Identify relevant ethical, privacy, data protection, security and data-use considerations associated with the project. Explain how these will be appropriately addressed, including permissions for accessing and using the selected data.</w:t>
+      <w:bookmarkEnd w:id="16"/>
+    </w:p>
+    <w:p>
+      <w:pPr>
+        <w:ind w:firstLine="720"/>
+      </w:pPr>
+      <w:r>
+        <w:t>The project does not involve collecting personal information</w:t>
+      </w:r>
+      <w:r>
+        <w:t xml:space="preserve"> or </w:t>
+      </w:r>
+      <w:r>
+        <w:t>human participants</w:t>
+      </w:r>
+      <w:r>
+        <w:t xml:space="preserve">, as it uses existing public data. </w:t>
+      </w:r>
+      <w:r>
+        <w:t>T</w:t>
+      </w:r>
+      <w:r>
+        <w:t xml:space="preserve">he dataset is licensed </w:t>
+      </w:r>
+      <w:r>
+        <w:t xml:space="preserve">under the </w:t>
+      </w:r>
+      <w:r>
+        <w:t>Creative Commons Attribution 4.0</w:t>
+      </w:r>
+      <w:r>
+        <w:t xml:space="preserve">. However, </w:t>
+      </w:r>
+      <w:r>
+        <w:t>it contains supplier information that could identify individuals</w:t>
+      </w:r>
+      <w:r>
+        <w:t>. U</w:t>
+      </w:r>
+      <w:r>
+        <w:t xml:space="preserve">nnecessary identifying information will be excluded in line with GDPR principles. The data will be stored securely, and the raw dataset will not </w:t>
+      </w:r>
+      <w:r>
+        <w:t>be shared publicly on any platforms.</w:t>
       </w:r>
       <w:r>
         <w:br w:type="page"/>
@@ -4034,12 +3943,12 @@
       <w:pPr>
         <w:pStyle w:val="Heading1"/>
       </w:pPr>
-      <w:bookmarkStart w:id="16" w:name="_Toc243421308"/>
+      <w:bookmarkStart w:id="17" w:name="_Toc243484733"/>
       <w:r>
         <w:lastRenderedPageBreak/>
         <w:t>References</w:t>
       </w:r>
-      <w:bookmarkEnd w:id="16"/>
+      <w:bookmarkEnd w:id="17"/>
     </w:p>
     <w:p>
       <w:pPr>
@@ -4252,14 +4161,14 @@
       <w:pPr>
         <w:pStyle w:val="Heading1"/>
       </w:pPr>
-      <w:bookmarkStart w:id="17" w:name="_heading=h.kfkjs3rwl2c1" w:colFirst="0" w:colLast="0"/>
-      <w:bookmarkStart w:id="18" w:name="_Toc243421309"/>
-      <w:bookmarkEnd w:id="17"/>
+      <w:bookmarkStart w:id="18" w:name="_heading=h.kfkjs3rwl2c1" w:colFirst="0" w:colLast="0"/>
+      <w:bookmarkStart w:id="19" w:name="_Toc243484734"/>
+      <w:bookmarkEnd w:id="18"/>
       <w:r>
         <w:lastRenderedPageBreak/>
         <w:t>Appendix</w:t>
       </w:r>
-      <w:bookmarkEnd w:id="18"/>
+      <w:bookmarkEnd w:id="19"/>
     </w:p>
     <w:p/>
     <w:p>
@@ -4314,12 +4223,10 @@
           <w:color w:val="FF0000"/>
         </w:rPr>
       </w:pPr>
-      <w:bookmarkStart w:id="19" w:name="_GoBack"/>
-      <w:bookmarkEnd w:id="19"/>
     </w:p>
     <w:p/>
     <w:sectPr>
-      <w:footerReference w:type="default" r:id="rId16"/>
+      <w:footerReference w:type="default" r:id="rId17"/>
       <w:pgSz w:w="11906" w:h="16838"/>
       <w:pgMar w:top="1440" w:right="1440" w:bottom="1440" w:left="1440" w:header="708" w:footer="708" w:gutter="0"/>
       <w:pgNumType w:start="1"/>
@@ -6456,6 +6363,18 @@
       <w:spacing w:after="240" w:line="240" w:lineRule="auto"/>
     </w:pPr>
   </w:style>
+  <w:style w:type="character" w:styleId="FollowedHyperlink">
+    <w:name w:val="FollowedHyperlink"/>
+    <w:basedOn w:val="DefaultParagraphFont"/>
+    <w:uiPriority w:val="99"/>
+    <w:semiHidden/>
+    <w:unhideWhenUsed/>
+    <w:rsid w:val="004417F9"/>
+    <w:rPr>
+      <w:color w:val="96607D" w:themeColor="followedHyperlink"/>
+      <w:u w:val="single"/>
+    </w:rPr>
+  </w:style>
 </w:styles>
 </file>
 
@@ -6755,23 +6674,6 @@
 </file>
 
 <file path=customXml/item1.xml><?xml version="1.0" encoding="utf-8"?>
-<p:properties xmlns:p="http://schemas.microsoft.com/office/2006/metadata/properties" xmlns:xsi="http://www.w3.org/2001/XMLSchema-instance" xmlns:pc="http://schemas.microsoft.com/office/infopath/2007/PartnerControls">
-  <documentManagement>
-    <_activity xmlns="b16a9495-4dfd-42d3-807b-98cb11f03b43" xsi:nil="true"/>
-  </documentManagement>
-</p:properties>
-</file>
-
-<file path=customXml/item2.xml><?xml version="1.0" encoding="utf-8"?>
-<?mso-contentType ?>
-<FormTemplates xmlns="http://schemas.microsoft.com/sharepoint/v3/contenttype/forms">
-  <Display>DocumentLibraryForm</Display>
-  <Edit>DocumentLibraryForm</Edit>
-  <New>DocumentLibraryForm</New>
-</FormTemplates>
-</file>
-
-<file path=customXml/item3.xml><?xml version="1.0" encoding="utf-8"?>
 <ct:contentTypeSchema xmlns:ct="http://schemas.microsoft.com/office/2006/metadata/contentType" xmlns:ma="http://schemas.microsoft.com/office/2006/metadata/properties/metaAttributes" ct:_="" ma:_="" ma:contentTypeName="Document" ma:contentTypeID="0x01010091CA7052A48FB44E8BAE44044031FC77" ma:contentTypeVersion="5" ma:contentTypeDescription="Create a new document." ma:contentTypeScope="" ma:versionID="72110da391d7bf7bbbd9879cda66318c">
   <xsd:schema xmlns:xsd="http://www.w3.org/2001/XMLSchema" xmlns:xs="http://www.w3.org/2001/XMLSchema" xmlns:p="http://schemas.microsoft.com/office/2006/metadata/properties" xmlns:ns3="b16a9495-4dfd-42d3-807b-98cb11f03b43" targetNamespace="http://schemas.microsoft.com/office/2006/metadata/properties" ma:root="true" ma:fieldsID="65d4c4ab10123b5e2192ffab3149626d" ns3:_="">
     <xsd:import namespace="b16a9495-4dfd-42d3-807b-98cb11f03b43"/>
@@ -6921,6 +6823,23 @@
 </ct:contentTypeSchema>
 </file>
 
+<file path=customXml/item2.xml><?xml version="1.0" encoding="utf-8"?>
+<?mso-contentType ?>
+<FormTemplates xmlns="http://schemas.microsoft.com/sharepoint/v3/contenttype/forms">
+  <Display>DocumentLibraryForm</Display>
+  <Edit>DocumentLibraryForm</Edit>
+  <New>DocumentLibraryForm</New>
+</FormTemplates>
+</file>
+
+<file path=customXml/item3.xml><?xml version="1.0" encoding="utf-8"?>
+<p:properties xmlns:p="http://schemas.microsoft.com/office/2006/metadata/properties" xmlns:xsi="http://www.w3.org/2001/XMLSchema-instance" xmlns:pc="http://schemas.microsoft.com/office/infopath/2007/PartnerControls">
+  <documentManagement>
+    <_activity xmlns="b16a9495-4dfd-42d3-807b-98cb11f03b43" xsi:nil="true"/>
+  </documentManagement>
+</p:properties>
+</file>
+
 <file path=customXml/item4.xml><?xml version="1.0" encoding="utf-8"?>
 <go:gDocsCustomXmlDataStorage xmlns:go="http://customooxmlschemas.google.com/" xmlns:r="http://schemas.openxmlformats.org/officeDocument/2006/relationships" uri="GoogleDocsCustomDataVersion2">
   <go:docsCustomData xmlns:go="http://customooxmlschemas.google.com/" roundtripDataSignature="AMtx7miehlgh2pzFvkmpnhkVaeODs3Wnuw==">CgMxLjAyCGguZ2pkZ3hzMgloLjMwajB6bGwyCWguMWZvYjl0ZTIJaC4zem55c2g3MgloLjJldDkycDAyDmgua2ZranMzcndsMmMxOAByITF6bEVRVXYyWkdtTjZWemdfYk5uaGpmb0x1c2hhYUo3dw==</go:docsCustomData>
@@ -6932,24 +6851,6 @@
 </file>
 
 <file path=customXml/itemProps1.xml><?xml version="1.0" encoding="utf-8"?>
-<ds:datastoreItem xmlns:ds="http://schemas.openxmlformats.org/officeDocument/2006/customXml" ds:itemID="{D51EB97A-8C7A-4EE1-A3AD-E57FDBFA6BEE}">
-  <ds:schemaRefs>
-    <ds:schemaRef ds:uri="http://schemas.microsoft.com/office/2006/metadata/properties"/>
-    <ds:schemaRef ds:uri="http://schemas.microsoft.com/office/infopath/2007/PartnerControls"/>
-    <ds:schemaRef ds:uri="b16a9495-4dfd-42d3-807b-98cb11f03b43"/>
-  </ds:schemaRefs>
-</ds:datastoreItem>
-</file>
-
-<file path=customXml/itemProps2.xml><?xml version="1.0" encoding="utf-8"?>
-<ds:datastoreItem xmlns:ds="http://schemas.openxmlformats.org/officeDocument/2006/customXml" ds:itemID="{AD64260C-1345-4C21-A804-B9FBE7B91489}">
-  <ds:schemaRefs>
-    <ds:schemaRef ds:uri="http://schemas.microsoft.com/sharepoint/v3/contenttype/forms"/>
-  </ds:schemaRefs>
-</ds:datastoreItem>
-</file>
-
-<file path=customXml/itemProps3.xml><?xml version="1.0" encoding="utf-8"?>
 <ds:datastoreItem xmlns:ds="http://schemas.openxmlformats.org/officeDocument/2006/customXml" ds:itemID="{1CD39011-2B34-4226-8638-59B13D86301D}">
   <ds:schemaRefs>
     <ds:schemaRef ds:uri="http://schemas.microsoft.com/office/2006/metadata/contentType"/>
@@ -6967,6 +6868,24 @@
 </ds:datastoreItem>
 </file>
 
+<file path=customXml/itemProps2.xml><?xml version="1.0" encoding="utf-8"?>
+<ds:datastoreItem xmlns:ds="http://schemas.openxmlformats.org/officeDocument/2006/customXml" ds:itemID="{AD64260C-1345-4C21-A804-B9FBE7B91489}">
+  <ds:schemaRefs>
+    <ds:schemaRef ds:uri="http://schemas.microsoft.com/sharepoint/v3/contenttype/forms"/>
+  </ds:schemaRefs>
+</ds:datastoreItem>
+</file>
+
+<file path=customXml/itemProps3.xml><?xml version="1.0" encoding="utf-8"?>
+<ds:datastoreItem xmlns:ds="http://schemas.openxmlformats.org/officeDocument/2006/customXml" ds:itemID="{D51EB97A-8C7A-4EE1-A3AD-E57FDBFA6BEE}">
+  <ds:schemaRefs>
+    <ds:schemaRef ds:uri="http://schemas.microsoft.com/office/2006/metadata/properties"/>
+    <ds:schemaRef ds:uri="http://schemas.microsoft.com/office/infopath/2007/PartnerControls"/>
+    <ds:schemaRef ds:uri="b16a9495-4dfd-42d3-807b-98cb11f03b43"/>
+  </ds:schemaRefs>
+</ds:datastoreItem>
+</file>
+
 <file path=customXml/itemProps4.xml><?xml version="1.0" encoding="utf-8"?>
 <ds:datastoreItem xmlns:ds="http://schemas.openxmlformats.org/officeDocument/2006/customXml" ds:itemID="{11111111-1234-1234-1234-123412341234}">
   <ds:schemaRefs>
@@ -6977,7 +6896,7 @@
 </file>
 
 <file path=customXml/itemProps5.xml><?xml version="1.0" encoding="utf-8"?>
-<ds:datastoreItem xmlns:ds="http://schemas.openxmlformats.org/officeDocument/2006/customXml" ds:itemID="{1941F259-67F1-4701-B9A1-0FD9F1912EDE}">
+<ds:datastoreItem xmlns:ds="http://schemas.openxmlformats.org/officeDocument/2006/customXml" ds:itemID="{70A66EA7-C8ED-448E-94E0-AEDFE5CCCEEE}">
   <ds:schemaRefs>
     <ds:schemaRef ds:uri="http://schemas.openxmlformats.org/officeDocument/2006/bibliography"/>
   </ds:schemaRefs>

</xml_diff>

<commit_message>
Project Proposal done & revised
</commit_message>
<xml_diff>
--- a/CA 1 – Capstone Project Proposal.docx
+++ b/CA 1 – Capstone Project Proposal.docx
@@ -641,25 +641,7 @@
                   <w:sz w:val="28"/>
                   <w:szCs w:val="32"/>
                 </w:rPr>
-                <w:t>https://github.com/brunoesp</w:t>
-              </w:r>
-              <w:r>
-                <w:rPr>
-                  <w:rStyle w:val="Hyperlink"/>
-                  <w:i/>
-                  <w:sz w:val="28"/>
-                  <w:szCs w:val="32"/>
-                </w:rPr>
-                <w:t>o</w:t>
-              </w:r>
-              <w:r>
-                <w:rPr>
-                  <w:rStyle w:val="Hyperlink"/>
-                  <w:i/>
-                  <w:sz w:val="28"/>
-                  <w:szCs w:val="32"/>
-                </w:rPr>
-                <w:t>stocct/Capstone-Project-2026</w:t>
+                <w:t>https://github.com/brunoespostocct/Capstone-Project-2026</w:t>
               </w:r>
             </w:hyperlink>
           </w:p>
@@ -1086,7 +1068,7 @@
           <w:r>
             <w:fldChar w:fldCharType="separate"/>
           </w:r>
-          <w:hyperlink w:anchor="_Toc243484717" w:history="1">
+          <w:hyperlink w:anchor="_Toc243637584" w:history="1">
             <w:r>
               <w:rPr>
                 <w:rStyle w:val="Hyperlink"/>
@@ -1113,7 +1095,7 @@
                 <w:noProof/>
                 <w:webHidden/>
               </w:rPr>
-              <w:instrText xml:space="preserve"> PAGEREF _Toc243484717 \h </w:instrText>
+              <w:instrText xml:space="preserve"> PAGEREF _Toc243637584 \h </w:instrText>
             </w:r>
             <w:r>
               <w:rPr>
@@ -1156,7 +1138,7 @@
               <w:sz w:val="22"/>
             </w:rPr>
           </w:pPr>
-          <w:hyperlink w:anchor="_Toc243484718" w:history="1">
+          <w:hyperlink w:anchor="_Toc243637585" w:history="1">
             <w:r>
               <w:rPr>
                 <w:rStyle w:val="Hyperlink"/>
@@ -1183,7 +1165,7 @@
                 <w:noProof/>
                 <w:webHidden/>
               </w:rPr>
-              <w:instrText xml:space="preserve"> PAGEREF _Toc243484718 \h </w:instrText>
+              <w:instrText xml:space="preserve"> PAGEREF _Toc243637585 \h </w:instrText>
             </w:r>
             <w:r>
               <w:rPr>
@@ -1226,7 +1208,7 @@
               <w:sz w:val="22"/>
             </w:rPr>
           </w:pPr>
-          <w:hyperlink w:anchor="_Toc243484719" w:history="1">
+          <w:hyperlink w:anchor="_Toc243637586" w:history="1">
             <w:r>
               <w:rPr>
                 <w:rStyle w:val="Hyperlink"/>
@@ -1253,7 +1235,7 @@
                 <w:noProof/>
                 <w:webHidden/>
               </w:rPr>
-              <w:instrText xml:space="preserve"> PAGEREF _Toc243484719 \h </w:instrText>
+              <w:instrText xml:space="preserve"> PAGEREF _Toc243637586 \h </w:instrText>
             </w:r>
             <w:r>
               <w:rPr>
@@ -1296,7 +1278,7 @@
               <w:sz w:val="22"/>
             </w:rPr>
           </w:pPr>
-          <w:hyperlink w:anchor="_Toc243484720" w:history="1">
+          <w:hyperlink w:anchor="_Toc243637587" w:history="1">
             <w:r>
               <w:rPr>
                 <w:rStyle w:val="Hyperlink"/>
@@ -1323,7 +1305,7 @@
                 <w:noProof/>
                 <w:webHidden/>
               </w:rPr>
-              <w:instrText xml:space="preserve"> PAGEREF _Toc243484720 \h </w:instrText>
+              <w:instrText xml:space="preserve"> PAGEREF _Toc243637587 \h </w:instrText>
             </w:r>
             <w:r>
               <w:rPr>
@@ -1366,7 +1348,7 @@
               <w:sz w:val="22"/>
             </w:rPr>
           </w:pPr>
-          <w:hyperlink w:anchor="_Toc243484721" w:history="1">
+          <w:hyperlink w:anchor="_Toc243637588" w:history="1">
             <w:r>
               <w:rPr>
                 <w:rStyle w:val="Hyperlink"/>
@@ -1394,7 +1376,7 @@
                 <w:noProof/>
                 <w:webHidden/>
               </w:rPr>
-              <w:instrText xml:space="preserve"> PAGEREF _Toc243484721 \h </w:instrText>
+              <w:instrText xml:space="preserve"> PAGEREF _Toc243637588 \h </w:instrText>
             </w:r>
             <w:r>
               <w:rPr>
@@ -1437,7 +1419,7 @@
               <w:sz w:val="22"/>
             </w:rPr>
           </w:pPr>
-          <w:hyperlink w:anchor="_Toc243484722" w:history="1">
+          <w:hyperlink w:anchor="_Toc243637589" w:history="1">
             <w:r>
               <w:rPr>
                 <w:rStyle w:val="Hyperlink"/>
@@ -1465,7 +1447,7 @@
                 <w:noProof/>
                 <w:webHidden/>
               </w:rPr>
-              <w:instrText xml:space="preserve"> PAGEREF _Toc243484722 \h </w:instrText>
+              <w:instrText xml:space="preserve"> PAGEREF _Toc243637589 \h </w:instrText>
             </w:r>
             <w:r>
               <w:rPr>
@@ -1508,7 +1490,7 @@
               <w:sz w:val="22"/>
             </w:rPr>
           </w:pPr>
-          <w:hyperlink w:anchor="_Toc243484723" w:history="1">
+          <w:hyperlink w:anchor="_Toc243637590" w:history="1">
             <w:r>
               <w:rPr>
                 <w:rStyle w:val="Hyperlink"/>
@@ -1535,7 +1517,7 @@
                 <w:noProof/>
                 <w:webHidden/>
               </w:rPr>
-              <w:instrText xml:space="preserve"> PAGEREF _Toc243484723 \h </w:instrText>
+              <w:instrText xml:space="preserve"> PAGEREF _Toc243637590 \h </w:instrText>
             </w:r>
             <w:r>
               <w:rPr>
@@ -1578,7 +1560,7 @@
               <w:sz w:val="22"/>
             </w:rPr>
           </w:pPr>
-          <w:hyperlink w:anchor="_Toc243484724" w:history="1">
+          <w:hyperlink w:anchor="_Toc243637591" w:history="1">
             <w:r>
               <w:rPr>
                 <w:rStyle w:val="Hyperlink"/>
@@ -1605,7 +1587,7 @@
                 <w:noProof/>
                 <w:webHidden/>
               </w:rPr>
-              <w:instrText xml:space="preserve"> PAGEREF _Toc243484724 \h </w:instrText>
+              <w:instrText xml:space="preserve"> PAGEREF _Toc243637591 \h </w:instrText>
             </w:r>
             <w:r>
               <w:rPr>
@@ -1648,7 +1630,7 @@
               <w:sz w:val="22"/>
             </w:rPr>
           </w:pPr>
-          <w:hyperlink w:anchor="_Toc243484725" w:history="1">
+          <w:hyperlink w:anchor="_Toc243637592" w:history="1">
             <w:r>
               <w:rPr>
                 <w:rStyle w:val="Hyperlink"/>
@@ -1675,7 +1657,7 @@
                 <w:noProof/>
                 <w:webHidden/>
               </w:rPr>
-              <w:instrText xml:space="preserve"> PAGEREF _Toc243484725 \h </w:instrText>
+              <w:instrText xml:space="preserve"> PAGEREF _Toc243637592 \h </w:instrText>
             </w:r>
             <w:r>
               <w:rPr>
@@ -1718,7 +1700,7 @@
               <w:sz w:val="22"/>
             </w:rPr>
           </w:pPr>
-          <w:hyperlink w:anchor="_Toc243484726" w:history="1">
+          <w:hyperlink w:anchor="_Toc243637593" w:history="1">
             <w:r>
               <w:rPr>
                 <w:rStyle w:val="Hyperlink"/>
@@ -1745,7 +1727,7 @@
                 <w:noProof/>
                 <w:webHidden/>
               </w:rPr>
-              <w:instrText xml:space="preserve"> PAGEREF _Toc243484726 \h </w:instrText>
+              <w:instrText xml:space="preserve"> PAGEREF _Toc243637593 \h </w:instrText>
             </w:r>
             <w:r>
               <w:rPr>
@@ -1788,7 +1770,7 @@
               <w:sz w:val="22"/>
             </w:rPr>
           </w:pPr>
-          <w:hyperlink w:anchor="_Toc243484727" w:history="1">
+          <w:hyperlink w:anchor="_Toc243637594" w:history="1">
             <w:r>
               <w:rPr>
                 <w:rStyle w:val="Hyperlink"/>
@@ -1815,7 +1797,7 @@
                 <w:noProof/>
                 <w:webHidden/>
               </w:rPr>
-              <w:instrText xml:space="preserve"> PAGEREF _Toc243484727 \h </w:instrText>
+              <w:instrText xml:space="preserve"> PAGEREF _Toc243637594 \h </w:instrText>
             </w:r>
             <w:r>
               <w:rPr>
@@ -1858,7 +1840,7 @@
               <w:sz w:val="22"/>
             </w:rPr>
           </w:pPr>
-          <w:hyperlink w:anchor="_Toc243484728" w:history="1">
+          <w:hyperlink w:anchor="_Toc243637595" w:history="1">
             <w:r>
               <w:rPr>
                 <w:rStyle w:val="Hyperlink"/>
@@ -1885,7 +1867,7 @@
                 <w:noProof/>
                 <w:webHidden/>
               </w:rPr>
-              <w:instrText xml:space="preserve"> PAGEREF _Toc243484728 \h </w:instrText>
+              <w:instrText xml:space="preserve"> PAGEREF _Toc243637595 \h </w:instrText>
             </w:r>
             <w:r>
               <w:rPr>
@@ -1928,7 +1910,7 @@
               <w:sz w:val="22"/>
             </w:rPr>
           </w:pPr>
-          <w:hyperlink w:anchor="_Toc243484729" w:history="1">
+          <w:hyperlink w:anchor="_Toc243637596" w:history="1">
             <w:r>
               <w:rPr>
                 <w:rStyle w:val="Hyperlink"/>
@@ -1955,7 +1937,7 @@
                 <w:noProof/>
                 <w:webHidden/>
               </w:rPr>
-              <w:instrText xml:space="preserve"> PAGEREF _Toc243484729 \h </w:instrText>
+              <w:instrText xml:space="preserve"> PAGEREF _Toc243637596 \h </w:instrText>
             </w:r>
             <w:r>
               <w:rPr>
@@ -1998,7 +1980,7 @@
               <w:sz w:val="22"/>
             </w:rPr>
           </w:pPr>
-          <w:hyperlink w:anchor="_Toc243484730" w:history="1">
+          <w:hyperlink w:anchor="_Toc243637597" w:history="1">
             <w:r>
               <w:rPr>
                 <w:rStyle w:val="Hyperlink"/>
@@ -2025,7 +2007,7 @@
                 <w:noProof/>
                 <w:webHidden/>
               </w:rPr>
-              <w:instrText xml:space="preserve"> PAGEREF _Toc243484730 \h </w:instrText>
+              <w:instrText xml:space="preserve"> PAGEREF _Toc243637597 \h </w:instrText>
             </w:r>
             <w:r>
               <w:rPr>
@@ -2068,7 +2050,7 @@
               <w:sz w:val="22"/>
             </w:rPr>
           </w:pPr>
-          <w:hyperlink w:anchor="_Toc243484731" w:history="1">
+          <w:hyperlink w:anchor="_Toc243637598" w:history="1">
             <w:r>
               <w:rPr>
                 <w:rStyle w:val="Hyperlink"/>
@@ -2095,7 +2077,7 @@
                 <w:noProof/>
                 <w:webHidden/>
               </w:rPr>
-              <w:instrText xml:space="preserve"> PAGEREF _Toc243484731 \h </w:instrText>
+              <w:instrText xml:space="preserve"> PAGEREF _Toc243637598 \h </w:instrText>
             </w:r>
             <w:r>
               <w:rPr>
@@ -2138,7 +2120,7 @@
               <w:sz w:val="22"/>
             </w:rPr>
           </w:pPr>
-          <w:hyperlink w:anchor="_Toc243484732" w:history="1">
+          <w:hyperlink w:anchor="_Toc243637599" w:history="1">
             <w:r>
               <w:rPr>
                 <w:rStyle w:val="Hyperlink"/>
@@ -2165,7 +2147,7 @@
                 <w:noProof/>
                 <w:webHidden/>
               </w:rPr>
-              <w:instrText xml:space="preserve"> PAGEREF _Toc243484732 \h </w:instrText>
+              <w:instrText xml:space="preserve"> PAGEREF _Toc243637599 \h </w:instrText>
             </w:r>
             <w:r>
               <w:rPr>
@@ -2208,7 +2190,7 @@
               <w:sz w:val="22"/>
             </w:rPr>
           </w:pPr>
-          <w:hyperlink w:anchor="_Toc243484733" w:history="1">
+          <w:hyperlink w:anchor="_Toc243637600" w:history="1">
             <w:r>
               <w:rPr>
                 <w:rStyle w:val="Hyperlink"/>
@@ -2235,7 +2217,7 @@
                 <w:noProof/>
                 <w:webHidden/>
               </w:rPr>
-              <w:instrText xml:space="preserve"> PAGEREF _Toc243484733 \h </w:instrText>
+              <w:instrText xml:space="preserve"> PAGEREF _Toc243637600 \h </w:instrText>
             </w:r>
             <w:r>
               <w:rPr>
@@ -2278,7 +2260,7 @@
               <w:sz w:val="22"/>
             </w:rPr>
           </w:pPr>
-          <w:hyperlink w:anchor="_Toc243484734" w:history="1">
+          <w:hyperlink w:anchor="_Toc243637601" w:history="1">
             <w:r>
               <w:rPr>
                 <w:rStyle w:val="Hyperlink"/>
@@ -2305,7 +2287,7 @@
                 <w:noProof/>
                 <w:webHidden/>
               </w:rPr>
-              <w:instrText xml:space="preserve"> PAGEREF _Toc243484734 \h </w:instrText>
+              <w:instrText xml:space="preserve"> PAGEREF _Toc243637601 \h </w:instrText>
             </w:r>
             <w:r>
               <w:rPr>
@@ -2361,7 +2343,7 @@
         <w:pStyle w:val="Heading1"/>
         <w:spacing w:after="0"/>
       </w:pPr>
-      <w:bookmarkStart w:id="1" w:name="_Toc243484717"/>
+      <w:bookmarkStart w:id="1" w:name="_Toc243637584"/>
       <w:r>
         <w:lastRenderedPageBreak/>
         <w:t>1. Project Title</w:t>
@@ -2370,14 +2352,14 @@
     </w:p>
     <w:p>
       <w:r>
-        <w:t>To be defined.</w:t>
+        <w:t>Predicting Tender Competition to Support Supplier Decision-Making</w:t>
       </w:r>
     </w:p>
     <w:p>
       <w:pPr>
         <w:pStyle w:val="Heading1"/>
       </w:pPr>
-      <w:bookmarkStart w:id="2" w:name="_Toc243484718"/>
+      <w:bookmarkStart w:id="2" w:name="_Toc243637585"/>
       <w:r>
         <w:t>2. Introduction</w:t>
       </w:r>
@@ -2426,7 +2408,7 @@
         <w:rPr>
           <w:lang w:eastAsia="en-GB"/>
         </w:rPr>
-        <w:t>’s analysis of 2018 covered 4,413 tender notices, an average of about 370 a month,</w:t>
+        <w:t>’s analysis of 2018 covered 4,413 tender notices, an average of about 370 a month</w:t>
       </w:r>
       <w:r>
         <w:rPr>
@@ -2507,7 +2489,19 @@
         <w:rPr>
           <w:lang w:eastAsia="en-GB"/>
         </w:rPr>
-        <w:t xml:space="preserve">With this volume of notices, monitoring and assessing opportunities is a demanding task, </w:t>
+        <w:t xml:space="preserve">With this volume of </w:t>
+      </w:r>
+      <w:r>
+        <w:rPr>
+          <w:lang w:eastAsia="en-GB"/>
+        </w:rPr>
+        <w:t>tenders</w:t>
+      </w:r>
+      <w:r>
+        <w:rPr>
+          <w:lang w:eastAsia="en-GB"/>
+        </w:rPr>
+        <w:t xml:space="preserve">, monitoring and assessing opportunities is a demanding task, </w:t>
       </w:r>
       <w:r>
         <w:rPr>
@@ -2759,19 +2753,7 @@
         <w:rPr>
           <w:lang w:eastAsia="en-GB"/>
         </w:rPr>
-        <w:t xml:space="preserve">Competition is </w:t>
-      </w:r>
-      <w:r>
-        <w:rPr>
-          <w:lang w:eastAsia="en-GB"/>
-        </w:rPr>
-        <w:t>also an</w:t>
-      </w:r>
-      <w:r>
-        <w:rPr>
-          <w:lang w:eastAsia="en-GB"/>
-        </w:rPr>
-        <w:t xml:space="preserve"> important aspect of public procurement. The number of bids received is commonly used as a measure of competition in a tender </w:t>
+        <w:t xml:space="preserve">The number of bids received is commonly used as a measure of competition in a tender </w:t>
       </w:r>
       <w:r>
         <w:rPr>
@@ -3157,7 +3139,7 @@
       <w:pPr>
         <w:pStyle w:val="Heading1"/>
       </w:pPr>
-      <w:bookmarkStart w:id="3" w:name="_Toc243484719"/>
+      <w:bookmarkStart w:id="3" w:name="_Toc243637586"/>
       <w:r>
         <w:lastRenderedPageBreak/>
         <w:t>3. Problem Definition</w:t>
@@ -3222,7 +3204,7 @@
         <w:rPr>
           <w:lang w:eastAsia="en-GB"/>
         </w:rPr>
-        <w:t>. However, information about how many competitors are likely to bid is not readily available when this decision is made, so suppliers often rely on experience or intuition. Without insights into likely level competition, suppliers may spend valuable time preparing bids for highly competitive tenders while overlooking opportunities that may attract fewer bidders. A better-informed screening process would allow SMEs to prioritise their effort, and it could also support wider participation in public procurement.</w:t>
+        <w:t>. However, information about how many competitors are likely to bid is not readily available when this decision is made, so suppliers often rely on experience or intuition. Without insights into likely level competition, suppliers may spend valuable time preparing bids for highly competitive tenders while overlooking opportunities that may attract fewer bidders.</w:t>
       </w:r>
     </w:p>
     <w:p>
@@ -3293,7 +3275,7 @@
       <w:pPr>
         <w:pStyle w:val="Heading1"/>
       </w:pPr>
-      <w:bookmarkStart w:id="4" w:name="_Toc243484720"/>
+      <w:bookmarkStart w:id="4" w:name="_Toc243637587"/>
       <w:r>
         <w:t>4. Aim and Objectives</w:t>
       </w:r>
@@ -3306,7 +3288,7 @@
           <w:lang w:eastAsia="en-GB"/>
         </w:rPr>
       </w:pPr>
-      <w:bookmarkStart w:id="5" w:name="_Toc243484721"/>
+      <w:bookmarkStart w:id="5" w:name="_Toc243637588"/>
       <w:r>
         <w:rPr>
           <w:lang w:eastAsia="en-GB"/>
@@ -3343,7 +3325,7 @@
           <w:lang w:eastAsia="en-GB"/>
         </w:rPr>
       </w:pPr>
-      <w:bookmarkStart w:id="6" w:name="_Toc243484722"/>
+      <w:bookmarkStart w:id="6" w:name="_Toc243637589"/>
       <w:r>
         <w:rPr>
           <w:lang w:eastAsia="en-GB"/>
@@ -3405,16 +3387,16 @@
         <w:rPr>
           <w:lang w:eastAsia="en-GB"/>
         </w:rPr>
-        <w:lastRenderedPageBreak/>
-        <w:t>4. Business objective: Assess whether the predictions could provide suppliers with an additional indicator of likely competition to support the screening and prioritisation of tender opportunities.</w:t>
+        <w:t>4. Business objective: Assess whether the predictions could provide suppliers with an additional indicator of likely competition to support the screening of tender opportunities.</w:t>
       </w:r>
     </w:p>
     <w:p>
       <w:pPr>
         <w:pStyle w:val="Heading1"/>
       </w:pPr>
-      <w:bookmarkStart w:id="7" w:name="_Toc243484723"/>
-      <w:r>
+      <w:bookmarkStart w:id="7" w:name="_Toc243637590"/>
+      <w:r>
+        <w:lastRenderedPageBreak/>
         <w:t>5. Scope</w:t>
       </w:r>
       <w:bookmarkEnd w:id="7"/>
@@ -3452,7 +3434,7 @@
       <w:pPr>
         <w:pStyle w:val="Heading1"/>
       </w:pPr>
-      <w:bookmarkStart w:id="8" w:name="_Toc243484724"/>
+      <w:bookmarkStart w:id="8" w:name="_Toc243637591"/>
       <w:r>
         <w:t>6. Methodology</w:t>
       </w:r>
@@ -3462,7 +3444,7 @@
       <w:pPr>
         <w:pStyle w:val="Heading2"/>
       </w:pPr>
-      <w:bookmarkStart w:id="9" w:name="_Toc243484725"/>
+      <w:bookmarkStart w:id="9" w:name="_Toc243637592"/>
       <w:r>
         <w:t>6.1 Data Collection and Preparation</w:t>
       </w:r>
@@ -3523,7 +3505,7 @@
       <w:pPr>
         <w:pStyle w:val="Heading2"/>
       </w:pPr>
-      <w:bookmarkStart w:id="10" w:name="_Toc243484726"/>
+      <w:bookmarkStart w:id="10" w:name="_Toc243637593"/>
       <w:r>
         <w:t>6.2 Predictive Modelling</w:t>
       </w:r>
@@ -3591,7 +3573,7 @@
       <w:pPr>
         <w:pStyle w:val="Heading2"/>
       </w:pPr>
-      <w:bookmarkStart w:id="11" w:name="_Toc243484727"/>
+      <w:bookmarkStart w:id="11" w:name="_Toc243637594"/>
       <w:r>
         <w:t>6.3 Model Evaluation</w:t>
       </w:r>
@@ -3635,11 +3617,7 @@
         <w:t xml:space="preserve"> will be discussed</w:t>
       </w:r>
       <w:r>
-        <w:t xml:space="preserve"> along with their potential usefulness for supplier </w:t>
-      </w:r>
-      <w:r>
-        <w:lastRenderedPageBreak/>
-        <w:t xml:space="preserve">tender screening. </w:t>
+        <w:t xml:space="preserve"> along with their potential usefulness for supplier tender screening. </w:t>
       </w:r>
       <w:r>
         <w:t>The evaluation will help determine which model performs better and whether its predictions could provide useful information to suppliers</w:t>
@@ -3657,8 +3635,9 @@
       <w:pPr>
         <w:pStyle w:val="Heading2"/>
       </w:pPr>
-      <w:bookmarkStart w:id="12" w:name="_Toc243484728"/>
-      <w:r>
+      <w:bookmarkStart w:id="12" w:name="_Toc243637595"/>
+      <w:r>
+        <w:lastRenderedPageBreak/>
         <w:t>6.4 Architecture Diagram</w:t>
       </w:r>
       <w:bookmarkEnd w:id="12"/>
@@ -3741,7 +3720,7 @@
       <w:pPr>
         <w:pStyle w:val="Heading1"/>
       </w:pPr>
-      <w:bookmarkStart w:id="13" w:name="_Toc243484729"/>
+      <w:bookmarkStart w:id="13" w:name="_Toc243637596"/>
       <w:r>
         <w:t>7. Data Sources</w:t>
       </w:r>
@@ -3780,7 +3759,7 @@
       <w:pPr>
         <w:pStyle w:val="Heading1"/>
       </w:pPr>
-      <w:bookmarkStart w:id="14" w:name="_Toc243484730"/>
+      <w:bookmarkStart w:id="14" w:name="_Toc243637597"/>
       <w:r>
         <w:t>8. Expected Deliverables</w:t>
       </w:r>
@@ -3814,7 +3793,7 @@
       <w:pPr>
         <w:pStyle w:val="Heading1"/>
       </w:pPr>
-      <w:bookmarkStart w:id="15" w:name="_Toc243484731"/>
+      <w:bookmarkStart w:id="15" w:name="_Toc243637598"/>
       <w:r>
         <w:lastRenderedPageBreak/>
         <w:t>9. Project Timeline</w:t>
@@ -3886,7 +3865,7 @@
       <w:pPr>
         <w:pStyle w:val="Heading1"/>
       </w:pPr>
-      <w:bookmarkStart w:id="16" w:name="_Toc243484732"/>
+      <w:bookmarkStart w:id="16" w:name="_Toc243637599"/>
       <w:r>
         <w:t>10. Ethical and Legal Considerations</w:t>
       </w:r>
@@ -3943,7 +3922,7 @@
       <w:pPr>
         <w:pStyle w:val="Heading1"/>
       </w:pPr>
-      <w:bookmarkStart w:id="17" w:name="_Toc243484733"/>
+      <w:bookmarkStart w:id="17" w:name="_Toc243637600"/>
       <w:r>
         <w:lastRenderedPageBreak/>
         <w:t>References</w:t>
@@ -4149,20 +4128,21 @@
         <w:rPr>
           <w:color w:val="FF0000"/>
         </w:rPr>
-      </w:pPr>
-      <w:r>
-        <w:rPr>
-          <w:color w:val="FF0000"/>
-        </w:rPr>
-        <w:br w:type="page"/>
-      </w:r>
+        <w:sectPr>
+          <w:footerReference w:type="default" r:id="rId17"/>
+          <w:pgSz w:w="11906" w:h="16838"/>
+          <w:pgMar w:top="1440" w:right="1440" w:bottom="1440" w:left="1440" w:header="708" w:footer="708" w:gutter="0"/>
+          <w:pgNumType w:start="1"/>
+          <w:cols w:space="720"/>
+        </w:sectPr>
+      </w:pPr>
     </w:p>
     <w:p>
       <w:pPr>
         <w:pStyle w:val="Heading1"/>
       </w:pPr>
       <w:bookmarkStart w:id="18" w:name="_heading=h.kfkjs3rwl2c1" w:colFirst="0" w:colLast="0"/>
-      <w:bookmarkStart w:id="19" w:name="_Toc243484734"/>
+      <w:bookmarkStart w:id="19" w:name="_Toc243637601"/>
       <w:bookmarkEnd w:id="18"/>
       <w:r>
         <w:lastRenderedPageBreak/>
@@ -4174,62 +4154,1174 @@
     <w:p>
       <w:pPr>
         <w:rPr>
-          <w:color w:val="FF0000"/>
-        </w:rPr>
-      </w:pPr>
+          <w:b/>
+          <w:bCs/>
+          <w:sz w:val="28"/>
+        </w:rPr>
+      </w:pPr>
+      <w:r>
+        <w:rPr>
+          <w:b/>
+          <w:sz w:val="28"/>
+        </w:rPr>
+        <w:t>AI Declaration using the AI Fluency Framework</w:t>
+      </w:r>
     </w:p>
     <w:p>
       <w:pPr>
-        <w:rPr>
-          <w:color w:val="FF0000"/>
-        </w:rPr>
-      </w:pPr>
-      <w:r>
-        <w:rPr>
-          <w:color w:val="FF0000"/>
-        </w:rPr>
-        <w:t xml:space="preserve">If you have used AI tools in your work, you must include screenshots of your requests in the appendix. </w:t>
+        <w:spacing w:line="240" w:lineRule="auto"/>
+        <w:rPr>
+          <w:i/>
+          <w:iCs/>
+          <w:color w:val="545454"/>
+          <w:sz w:val="20"/>
+          <w:szCs w:val="20"/>
+        </w:rPr>
+      </w:pPr>
+      <w:r>
+        <w:rPr>
+          <w:i/>
+          <w:iCs/>
+          <w:color w:val="545454"/>
+          <w:sz w:val="20"/>
+          <w:szCs w:val="20"/>
+        </w:rPr>
+        <w:t>For use in assessment briefs and student submissions. Lecturers complete the Lecturer Expectations column per assessment; students complete the Student Response column.</w:t>
       </w:r>
     </w:p>
     <w:p>
       <w:pPr>
-        <w:rPr>
-          <w:color w:val="FF0000"/>
-        </w:rPr>
-      </w:pPr>
-      <w:r>
-        <w:rPr>
-          <w:color w:val="FF0000"/>
-        </w:rPr>
-        <w:t>The appendix serves as a repository for additional or supplementary information that is deemed too extensive or detailed for integration into the main body of the text. This supplementary content can encompass data tables, charts, graphs, questionnaires, or any other supporting materials that contribute to a comprehensive understanding of the research.</w:t>
-      </w:r>
+        <w:spacing w:line="240" w:lineRule="auto"/>
+        <w:rPr>
+          <w:i/>
+          <w:iCs/>
+          <w:color w:val="545454"/>
+          <w:sz w:val="20"/>
+          <w:szCs w:val="20"/>
+        </w:rPr>
+      </w:pPr>
+    </w:p>
+    <w:tbl>
+      <w:tblPr>
+        <w:tblStyle w:val="TableGrid"/>
+        <w:tblW w:w="0" w:type="auto"/>
+        <w:tblLook w:val="04A0" w:firstRow="1" w:lastRow="0" w:firstColumn="1" w:lastColumn="0" w:noHBand="0" w:noVBand="1"/>
+      </w:tblPr>
+      <w:tblGrid>
+        <w:gridCol w:w="2689"/>
+        <w:gridCol w:w="3543"/>
+        <w:gridCol w:w="3544"/>
+        <w:gridCol w:w="4172"/>
+      </w:tblGrid>
+      <w:tr>
+        <w:tc>
+          <w:tcPr>
+            <w:tcW w:w="2689" w:type="dxa"/>
+            <w:vAlign w:val="center"/>
+          </w:tcPr>
+          <w:p>
+            <w:pPr>
+              <w:rPr>
+                <w:i/>
+                <w:iCs/>
+                <w:color w:val="545454"/>
+                <w:sz w:val="20"/>
+                <w:szCs w:val="20"/>
+                <w:highlight w:val="yellow"/>
+              </w:rPr>
+            </w:pPr>
+            <w:r>
+              <w:rPr>
+                <w:b/>
+                <w:bCs/>
+                <w:sz w:val="20"/>
+                <w:szCs w:val="20"/>
+              </w:rPr>
+              <w:t>AI competence</w:t>
+            </w:r>
+          </w:p>
+        </w:tc>
+        <w:tc>
+          <w:tcPr>
+            <w:tcW w:w="3543" w:type="dxa"/>
+            <w:vAlign w:val="center"/>
+          </w:tcPr>
+          <w:p>
+            <w:pPr>
+              <w:rPr>
+                <w:i/>
+                <w:iCs/>
+                <w:color w:val="545454"/>
+                <w:sz w:val="20"/>
+                <w:szCs w:val="20"/>
+                <w:highlight w:val="yellow"/>
+              </w:rPr>
+            </w:pPr>
+            <w:r>
+              <w:rPr>
+                <w:b/>
+                <w:bCs/>
+                <w:sz w:val="20"/>
+                <w:szCs w:val="20"/>
+              </w:rPr>
+              <w:t>Reflective prompts (to students)</w:t>
+            </w:r>
+          </w:p>
+        </w:tc>
+        <w:tc>
+          <w:tcPr>
+            <w:tcW w:w="3544" w:type="dxa"/>
+            <w:vAlign w:val="center"/>
+          </w:tcPr>
+          <w:p>
+            <w:pPr>
+              <w:rPr>
+                <w:i/>
+                <w:iCs/>
+                <w:color w:val="545454"/>
+                <w:sz w:val="20"/>
+                <w:szCs w:val="20"/>
+                <w:highlight w:val="yellow"/>
+              </w:rPr>
+            </w:pPr>
+            <w:r>
+              <w:rPr>
+                <w:b/>
+                <w:bCs/>
+                <w:sz w:val="20"/>
+                <w:szCs w:val="20"/>
+              </w:rPr>
+              <w:t>Lecturer expectations</w:t>
+            </w:r>
+          </w:p>
+        </w:tc>
+        <w:tc>
+          <w:tcPr>
+            <w:tcW w:w="4172" w:type="dxa"/>
+            <w:vAlign w:val="center"/>
+          </w:tcPr>
+          <w:p>
+            <w:pPr>
+              <w:rPr>
+                <w:i/>
+                <w:iCs/>
+                <w:color w:val="545454"/>
+                <w:sz w:val="20"/>
+                <w:szCs w:val="20"/>
+                <w:highlight w:val="yellow"/>
+              </w:rPr>
+            </w:pPr>
+            <w:r>
+              <w:rPr>
+                <w:b/>
+                <w:bCs/>
+                <w:sz w:val="20"/>
+                <w:szCs w:val="20"/>
+              </w:rPr>
+              <w:t>Student response</w:t>
+            </w:r>
+          </w:p>
+        </w:tc>
+      </w:tr>
+      <w:tr>
+        <w:tc>
+          <w:tcPr>
+            <w:tcW w:w="2689" w:type="dxa"/>
+          </w:tcPr>
+          <w:p>
+            <w:pPr>
+              <w:rPr>
+                <w:sz w:val="20"/>
+                <w:szCs w:val="20"/>
+              </w:rPr>
+            </w:pPr>
+            <w:r>
+              <w:rPr>
+                <w:b/>
+                <w:bCs/>
+                <w:sz w:val="20"/>
+                <w:szCs w:val="20"/>
+              </w:rPr>
+              <w:t>Delegation</w:t>
+            </w:r>
+          </w:p>
+          <w:p>
+            <w:pPr>
+              <w:rPr>
+                <w:i/>
+                <w:iCs/>
+                <w:color w:val="545454"/>
+                <w:sz w:val="20"/>
+                <w:szCs w:val="20"/>
+              </w:rPr>
+            </w:pPr>
+            <w:r>
+              <w:rPr>
+                <w:i/>
+                <w:iCs/>
+                <w:sz w:val="20"/>
+                <w:szCs w:val="20"/>
+              </w:rPr>
+              <w:t>Deciding whether &amp; when to use AI</w:t>
+            </w:r>
+          </w:p>
+        </w:tc>
+        <w:tc>
+          <w:tcPr>
+            <w:tcW w:w="3543" w:type="dxa"/>
+          </w:tcPr>
+          <w:p>
+            <w:pPr>
+              <w:rPr>
+                <w:i/>
+                <w:iCs/>
+                <w:color w:val="545454"/>
+                <w:sz w:val="20"/>
+                <w:szCs w:val="20"/>
+              </w:rPr>
+            </w:pPr>
+            <w:r>
+              <w:rPr>
+                <w:sz w:val="20"/>
+                <w:szCs w:val="20"/>
+              </w:rPr>
+              <w:t>Identify the specific tasks in this assessment where you chose to use AI, and explain your reasoning. Where did AI add value? Where did you decide not to use it, and why?</w:t>
+            </w:r>
+          </w:p>
+        </w:tc>
+        <w:tc>
+          <w:tcPr>
+            <w:tcW w:w="3544" w:type="dxa"/>
+          </w:tcPr>
+          <w:p>
+            <w:pPr>
+              <w:rPr>
+                <w:sz w:val="20"/>
+                <w:szCs w:val="20"/>
+              </w:rPr>
+            </w:pPr>
+            <w:r>
+              <w:rPr>
+                <w:sz w:val="20"/>
+                <w:szCs w:val="20"/>
+              </w:rPr>
+              <w:t>You may use AI to support your learning and development of the application. Clearly identify where you used AI and where you completed the work independently.</w:t>
+            </w:r>
+          </w:p>
+          <w:p>
+            <w:pPr>
+              <w:rPr>
+                <w:b/>
+                <w:bCs/>
+                <w:color w:val="545454"/>
+                <w:sz w:val="20"/>
+                <w:szCs w:val="20"/>
+              </w:rPr>
+            </w:pPr>
+          </w:p>
+        </w:tc>
+        <w:tc>
+          <w:tcPr>
+            <w:tcW w:w="4172" w:type="dxa"/>
+          </w:tcPr>
+          <w:p>
+            <w:pPr>
+              <w:rPr>
+                <w:color w:val="000000" w:themeColor="text1"/>
+                <w:sz w:val="20"/>
+                <w:szCs w:val="20"/>
+              </w:rPr>
+            </w:pPr>
+            <w:r>
+              <w:rPr>
+                <w:color w:val="000000" w:themeColor="text1"/>
+                <w:sz w:val="20"/>
+                <w:szCs w:val="20"/>
+              </w:rPr>
+              <w:t xml:space="preserve">1. </w:t>
+            </w:r>
+            <w:proofErr w:type="spellStart"/>
+            <w:r>
+              <w:rPr>
+                <w:color w:val="000000" w:themeColor="text1"/>
+                <w:sz w:val="20"/>
+                <w:szCs w:val="20"/>
+              </w:rPr>
+              <w:t>ChatGPT</w:t>
+            </w:r>
+            <w:proofErr w:type="spellEnd"/>
+            <w:r>
+              <w:rPr>
+                <w:color w:val="000000" w:themeColor="text1"/>
+                <w:sz w:val="20"/>
+                <w:szCs w:val="20"/>
+              </w:rPr>
+              <w:t xml:space="preserve"> was used to brainstorm ideas and help define the business problem to be investigated, </w:t>
+            </w:r>
+            <w:r>
+              <w:rPr>
+                <w:color w:val="000000" w:themeColor="text1"/>
+                <w:sz w:val="20"/>
+                <w:szCs w:val="20"/>
+              </w:rPr>
+              <w:t>based</w:t>
+            </w:r>
+            <w:r>
+              <w:rPr>
+                <w:color w:val="000000" w:themeColor="text1"/>
+                <w:sz w:val="20"/>
+                <w:szCs w:val="20"/>
+              </w:rPr>
+              <w:t xml:space="preserve"> on my previous work experience.</w:t>
+            </w:r>
+          </w:p>
+          <w:p>
+            <w:pPr>
+              <w:rPr>
+                <w:color w:val="000000" w:themeColor="text1"/>
+                <w:sz w:val="20"/>
+                <w:szCs w:val="20"/>
+              </w:rPr>
+            </w:pPr>
+          </w:p>
+          <w:p>
+            <w:pPr>
+              <w:rPr>
+                <w:color w:val="000000" w:themeColor="text1"/>
+                <w:sz w:val="20"/>
+                <w:szCs w:val="20"/>
+              </w:rPr>
+            </w:pPr>
+            <w:r>
+              <w:rPr>
+                <w:color w:val="000000" w:themeColor="text1"/>
+                <w:sz w:val="20"/>
+                <w:szCs w:val="20"/>
+              </w:rPr>
+              <w:t xml:space="preserve">2. </w:t>
+            </w:r>
+            <w:proofErr w:type="spellStart"/>
+            <w:r>
+              <w:rPr>
+                <w:color w:val="000000" w:themeColor="text1"/>
+                <w:sz w:val="20"/>
+                <w:szCs w:val="20"/>
+              </w:rPr>
+              <w:t>ChatGPT</w:t>
+            </w:r>
+            <w:proofErr w:type="spellEnd"/>
+            <w:r>
+              <w:rPr>
+                <w:color w:val="000000" w:themeColor="text1"/>
+                <w:sz w:val="20"/>
+                <w:szCs w:val="20"/>
+              </w:rPr>
+              <w:t xml:space="preserve"> was used to review and refine the text after it was written, including checking for grammatical errors, improving clarity and conciseness, and suggesting other writing improvements.</w:t>
+            </w:r>
+          </w:p>
+          <w:p>
+            <w:pPr>
+              <w:rPr>
+                <w:color w:val="000000" w:themeColor="text1"/>
+                <w:sz w:val="20"/>
+                <w:szCs w:val="20"/>
+              </w:rPr>
+            </w:pPr>
+          </w:p>
+          <w:p>
+            <w:pPr>
+              <w:rPr>
+                <w:color w:val="000000" w:themeColor="text1"/>
+                <w:sz w:val="20"/>
+                <w:szCs w:val="20"/>
+              </w:rPr>
+            </w:pPr>
+            <w:r>
+              <w:rPr>
+                <w:color w:val="000000" w:themeColor="text1"/>
+                <w:sz w:val="20"/>
+                <w:szCs w:val="20"/>
+              </w:rPr>
+              <w:t xml:space="preserve">3. </w:t>
+            </w:r>
+            <w:proofErr w:type="spellStart"/>
+            <w:r>
+              <w:rPr>
+                <w:color w:val="000000" w:themeColor="text1"/>
+                <w:sz w:val="20"/>
+                <w:szCs w:val="20"/>
+              </w:rPr>
+              <w:t>ChatGPT</w:t>
+            </w:r>
+            <w:proofErr w:type="spellEnd"/>
+            <w:r>
+              <w:rPr>
+                <w:color w:val="000000" w:themeColor="text1"/>
+                <w:sz w:val="20"/>
+                <w:szCs w:val="20"/>
+              </w:rPr>
+              <w:t xml:space="preserve"> was used to identify relevant references related to the business problem addressed in this project. The suggested references were reviewed for relevance and suitability before being included.</w:t>
+            </w:r>
+          </w:p>
+          <w:p>
+            <w:pPr>
+              <w:rPr>
+                <w:color w:val="000000" w:themeColor="text1"/>
+                <w:sz w:val="20"/>
+                <w:szCs w:val="20"/>
+              </w:rPr>
+            </w:pPr>
+          </w:p>
+        </w:tc>
+      </w:tr>
+      <w:tr>
+        <w:tc>
+          <w:tcPr>
+            <w:tcW w:w="2689" w:type="dxa"/>
+          </w:tcPr>
+          <w:p>
+            <w:pPr>
+              <w:rPr>
+                <w:sz w:val="20"/>
+                <w:szCs w:val="20"/>
+              </w:rPr>
+            </w:pPr>
+            <w:r>
+              <w:rPr>
+                <w:b/>
+                <w:bCs/>
+                <w:sz w:val="20"/>
+                <w:szCs w:val="20"/>
+              </w:rPr>
+              <w:t>Description</w:t>
+            </w:r>
+          </w:p>
+          <w:p>
+            <w:pPr>
+              <w:rPr>
+                <w:i/>
+                <w:iCs/>
+                <w:color w:val="545454"/>
+                <w:sz w:val="20"/>
+                <w:szCs w:val="20"/>
+              </w:rPr>
+            </w:pPr>
+            <w:r>
+              <w:rPr>
+                <w:i/>
+                <w:iCs/>
+                <w:sz w:val="20"/>
+                <w:szCs w:val="20"/>
+              </w:rPr>
+              <w:t>How you prompted the AI</w:t>
+            </w:r>
+          </w:p>
+        </w:tc>
+        <w:tc>
+          <w:tcPr>
+            <w:tcW w:w="3543" w:type="dxa"/>
+          </w:tcPr>
+          <w:p>
+            <w:pPr>
+              <w:rPr>
+                <w:i/>
+                <w:iCs/>
+                <w:color w:val="545454"/>
+                <w:sz w:val="20"/>
+                <w:szCs w:val="20"/>
+              </w:rPr>
+            </w:pPr>
+            <w:r>
+              <w:rPr>
+                <w:sz w:val="20"/>
+                <w:szCs w:val="20"/>
+              </w:rPr>
+              <w:t>Include the exact prompts you used in your appendix (recorded on the AI Tools declaration). Reflect on how you communicated your goals to the AI — did you need to iterate or refine your prompts to get useful output?</w:t>
+            </w:r>
+          </w:p>
+        </w:tc>
+        <w:tc>
+          <w:tcPr>
+            <w:tcW w:w="3544" w:type="dxa"/>
+          </w:tcPr>
+          <w:p>
+            <w:pPr>
+              <w:rPr>
+                <w:sz w:val="20"/>
+                <w:szCs w:val="20"/>
+              </w:rPr>
+            </w:pPr>
+            <w:r>
+              <w:rPr>
+                <w:sz w:val="20"/>
+                <w:szCs w:val="20"/>
+              </w:rPr>
+              <w:t>You must provide the exact prompts and relevant AI outputs used during the development of your application.</w:t>
+            </w:r>
+          </w:p>
+          <w:p>
+            <w:pPr>
+              <w:rPr>
+                <w:sz w:val="20"/>
+                <w:szCs w:val="20"/>
+              </w:rPr>
+            </w:pPr>
+          </w:p>
+        </w:tc>
+        <w:tc>
+          <w:tcPr>
+            <w:tcW w:w="4172" w:type="dxa"/>
+          </w:tcPr>
+          <w:p>
+            <w:pPr>
+              <w:rPr>
+                <w:sz w:val="20"/>
+                <w:szCs w:val="20"/>
+              </w:rPr>
+            </w:pPr>
+            <w:r>
+              <w:rPr>
+                <w:sz w:val="20"/>
+                <w:szCs w:val="20"/>
+              </w:rPr>
+              <w:t>Screenshots of the prompts used are included in the Appendix.</w:t>
+            </w:r>
+          </w:p>
+          <w:p>
+            <w:pPr>
+              <w:rPr>
+                <w:sz w:val="20"/>
+                <w:szCs w:val="20"/>
+              </w:rPr>
+            </w:pPr>
+          </w:p>
+        </w:tc>
+      </w:tr>
+      <w:tr>
+        <w:tc>
+          <w:tcPr>
+            <w:tcW w:w="2689" w:type="dxa"/>
+          </w:tcPr>
+          <w:p>
+            <w:pPr>
+              <w:rPr>
+                <w:sz w:val="20"/>
+                <w:szCs w:val="20"/>
+              </w:rPr>
+            </w:pPr>
+            <w:r>
+              <w:rPr>
+                <w:b/>
+                <w:bCs/>
+                <w:sz w:val="20"/>
+                <w:szCs w:val="20"/>
+              </w:rPr>
+              <w:t>Discernment</w:t>
+            </w:r>
+          </w:p>
+          <w:p>
+            <w:pPr>
+              <w:rPr>
+                <w:i/>
+                <w:iCs/>
+                <w:color w:val="545454"/>
+                <w:sz w:val="20"/>
+                <w:szCs w:val="20"/>
+              </w:rPr>
+            </w:pPr>
+            <w:r>
+              <w:rPr>
+                <w:i/>
+                <w:iCs/>
+                <w:sz w:val="20"/>
+                <w:szCs w:val="20"/>
+              </w:rPr>
+              <w:t>Evaluating what the AI produced</w:t>
+            </w:r>
+          </w:p>
+        </w:tc>
+        <w:tc>
+          <w:tcPr>
+            <w:tcW w:w="3543" w:type="dxa"/>
+          </w:tcPr>
+          <w:p>
+            <w:pPr>
+              <w:rPr>
+                <w:i/>
+                <w:iCs/>
+                <w:color w:val="545454"/>
+                <w:sz w:val="20"/>
+                <w:szCs w:val="20"/>
+              </w:rPr>
+            </w:pPr>
+            <w:r>
+              <w:rPr>
+                <w:sz w:val="20"/>
+                <w:szCs w:val="20"/>
+              </w:rPr>
+              <w:t xml:space="preserve">In your reflection, critically evaluate the AI output: what did you accept, modify, or reject — and why? Assess accuracy, relevance, and quality. You are </w:t>
+            </w:r>
+            <w:r>
+              <w:rPr>
+                <w:sz w:val="20"/>
+                <w:szCs w:val="20"/>
+              </w:rPr>
+              <w:lastRenderedPageBreak/>
+              <w:t>responsible for verifying all AI-generated content before submitting.</w:t>
+            </w:r>
+          </w:p>
+        </w:tc>
+        <w:tc>
+          <w:tcPr>
+            <w:tcW w:w="3544" w:type="dxa"/>
+          </w:tcPr>
+          <w:p>
+            <w:pPr>
+              <w:rPr>
+                <w:sz w:val="20"/>
+                <w:szCs w:val="20"/>
+              </w:rPr>
+            </w:pPr>
+          </w:p>
+          <w:p>
+            <w:pPr>
+              <w:rPr>
+                <w:sz w:val="20"/>
+                <w:szCs w:val="20"/>
+              </w:rPr>
+            </w:pPr>
+            <w:r>
+              <w:rPr>
+                <w:sz w:val="20"/>
+                <w:szCs w:val="20"/>
+              </w:rPr>
+              <w:t xml:space="preserve">You are responsible for checking, testing and understanding any AI-generated </w:t>
+            </w:r>
+            <w:r>
+              <w:rPr>
+                <w:sz w:val="20"/>
+                <w:szCs w:val="20"/>
+              </w:rPr>
+              <w:lastRenderedPageBreak/>
+              <w:t>code or suggestions before using them in your work.</w:t>
+            </w:r>
+          </w:p>
+          <w:p>
+            <w:pPr>
+              <w:rPr>
+                <w:color w:val="545454"/>
+                <w:sz w:val="20"/>
+                <w:szCs w:val="20"/>
+              </w:rPr>
+            </w:pPr>
+          </w:p>
+        </w:tc>
+        <w:tc>
+          <w:tcPr>
+            <w:tcW w:w="4172" w:type="dxa"/>
+          </w:tcPr>
+          <w:p>
+            <w:pPr>
+              <w:rPr>
+                <w:color w:val="000000" w:themeColor="text1"/>
+                <w:sz w:val="20"/>
+                <w:szCs w:val="20"/>
+              </w:rPr>
+            </w:pPr>
+            <w:r>
+              <w:rPr>
+                <w:color w:val="000000" w:themeColor="text1"/>
+                <w:sz w:val="20"/>
+                <w:szCs w:val="20"/>
+              </w:rPr>
+              <w:lastRenderedPageBreak/>
+              <w:t xml:space="preserve">1. All ideas generated by </w:t>
+            </w:r>
+            <w:proofErr w:type="spellStart"/>
+            <w:r>
+              <w:rPr>
+                <w:color w:val="000000" w:themeColor="text1"/>
+                <w:sz w:val="20"/>
+                <w:szCs w:val="20"/>
+              </w:rPr>
+              <w:t>ChatGPT</w:t>
+            </w:r>
+            <w:proofErr w:type="spellEnd"/>
+            <w:r>
+              <w:rPr>
+                <w:color w:val="000000" w:themeColor="text1"/>
+                <w:sz w:val="20"/>
+                <w:szCs w:val="20"/>
+              </w:rPr>
+              <w:t xml:space="preserve"> during the brainstorming stage were evaluated based on their relevance to my interests and their originality. For example, one of the suggestions </w:t>
+            </w:r>
+            <w:r>
+              <w:rPr>
+                <w:color w:val="000000" w:themeColor="text1"/>
+                <w:sz w:val="20"/>
+                <w:szCs w:val="20"/>
+              </w:rPr>
+              <w:lastRenderedPageBreak/>
+              <w:t>was “Identifying customers at risk of stopping purchases”. However, this idea was not selected because I felt that the problem was not sufficiently original.</w:t>
+            </w:r>
+          </w:p>
+          <w:p>
+            <w:pPr>
+              <w:rPr>
+                <w:color w:val="000000" w:themeColor="text1"/>
+                <w:sz w:val="20"/>
+                <w:szCs w:val="20"/>
+              </w:rPr>
+            </w:pPr>
+          </w:p>
+          <w:p>
+            <w:pPr>
+              <w:rPr>
+                <w:color w:val="000000" w:themeColor="text1"/>
+                <w:sz w:val="20"/>
+                <w:szCs w:val="20"/>
+              </w:rPr>
+            </w:pPr>
+            <w:r>
+              <w:rPr>
+                <w:color w:val="000000" w:themeColor="text1"/>
+                <w:sz w:val="20"/>
+                <w:szCs w:val="20"/>
+              </w:rPr>
+              <w:t xml:space="preserve">2. All revised text generated by </w:t>
+            </w:r>
+            <w:proofErr w:type="spellStart"/>
+            <w:r>
+              <w:rPr>
+                <w:color w:val="000000" w:themeColor="text1"/>
+                <w:sz w:val="20"/>
+                <w:szCs w:val="20"/>
+              </w:rPr>
+              <w:t>ChatGPT</w:t>
+            </w:r>
+            <w:proofErr w:type="spellEnd"/>
+            <w:r>
+              <w:rPr>
+                <w:color w:val="000000" w:themeColor="text1"/>
+                <w:sz w:val="20"/>
+                <w:szCs w:val="20"/>
+              </w:rPr>
+              <w:t xml:space="preserve"> was proofread to ensure that it effectively conveyed the information I intended to communicate. Not all suggested changes were accepted, as some could have altered the intended meaning of the text.</w:t>
+            </w:r>
+          </w:p>
+          <w:p>
+            <w:pPr>
+              <w:rPr>
+                <w:color w:val="000000" w:themeColor="text1"/>
+                <w:sz w:val="20"/>
+                <w:szCs w:val="20"/>
+              </w:rPr>
+            </w:pPr>
+          </w:p>
+          <w:p>
+            <w:pPr>
+              <w:rPr>
+                <w:color w:val="000000" w:themeColor="text1"/>
+                <w:sz w:val="20"/>
+                <w:szCs w:val="20"/>
+              </w:rPr>
+            </w:pPr>
+            <w:r>
+              <w:rPr>
+                <w:color w:val="000000" w:themeColor="text1"/>
+                <w:sz w:val="20"/>
+                <w:szCs w:val="20"/>
+              </w:rPr>
+              <w:t xml:space="preserve">3. All references suggested by </w:t>
+            </w:r>
+            <w:proofErr w:type="spellStart"/>
+            <w:r>
+              <w:rPr>
+                <w:color w:val="000000" w:themeColor="text1"/>
+                <w:sz w:val="20"/>
+                <w:szCs w:val="20"/>
+              </w:rPr>
+              <w:t>ChatGPT</w:t>
+            </w:r>
+            <w:proofErr w:type="spellEnd"/>
+            <w:r>
+              <w:rPr>
+                <w:color w:val="000000" w:themeColor="text1"/>
+                <w:sz w:val="20"/>
+                <w:szCs w:val="20"/>
+              </w:rPr>
+              <w:t xml:space="preserve"> were cross-checked before being used.</w:t>
+            </w:r>
+          </w:p>
+          <w:p>
+            <w:pPr>
+              <w:rPr>
+                <w:color w:val="000000" w:themeColor="text1"/>
+                <w:sz w:val="20"/>
+                <w:szCs w:val="20"/>
+              </w:rPr>
+            </w:pPr>
+          </w:p>
+        </w:tc>
+      </w:tr>
+      <w:tr>
+        <w:trPr>
+          <w:trHeight w:val="2239"/>
+        </w:trPr>
+        <w:tc>
+          <w:tcPr>
+            <w:tcW w:w="2689" w:type="dxa"/>
+          </w:tcPr>
+          <w:p>
+            <w:pPr>
+              <w:rPr>
+                <w:sz w:val="20"/>
+                <w:szCs w:val="20"/>
+              </w:rPr>
+            </w:pPr>
+            <w:r>
+              <w:rPr>
+                <w:b/>
+                <w:bCs/>
+                <w:sz w:val="20"/>
+                <w:szCs w:val="20"/>
+              </w:rPr>
+              <w:lastRenderedPageBreak/>
+              <w:t>Diligence</w:t>
+            </w:r>
+          </w:p>
+          <w:p>
+            <w:pPr>
+              <w:rPr>
+                <w:b/>
+                <w:bCs/>
+                <w:sz w:val="20"/>
+                <w:szCs w:val="20"/>
+              </w:rPr>
+            </w:pPr>
+            <w:r>
+              <w:rPr>
+                <w:i/>
+                <w:iCs/>
+                <w:sz w:val="20"/>
+                <w:szCs w:val="20"/>
+              </w:rPr>
+              <w:t>Responsibility for your AI use</w:t>
+            </w:r>
+          </w:p>
+        </w:tc>
+        <w:tc>
+          <w:tcPr>
+            <w:tcW w:w="3543" w:type="dxa"/>
+          </w:tcPr>
+          <w:p>
+            <w:pPr>
+              <w:rPr>
+                <w:i/>
+                <w:iCs/>
+                <w:color w:val="545454"/>
+                <w:sz w:val="20"/>
+                <w:szCs w:val="20"/>
+              </w:rPr>
+            </w:pPr>
+            <w:r>
+              <w:rPr>
+                <w:sz w:val="20"/>
+                <w:szCs w:val="20"/>
+              </w:rPr>
+              <w:t>Declare all AI tools used and cite them here. Briefly outline how you considered data protection, copyright, and ethical responsibilities when choosing what to input into any AI system. Unauthorised use is subject to CCT disciplinary procedures.</w:t>
+            </w:r>
+          </w:p>
+        </w:tc>
+        <w:tc>
+          <w:tcPr>
+            <w:tcW w:w="3544" w:type="dxa"/>
+          </w:tcPr>
+          <w:p>
+            <w:pPr>
+              <w:rPr>
+                <w:sz w:val="20"/>
+                <w:szCs w:val="20"/>
+              </w:rPr>
+            </w:pPr>
+            <w:r>
+              <w:rPr>
+                <w:sz w:val="20"/>
+                <w:szCs w:val="20"/>
+              </w:rPr>
+              <w:t>Declare all AI tools used. Do not enter personal, confidential or sensitive information into AI tools. Any external sources used should be appropriately referenced.</w:t>
+            </w:r>
+          </w:p>
+          <w:p>
+            <w:pPr>
+              <w:rPr>
+                <w:sz w:val="20"/>
+                <w:szCs w:val="20"/>
+              </w:rPr>
+            </w:pPr>
+          </w:p>
+          <w:p>
+            <w:pPr>
+              <w:rPr>
+                <w:sz w:val="20"/>
+                <w:szCs w:val="20"/>
+              </w:rPr>
+            </w:pPr>
+          </w:p>
+          <w:p>
+            <w:pPr>
+              <w:pStyle w:val="ListParagraph"/>
+              <w:ind w:left="403"/>
+              <w:rPr>
+                <w:color w:val="545454"/>
+                <w:sz w:val="20"/>
+                <w:szCs w:val="20"/>
+              </w:rPr>
+            </w:pPr>
+          </w:p>
+        </w:tc>
+        <w:tc>
+          <w:tcPr>
+            <w:tcW w:w="4172" w:type="dxa"/>
+          </w:tcPr>
+          <w:p>
+            <w:pPr>
+              <w:rPr>
+                <w:color w:val="000000" w:themeColor="text1"/>
+                <w:sz w:val="20"/>
+                <w:szCs w:val="20"/>
+              </w:rPr>
+            </w:pPr>
+            <w:r>
+              <w:rPr>
+                <w:color w:val="000000" w:themeColor="text1"/>
+                <w:sz w:val="20"/>
+                <w:szCs w:val="20"/>
+              </w:rPr>
+              <w:t xml:space="preserve">I used </w:t>
+            </w:r>
+            <w:proofErr w:type="spellStart"/>
+            <w:r>
+              <w:rPr>
+                <w:color w:val="000000" w:themeColor="text1"/>
+                <w:sz w:val="20"/>
+                <w:szCs w:val="20"/>
+              </w:rPr>
+              <w:t>ChatGPT</w:t>
+            </w:r>
+            <w:proofErr w:type="spellEnd"/>
+            <w:r>
+              <w:rPr>
+                <w:color w:val="000000" w:themeColor="text1"/>
+                <w:sz w:val="20"/>
+                <w:szCs w:val="20"/>
+              </w:rPr>
+              <w:t xml:space="preserve"> to support the development of this project. I considered data protection by avoiding the input of any personal information. I also considered copyright by ensuring that sources were identified and cited appropriately. AI was used as a support tool rather than a replacement for my own research and analysis.</w:t>
+            </w:r>
+          </w:p>
+        </w:tc>
+      </w:tr>
+    </w:tbl>
+    <w:p/>
+    <w:p/>
+    <w:p>
+      <w:pPr>
+        <w:jc w:val="center"/>
+      </w:pPr>
     </w:p>
     <w:p>
       <w:pPr>
-        <w:rPr>
-          <w:color w:val="FF0000"/>
-        </w:rPr>
-      </w:pPr>
-      <w:r>
-        <w:rPr>
-          <w:color w:val="FF0000"/>
-        </w:rPr>
-        <w:t>If you haven't used AI tools and there's no need for supplementary data, you can remove the appendix section entirely.</w:t>
+        <w:jc w:val="center"/>
+      </w:pPr>
+      <w:r>
+        <w:rPr>
+          <w:noProof/>
+        </w:rPr>
+        <w:lastRenderedPageBreak/>
+        <w:drawing>
+          <wp:inline distT="0" distB="0" distL="0" distR="0" wp14:anchorId="79E1D9B8" wp14:editId="686A6426">
+            <wp:extent cx="7366635" cy="5731510"/>
+            <wp:effectExtent l="0" t="0" r="5715" b="2540"/>
+            <wp:docPr id="1" name="Picture 1"/>
+            <wp:cNvGraphicFramePr>
+              <a:graphicFrameLocks xmlns:a="http://schemas.openxmlformats.org/drawingml/2006/main" noChangeAspect="1"/>
+            </wp:cNvGraphicFramePr>
+            <a:graphic xmlns:a="http://schemas.openxmlformats.org/drawingml/2006/main">
+              <a:graphicData uri="http://schemas.openxmlformats.org/drawingml/2006/picture">
+                <pic:pic xmlns:pic="http://schemas.openxmlformats.org/drawingml/2006/picture">
+                  <pic:nvPicPr>
+                    <pic:cNvPr id="1" name=""/>
+                    <pic:cNvPicPr/>
+                  </pic:nvPicPr>
+                  <pic:blipFill>
+                    <a:blip r:embed="rId18"/>
+                    <a:stretch>
+                      <a:fillRect/>
+                    </a:stretch>
+                  </pic:blipFill>
+                  <pic:spPr>
+                    <a:xfrm>
+                      <a:off x="0" y="0"/>
+                      <a:ext cx="7366635" cy="5731510"/>
+                    </a:xfrm>
+                    <a:prstGeom prst="rect">
+                      <a:avLst/>
+                    </a:prstGeom>
+                  </pic:spPr>
+                </pic:pic>
+              </a:graphicData>
+            </a:graphic>
+          </wp:inline>
+        </w:drawing>
       </w:r>
     </w:p>
     <w:p>
       <w:pPr>
-        <w:rPr>
-          <w:color w:val="FF0000"/>
-        </w:rPr>
+        <w:jc w:val="center"/>
       </w:pPr>
     </w:p>
-    <w:p/>
+    <w:p>
+      <w:pPr>
+        <w:jc w:val="center"/>
+      </w:pPr>
+      <w:r>
+        <w:rPr>
+          <w:noProof/>
+        </w:rPr>
+        <w:lastRenderedPageBreak/>
+        <w:drawing>
+          <wp:inline distT="0" distB="0" distL="0" distR="0" wp14:anchorId="5490ECD5" wp14:editId="56DA77DA">
+            <wp:extent cx="7440930" cy="5731510"/>
+            <wp:effectExtent l="0" t="0" r="7620" b="2540"/>
+            <wp:docPr id="8" name="Picture 8"/>
+            <wp:cNvGraphicFramePr>
+              <a:graphicFrameLocks xmlns:a="http://schemas.openxmlformats.org/drawingml/2006/main" noChangeAspect="1"/>
+            </wp:cNvGraphicFramePr>
+            <a:graphic xmlns:a="http://schemas.openxmlformats.org/drawingml/2006/main">
+              <a:graphicData uri="http://schemas.openxmlformats.org/drawingml/2006/picture">
+                <pic:pic xmlns:pic="http://schemas.openxmlformats.org/drawingml/2006/picture">
+                  <pic:nvPicPr>
+                    <pic:cNvPr id="1" name=""/>
+                    <pic:cNvPicPr/>
+                  </pic:nvPicPr>
+                  <pic:blipFill>
+                    <a:blip r:embed="rId19"/>
+                    <a:stretch>
+                      <a:fillRect/>
+                    </a:stretch>
+                  </pic:blipFill>
+                  <pic:spPr>
+                    <a:xfrm>
+                      <a:off x="0" y="0"/>
+                      <a:ext cx="7440930" cy="5731510"/>
+                    </a:xfrm>
+                    <a:prstGeom prst="rect">
+                      <a:avLst/>
+                    </a:prstGeom>
+                  </pic:spPr>
+                </pic:pic>
+              </a:graphicData>
+            </a:graphic>
+          </wp:inline>
+        </w:drawing>
+      </w:r>
+    </w:p>
+    <w:p>
+      <w:pPr>
+        <w:jc w:val="center"/>
+      </w:pPr>
+      <w:r>
+        <w:rPr>
+          <w:noProof/>
+        </w:rPr>
+        <w:lastRenderedPageBreak/>
+        <w:drawing>
+          <wp:inline distT="0" distB="0" distL="0" distR="0" wp14:anchorId="1634C32F" wp14:editId="0130A584">
+            <wp:extent cx="6980555" cy="5731510"/>
+            <wp:effectExtent l="0" t="0" r="0" b="2540"/>
+            <wp:docPr id="9" name="Picture 9"/>
+            <wp:cNvGraphicFramePr>
+              <a:graphicFrameLocks xmlns:a="http://schemas.openxmlformats.org/drawingml/2006/main" noChangeAspect="1"/>
+            </wp:cNvGraphicFramePr>
+            <a:graphic xmlns:a="http://schemas.openxmlformats.org/drawingml/2006/main">
+              <a:graphicData uri="http://schemas.openxmlformats.org/drawingml/2006/picture">
+                <pic:pic xmlns:pic="http://schemas.openxmlformats.org/drawingml/2006/picture">
+                  <pic:nvPicPr>
+                    <pic:cNvPr id="1" name=""/>
+                    <pic:cNvPicPr/>
+                  </pic:nvPicPr>
+                  <pic:blipFill>
+                    <a:blip r:embed="rId20"/>
+                    <a:stretch>
+                      <a:fillRect/>
+                    </a:stretch>
+                  </pic:blipFill>
+                  <pic:spPr>
+                    <a:xfrm>
+                      <a:off x="0" y="0"/>
+                      <a:ext cx="6980555" cy="5731510"/>
+                    </a:xfrm>
+                    <a:prstGeom prst="rect">
+                      <a:avLst/>
+                    </a:prstGeom>
+                  </pic:spPr>
+                </pic:pic>
+              </a:graphicData>
+            </a:graphic>
+          </wp:inline>
+        </w:drawing>
+      </w:r>
+    </w:p>
+    <w:p>
+      <w:pPr>
+        <w:jc w:val="center"/>
+      </w:pPr>
+      <w:r>
+        <w:rPr>
+          <w:noProof/>
+        </w:rPr>
+        <w:lastRenderedPageBreak/>
+        <w:drawing>
+          <wp:inline distT="0" distB="0" distL="0" distR="0" wp14:anchorId="424A5859" wp14:editId="392C2C4B">
+            <wp:extent cx="7180580" cy="5731510"/>
+            <wp:effectExtent l="0" t="0" r="1270" b="2540"/>
+            <wp:docPr id="7" name="Picture 7"/>
+            <wp:cNvGraphicFramePr>
+              <a:graphicFrameLocks xmlns:a="http://schemas.openxmlformats.org/drawingml/2006/main" noChangeAspect="1"/>
+            </wp:cNvGraphicFramePr>
+            <a:graphic xmlns:a="http://schemas.openxmlformats.org/drawingml/2006/main">
+              <a:graphicData uri="http://schemas.openxmlformats.org/drawingml/2006/picture">
+                <pic:pic xmlns:pic="http://schemas.openxmlformats.org/drawingml/2006/picture">
+                  <pic:nvPicPr>
+                    <pic:cNvPr id="1" name=""/>
+                    <pic:cNvPicPr/>
+                  </pic:nvPicPr>
+                  <pic:blipFill>
+                    <a:blip r:embed="rId21"/>
+                    <a:stretch>
+                      <a:fillRect/>
+                    </a:stretch>
+                  </pic:blipFill>
+                  <pic:spPr>
+                    <a:xfrm>
+                      <a:off x="0" y="0"/>
+                      <a:ext cx="7180580" cy="5731510"/>
+                    </a:xfrm>
+                    <a:prstGeom prst="rect">
+                      <a:avLst/>
+                    </a:prstGeom>
+                  </pic:spPr>
+                </pic:pic>
+              </a:graphicData>
+            </a:graphic>
+          </wp:inline>
+        </w:drawing>
+      </w:r>
+    </w:p>
     <w:sectPr>
-      <w:footerReference w:type="default" r:id="rId17"/>
-      <w:pgSz w:w="11906" w:h="16838"/>
-      <w:pgMar w:top="1440" w:right="1440" w:bottom="1440" w:left="1440" w:header="708" w:footer="708" w:gutter="0"/>
-      <w:pgNumType w:start="1"/>
+      <w:pgSz w:w="16838" w:h="11906" w:orient="landscape"/>
+      <w:pgMar w:top="1440" w:right="1440" w:bottom="1440" w:left="1440" w:header="709" w:footer="709" w:gutter="0"/>
+      <w:pgNumType w:start="7"/>
       <w:cols w:space="720"/>
     </w:sectPr>
   </w:body>
@@ -4307,6 +5399,49 @@
 
 <file path=word/footer2.xml><?xml version="1.0" encoding="utf-8"?>
 <w:ftr xmlns:wpc="http://schemas.microsoft.com/office/word/2010/wordprocessingCanvas" xmlns:cx="http://schemas.microsoft.com/office/drawing/2014/chartex" xmlns:cx1="http://schemas.microsoft.com/office/drawing/2015/9/8/chartex" xmlns:cx2="http://schemas.microsoft.com/office/drawing/2015/10/21/chartex" xmlns:cx3="http://schemas.microsoft.com/office/drawing/2016/5/9/chartex" xmlns:cx4="http://schemas.microsoft.com/office/drawing/2016/5/10/chartex" xmlns:cx5="http://schemas.microsoft.com/office/drawing/2016/5/11/chartex" xmlns:cx6="http://schemas.microsoft.com/office/drawing/2016/5/12/chartex" xmlns:cx7="http://schemas.microsoft.com/office/drawing/2016/5/13/chartex" xmlns:cx8="http://schemas.microsoft.com/office/drawing/2016/5/14/chartex" xmlns:mc="http://schemas.openxmlformats.org/markup-compatibility/2006" xmlns:aink="http://schemas.microsoft.com/office/drawing/2016/ink" xmlns:am3d="http://schemas.microsoft.com/office/drawing/2017/model3d" xmlns:o="urn:schemas-microsoft-com:office:office" xmlns:r="http://schemas.openxmlformats.org/officeDocument/2006/relationships" xmlns:m="http://schemas.openxmlformats.org/officeDocument/2006/math" xmlns:v="urn:schemas-microsoft-com:vml" xmlns:wp14="http://schemas.microsoft.com/office/word/2010/wordprocessingDrawing" xmlns:wp="http://schemas.openxmlformats.org/drawingml/2006/wordprocessingDrawing" xmlns:w10="urn:schemas-microsoft-com:office:word" xmlns:w="http://schemas.openxmlformats.org/wordprocessingml/2006/main" xmlns:w14="http://schemas.microsoft.com/office/word/2010/wordml" xmlns:w15="http://schemas.microsoft.com/office/word/2012/wordml" xmlns:w16cid="http://schemas.microsoft.com/office/word/2016/wordml/cid" xmlns:w16se="http://schemas.microsoft.com/office/word/2015/wordml/symex" xmlns:wpg="http://schemas.microsoft.com/office/word/2010/wordprocessingGroup" xmlns:wpi="http://schemas.microsoft.com/office/word/2010/wordprocessingInk" xmlns:wne="http://schemas.microsoft.com/office/word/2006/wordml" xmlns:wps="http://schemas.microsoft.com/office/word/2010/wordprocessingShape" mc:Ignorable="w14 w15 w16se w16cid wp14">
+  <w:sdt>
+    <w:sdtPr>
+      <w:id w:val="543646818"/>
+      <w:docPartObj>
+        <w:docPartGallery w:val="Page Numbers (Bottom of Page)"/>
+        <w:docPartUnique/>
+      </w:docPartObj>
+    </w:sdtPr>
+    <w:sdtEndPr>
+      <w:rPr>
+        <w:noProof/>
+      </w:rPr>
+    </w:sdtEndPr>
+    <w:sdtContent>
+      <w:p>
+        <w:pPr>
+          <w:pStyle w:val="Footer"/>
+          <w:jc w:val="right"/>
+        </w:pPr>
+        <w:r>
+          <w:fldChar w:fldCharType="begin"/>
+        </w:r>
+        <w:r>
+          <w:instrText xml:space="preserve"> PAGE   \* MERGEFORMAT </w:instrText>
+        </w:r>
+        <w:r>
+          <w:fldChar w:fldCharType="separate"/>
+        </w:r>
+        <w:r>
+          <w:rPr>
+            <w:noProof/>
+          </w:rPr>
+          <w:t>2</w:t>
+        </w:r>
+        <w:r>
+          <w:rPr>
+            <w:noProof/>
+          </w:rPr>
+          <w:fldChar w:fldCharType="end"/>
+        </w:r>
+      </w:p>
+    </w:sdtContent>
+  </w:sdt>
   <w:p>
     <w:pPr>
       <w:pBdr>
@@ -4318,6 +5453,7 @@
       </w:pBdr>
       <w:tabs>
         <w:tab w:val="center" w:pos="4513"/>
+        <w:tab w:val="left" w:pos="8904"/>
         <w:tab w:val="right" w:pos="9026"/>
       </w:tabs>
       <w:spacing w:line="240" w:lineRule="auto"/>
@@ -4325,30 +5461,6 @@
         <w:color w:val="000000"/>
       </w:rPr>
     </w:pPr>
-    <w:r>
-      <w:tab/>
-    </w:r>
-    <w:r>
-      <w:tab/>
-    </w:r>
-    <w:r>
-      <w:fldChar w:fldCharType="begin"/>
-    </w:r>
-    <w:r>
-      <w:instrText>PAGE</w:instrText>
-    </w:r>
-    <w:r>
-      <w:fldChar w:fldCharType="separate"/>
-    </w:r>
-    <w:r>
-      <w:rPr>
-        <w:noProof/>
-      </w:rPr>
-      <w:t>1</w:t>
-    </w:r>
-    <w:r>
-      <w:fldChar w:fldCharType="end"/>
-    </w:r>
   </w:p>
 </w:ftr>
 </file>
@@ -5420,7 +6532,7 @@
     <w:lsdException w:name="Medium Shading 2 Accent 1" w:uiPriority="64"/>
     <w:lsdException w:name="Medium List 1 Accent 1" w:uiPriority="65"/>
     <w:lsdException w:name="Revision" w:semiHidden="1"/>
-    <w:lsdException w:name="List Paragraph" w:uiPriority="34" w:qFormat="1"/>
+    <w:lsdException w:name="List Paragraph" w:uiPriority="1" w:qFormat="1"/>
     <w:lsdException w:name="Quote" w:uiPriority="29" w:qFormat="1"/>
     <w:lsdException w:name="Intense Quote" w:uiPriority="30" w:qFormat="1"/>
     <w:lsdException w:name="Medium List 2 Accent 1" w:uiPriority="66"/>
@@ -6072,7 +7184,7 @@
   <w:style w:type="paragraph" w:styleId="ListParagraph">
     <w:name w:val="List Paragraph"/>
     <w:basedOn w:val="Normal"/>
-    <w:uiPriority w:val="34"/>
+    <w:uiPriority w:val="1"/>
     <w:qFormat/>
     <w:rsid w:val="00E60722"/>
     <w:pPr>
@@ -6896,7 +8008,7 @@
 </file>
 
 <file path=customXml/itemProps5.xml><?xml version="1.0" encoding="utf-8"?>
-<ds:datastoreItem xmlns:ds="http://schemas.openxmlformats.org/officeDocument/2006/customXml" ds:itemID="{70A66EA7-C8ED-448E-94E0-AEDFE5CCCEEE}">
+<ds:datastoreItem xmlns:ds="http://schemas.openxmlformats.org/officeDocument/2006/customXml" ds:itemID="{2F2BAD2B-8C75-47BB-8A29-3544BAB62137}">
   <ds:schemaRefs>
     <ds:schemaRef ds:uri="http://schemas.openxmlformats.org/officeDocument/2006/bibliography"/>
   </ds:schemaRefs>

</xml_diff>